<commit_message>
updated the PRD link inside master doc with latest changes
</commit_message>
<xml_diff>
--- a/G77 Team A Master Doc.docx
+++ b/G77 Team A Master Doc.docx
@@ -1,6 +1,6 @@
 
 <file path=word/document.xml><?xml version="1.0" encoding="utf-8"?>
-<w:document xmlns:wpc="http://schemas.microsoft.com/office/word/2010/wordprocessingCanvas" xmlns:cx="http://schemas.microsoft.com/office/drawing/2014/chartex" xmlns:cx1="http://schemas.microsoft.com/office/drawing/2015/9/8/chartex" xmlns:cx2="http://schemas.microsoft.com/office/drawing/2015/10/21/chartex" xmlns:cx3="http://schemas.microsoft.com/office/drawing/2016/5/9/chartex" xmlns:cx4="http://schemas.microsoft.com/office/drawing/2016/5/10/chartex" xmlns:cx5="http://schemas.microsoft.com/office/drawing/2016/5/11/chartex" xmlns:cx6="http://schemas.microsoft.com/office/drawing/2016/5/12/chartex" xmlns:cx7="http://schemas.microsoft.com/office/drawing/2016/5/13/chartex" xmlns:cx8="http://schemas.microsoft.com/office/drawing/2016/5/14/chartex" xmlns:mc="http://schemas.openxmlformats.org/markup-compatibility/2006" xmlns:m="http://schemas.openxmlformats.org/officeDocument/2006/math" xmlns:aink="http://schemas.microsoft.com/office/drawing/2016/ink" xmlns:am3d="http://schemas.microsoft.com/office/drawing/2017/model3d" xmlns:oel="http://schemas.microsoft.com/office/2019/extlst" xmlns:r="http://schemas.openxmlformats.org/officeDocument/2006/relationships" xmlns:wp14="http://schemas.microsoft.com/office/word/2010/wordprocessingDrawing" xmlns:wp="http://schemas.openxmlformats.org/drawingml/2006/wordprocessingDrawing" xmlns:wpg="http://schemas.microsoft.com/office/word/2010/wordprocessingGroup" xmlns:wpi="http://schemas.microsoft.com/office/word/2010/wordprocessingInk" xmlns:wps="http://schemas.microsoft.com/office/word/2010/wordprocessingShape" xmlns:o="urn:schemas-microsoft-com:office:office" xmlns:v="urn:schemas-microsoft-com:vml" xmlns:w10="urn:schemas-microsoft-com:office:word" xmlns:w="http://schemas.openxmlformats.org/wordprocessingml/2006/main" xmlns:w14="http://schemas.microsoft.com/office/word/2010/wordml" xmlns:w15="http://schemas.microsoft.com/office/word/2012/wordml" xmlns:w16cei="http://schemas.microsoft.com/office/word/2026/wordml/cei" xmlns:w16cex="http://schemas.microsoft.com/office/word/2018/wordml/cex" xmlns:w16cid="http://schemas.microsoft.com/office/word/2016/wordml/cid" xmlns:w16="http://schemas.microsoft.com/office/word/2018/wordml" xmlns:w16sdtdh="http://schemas.microsoft.com/office/word/2020/wordml/sdtdatahash" xmlns:w16sdtfl="http://schemas.microsoft.com/office/word/2024/wordml/sdtformatlock" xmlns:w16se="http://schemas.microsoft.com/office/word/2015/wordml/symex" xmlns:w16du="http://schemas.microsoft.com/office/word/2023/wordml/word16du" xmlns:wne="http://schemas.microsoft.com/office/word/2006/wordml" xmlns:a="http://schemas.openxmlformats.org/drawingml/2006/main" xmlns:pic="http://schemas.openxmlformats.org/drawingml/2006/picture" xmlns:a14="http://schemas.microsoft.com/office/drawing/2010/main" mc:Ignorable="w14 w15 w16se w16cid w16 w16cex w16sdtdh w16sdtfl w16du wp14">
+<w:document xmlns:wpc="http://schemas.microsoft.com/office/word/2010/wordprocessingCanvas" xmlns:cx="http://schemas.microsoft.com/office/drawing/2014/chartex" xmlns:cx1="http://schemas.microsoft.com/office/drawing/2015/9/8/chartex" xmlns:cx2="http://schemas.microsoft.com/office/drawing/2015/10/21/chartex" xmlns:cx3="http://schemas.microsoft.com/office/drawing/2016/5/9/chartex" xmlns:cx4="http://schemas.microsoft.com/office/drawing/2016/5/10/chartex" xmlns:cx5="http://schemas.microsoft.com/office/drawing/2016/5/11/chartex" xmlns:cx6="http://schemas.microsoft.com/office/drawing/2016/5/12/chartex" xmlns:cx7="http://schemas.microsoft.com/office/drawing/2016/5/13/chartex" xmlns:cx8="http://schemas.microsoft.com/office/drawing/2016/5/14/chartex" xmlns:mc="http://schemas.openxmlformats.org/markup-compatibility/2006" xmlns:aink="http://schemas.microsoft.com/office/drawing/2016/ink" xmlns:am3d="http://schemas.microsoft.com/office/drawing/2017/model3d" xmlns:o="urn:schemas-microsoft-com:office:office" xmlns:oel="http://schemas.microsoft.com/office/2019/extlst" xmlns:r="http://schemas.openxmlformats.org/officeDocument/2006/relationships" xmlns:m="http://schemas.openxmlformats.org/officeDocument/2006/math" xmlns:v="urn:schemas-microsoft-com:vml" xmlns:wp14="http://schemas.microsoft.com/office/word/2010/wordprocessingDrawing" xmlns:wp="http://schemas.openxmlformats.org/drawingml/2006/wordprocessingDrawing" xmlns:w10="urn:schemas-microsoft-com:office:word" xmlns:w="http://schemas.openxmlformats.org/wordprocessingml/2006/main" xmlns:w14="http://schemas.microsoft.com/office/word/2010/wordml" xmlns:w15="http://schemas.microsoft.com/office/word/2012/wordml" xmlns:w16cei="http://schemas.microsoft.com/office/word/2026/wordml/cei" xmlns:w16cex="http://schemas.microsoft.com/office/word/2018/wordml/cex" xmlns:w16cid="http://schemas.microsoft.com/office/word/2016/wordml/cid" xmlns:w16="http://schemas.microsoft.com/office/word/2018/wordml" xmlns:w16du="http://schemas.microsoft.com/office/word/2023/wordml/word16du" xmlns:w16sdtdh="http://schemas.microsoft.com/office/word/2020/wordml/sdtdatahash" xmlns:w16sdtfl="http://schemas.microsoft.com/office/word/2024/wordml/sdtformatlock" xmlns:w16se="http://schemas.microsoft.com/office/word/2015/wordml/symex" xmlns:wpg="http://schemas.microsoft.com/office/word/2010/wordprocessingGroup" xmlns:wpi="http://schemas.microsoft.com/office/word/2010/wordprocessingInk" xmlns:wne="http://schemas.microsoft.com/office/word/2006/wordml" xmlns:wps="http://schemas.microsoft.com/office/word/2010/wordprocessingShape" mc:Ignorable="w14 w15 w16se w16cid w16 w16cex w16sdtdh w16sdtfl w16du wp14">
   <w:body>
     <w:p>
       <w:pPr>
@@ -69,7 +69,7 @@
     <w:p>
       <w:pPr>
         <w:pBdr>
-          <w:bottom w:val="single" w:color="D5D9E6" w:sz="6" w:space="4"/>
+          <w:bottom w:val="single" w:sz="6" w:space="4" w:color="D5D9E6"/>
         </w:pBdr>
         <w:spacing w:after="240"/>
       </w:pPr>
@@ -80,25 +80,19 @@
         <w:spacing w:before="320" w:after="140"/>
       </w:pPr>
       <w:r>
-        <w:t>[Login Restyling Bootstrap]</w:t>
-      </w:r>
-      <w:r>
-        <w:t xml:space="preserve"> </w:t>
-      </w:r>
-      <w:r>
-        <w:t>Task 1 —Write Requirements: Team Page &amp; Login Styling</w:t>
+        <w:t>[Login Restyling Bootstrap] Task 1 —Write Requirements: Team Page &amp; Login Styling</w:t>
       </w:r>
     </w:p>
     <w:tbl>
       <w:tblPr>
         <w:tblW w:w="9000" w:type="dxa"/>
         <w:tblBorders>
-          <w:top w:val="single" w:color="auto" w:sz="4" w:space="0"/>
-          <w:left w:val="single" w:color="auto" w:sz="4" w:space="0"/>
-          <w:bottom w:val="single" w:color="auto" w:sz="4" w:space="0"/>
-          <w:right w:val="single" w:color="auto" w:sz="4" w:space="0"/>
-          <w:insideH w:val="single" w:color="auto" w:sz="4" w:space="0"/>
-          <w:insideV w:val="single" w:color="auto" w:sz="4" w:space="0"/>
+          <w:top w:val="single" w:sz="4" w:space="0" w:color="auto"/>
+          <w:left w:val="single" w:sz="4" w:space="0" w:color="auto"/>
+          <w:bottom w:val="single" w:sz="4" w:space="0" w:color="auto"/>
+          <w:right w:val="single" w:sz="4" w:space="0" w:color="auto"/>
+          <w:insideH w:val="single" w:sz="4" w:space="0" w:color="auto"/>
+          <w:insideV w:val="single" w:sz="4" w:space="0" w:color="auto"/>
         </w:tblBorders>
         <w:tblCellMar>
           <w:left w:w="10" w:type="dxa"/>
@@ -113,12 +107,6 @@
         <w:gridCol w:w="2000"/>
       </w:tblGrid>
       <w:tr>
-        <w:tblPrEx>
-          <w:tblCellMar>
-            <w:top w:w="0" w:type="dxa"/>
-            <w:bottom w:w="0" w:type="dxa"/>
-          </w:tblCellMar>
-        </w:tblPrEx>
         <w:tc>
           <w:tcPr>
             <w:tcW w:w="1800" w:type="dxa"/>
@@ -211,12 +199,7 @@
           </w:tcPr>
           <w:p>
             <w:pPr>
-              <w:pStyle w:val="Normal"/>
-              <w:suppressLineNumbers w:val="0"/>
-              <w:bidi w:val="0"/>
-              <w:spacing w:before="0" w:beforeAutospacing="off" w:after="0" w:afterAutospacing="off" w:line="259" w:lineRule="auto"/>
-              <w:ind w:left="0" w:right="0"/>
-              <w:jc w:val="left"/>
+              <w:spacing w:line="259" w:lineRule="auto"/>
             </w:pPr>
             <w:r>
               <w:rPr>
@@ -261,52 +244,34 @@
     </w:p>
     <w:p>
       <w:pPr>
-        <w:pStyle w:val="Normal"/>
-        <w:suppressLineNumbers w:val="0"/>
-        <w:spacing w:before="0" w:beforeAutospacing="off" w:after="60" w:afterAutospacing="off" w:line="259" w:lineRule="auto"/>
-        <w:ind w:left="0" w:right="0"/>
-        <w:jc w:val="left"/>
-      </w:pPr>
-      <w:r>
-        <w:rPr>
-          <w:b w:val="1"/>
-          <w:bCs w:val="1"/>
+        <w:spacing w:after="60" w:line="259" w:lineRule="auto"/>
+      </w:pPr>
+      <w:r>
+        <w:rPr>
+          <w:b/>
+          <w:bCs/>
         </w:rPr>
         <w:t xml:space="preserve">Done: </w:t>
       </w:r>
       <w:r>
-        <w:rPr/>
-        <w:t xml:space="preserve">Documented </w:t>
-      </w:r>
-      <w:r>
-        <w:rPr/>
-        <w:t>required</w:t>
-      </w:r>
-      <w:r>
-        <w:rPr/>
-        <w:t xml:space="preserve"> fields for the team page</w:t>
-      </w:r>
-      <w:r>
-        <w:rPr/>
+        <w:t>Documented required fields for the team page</w:t>
+      </w:r>
+      <w:r>
         <w:t>.</w:t>
       </w:r>
       <w:r>
         <w:br/>
       </w:r>
       <w:r>
-        <w:rPr/>
         <w:t xml:space="preserve">Note: The login work is only for the styling no changes are made to the </w:t>
       </w:r>
       <w:r>
-        <w:rPr/>
         <w:t xml:space="preserve">existing </w:t>
       </w:r>
       <w:r>
-        <w:rPr/>
         <w:t>authentication login</w:t>
       </w:r>
       <w:r>
-        <w:rPr/>
         <w:t xml:space="preserve"> and session behaviour.</w:t>
       </w:r>
       <w:r>
@@ -314,7 +279,7 @@
       </w:r>
       <w:r>
         <w:rPr>
-          <w:color w:val="BF4E14" w:themeColor="accent2" w:themeTint="FF" w:themeShade="BF"/>
+          <w:color w:val="BF4E14" w:themeColor="accent2" w:themeShade="BF"/>
         </w:rPr>
         <w:t>Edge case and expected behaviour?</w:t>
       </w:r>
@@ -322,13 +287,12 @@
     <w:tbl>
       <w:tblPr>
         <w:tblStyle w:val="TableGrid"/>
-        <w:bidiVisual w:val="0"/>
         <w:tblW w:w="0" w:type="auto"/>
         <w:tblLook w:val="06A0" w:firstRow="1" w:lastRow="0" w:firstColumn="1" w:lastColumn="0" w:noHBand="1" w:noVBand="1"/>
       </w:tblPr>
       <w:tblGrid>
-        <w:gridCol w:w="3405"/>
-        <w:gridCol w:w="5955"/>
+        <w:gridCol w:w="3402"/>
+        <w:gridCol w:w="5948"/>
       </w:tblGrid>
       <w:tr>
         <w:trPr>
@@ -338,14 +302,9 @@
           <w:tcPr>
             <w:tcW w:w="3405" w:type="dxa"/>
             <w:shd w:val="clear" w:color="auto" w:fill="FFC000"/>
-            <w:tcMar/>
-          </w:tcPr>
-          <w:p>
-            <w:pPr>
-              <w:pStyle w:val="Normal"/>
-            </w:pPr>
-            <w:r>
-              <w:rPr/>
+          </w:tcPr>
+          <w:p>
+            <w:r>
               <w:t>Edge case</w:t>
             </w:r>
           </w:p>
@@ -354,14 +313,9 @@
           <w:tcPr>
             <w:tcW w:w="5955" w:type="dxa"/>
             <w:shd w:val="clear" w:color="auto" w:fill="FFC000"/>
-            <w:tcMar/>
-          </w:tcPr>
-          <w:p>
-            <w:pPr>
-              <w:pStyle w:val="Normal"/>
-            </w:pPr>
-            <w:r>
-              <w:rPr/>
+          </w:tcPr>
+          <w:p>
+            <w:r>
               <w:t>Expected Behaviour</w:t>
             </w:r>
           </w:p>
@@ -374,14 +328,9 @@
         <w:tc>
           <w:tcPr>
             <w:tcW w:w="3405" w:type="dxa"/>
-            <w:tcMar/>
-          </w:tcPr>
-          <w:p>
-            <w:pPr>
-              <w:pStyle w:val="Normal"/>
-            </w:pPr>
-            <w:r>
-              <w:rPr/>
+          </w:tcPr>
+          <w:p>
+            <w:r>
               <w:t>User enters invalid credentials</w:t>
             </w:r>
           </w:p>
@@ -389,14 +338,9 @@
         <w:tc>
           <w:tcPr>
             <w:tcW w:w="5955" w:type="dxa"/>
-            <w:tcMar/>
-          </w:tcPr>
-          <w:p>
-            <w:pPr>
-              <w:pStyle w:val="Normal"/>
-            </w:pPr>
-            <w:r>
-              <w:rPr/>
+          </w:tcPr>
+          <w:p>
+            <w:r>
               <w:t>Show error message this is existing behaviour but restyled with red text for better visibility.</w:t>
             </w:r>
           </w:p>
@@ -409,14 +353,9 @@
         <w:tc>
           <w:tcPr>
             <w:tcW w:w="3405" w:type="dxa"/>
-            <w:tcMar/>
-          </w:tcPr>
-          <w:p>
-            <w:pPr>
-              <w:pStyle w:val="Normal"/>
-            </w:pPr>
-            <w:r>
-              <w:rPr/>
+          </w:tcPr>
+          <w:p>
+            <w:r>
               <w:t>User is logged in</w:t>
             </w:r>
           </w:p>
@@ -424,26 +363,18 @@
         <w:tc>
           <w:tcPr>
             <w:tcW w:w="5955" w:type="dxa"/>
-            <w:tcMar/>
-          </w:tcPr>
-          <w:p>
-            <w:pPr>
-              <w:pStyle w:val="Normal"/>
-            </w:pPr>
-            <w:r>
-              <w:rPr/>
+          </w:tcPr>
+          <w:p>
+            <w:r>
               <w:t xml:space="preserve">Redirect directly to team page </w:t>
             </w:r>
             <w:r>
-              <w:rPr/>
               <w:t>(</w:t>
             </w:r>
             <w:r>
-              <w:rPr/>
               <w:t>existing behaviour</w:t>
             </w:r>
             <w:r>
-              <w:rPr/>
               <w:t>)</w:t>
             </w:r>
           </w:p>
@@ -456,14 +387,9 @@
         <w:tc>
           <w:tcPr>
             <w:tcW w:w="3405" w:type="dxa"/>
-            <w:tcMar/>
-          </w:tcPr>
-          <w:p>
-            <w:pPr>
-              <w:pStyle w:val="Normal"/>
-            </w:pPr>
-            <w:r>
-              <w:rPr/>
+          </w:tcPr>
+          <w:p>
+            <w:r>
               <w:t>Member has no photo</w:t>
             </w:r>
           </w:p>
@@ -471,14 +397,9 @@
         <w:tc>
           <w:tcPr>
             <w:tcW w:w="5955" w:type="dxa"/>
-            <w:tcMar/>
-          </w:tcPr>
-          <w:p>
-            <w:pPr>
-              <w:pStyle w:val="Normal"/>
-            </w:pPr>
-            <w:r>
-              <w:rPr/>
+          </w:tcPr>
+          <w:p>
+            <w:r>
               <w:t>Display placeholder avatar initials or the default icon</w:t>
             </w:r>
           </w:p>
@@ -491,29 +412,24 @@
         <w:tc>
           <w:tcPr>
             <w:tcW w:w="3405" w:type="dxa"/>
-            <w:tcMar/>
-          </w:tcPr>
-          <w:p>
-            <w:pPr>
-              <w:pStyle w:val="Normal"/>
-            </w:pPr>
-            <w:r>
-              <w:rPr/>
-              <w:t>Member blurb exceeds 200 char</w:t>
-            </w:r>
+          </w:tcPr>
+          <w:p>
+            <w:r>
+              <w:t xml:space="preserve">Member blurb exceeds 200 </w:t>
+            </w:r>
+            <w:proofErr w:type="gramStart"/>
+            <w:r>
+              <w:t>char</w:t>
+            </w:r>
+            <w:proofErr w:type="gramEnd"/>
           </w:p>
         </w:tc>
         <w:tc>
           <w:tcPr>
             <w:tcW w:w="5955" w:type="dxa"/>
-            <w:tcMar/>
-          </w:tcPr>
-          <w:p>
-            <w:pPr>
-              <w:pStyle w:val="Normal"/>
-            </w:pPr>
-            <w:r>
-              <w:rPr/>
+          </w:tcPr>
+          <w:p>
+            <w:r>
               <w:t>Truncate with ... or allow scrolling within the card</w:t>
             </w:r>
           </w:p>
@@ -526,14 +442,9 @@
         <w:tc>
           <w:tcPr>
             <w:tcW w:w="3405" w:type="dxa"/>
-            <w:tcMar/>
-          </w:tcPr>
-          <w:p>
-            <w:pPr>
-              <w:pStyle w:val="Normal"/>
-            </w:pPr>
-            <w:r>
-              <w:rPr/>
+          </w:tcPr>
+          <w:p>
+            <w:r>
               <w:t>Member has no blurb</w:t>
             </w:r>
           </w:p>
@@ -541,14 +452,9 @@
         <w:tc>
           <w:tcPr>
             <w:tcW w:w="5955" w:type="dxa"/>
-            <w:tcMar/>
-          </w:tcPr>
-          <w:p>
-            <w:pPr>
-              <w:pStyle w:val="Normal"/>
-            </w:pPr>
-            <w:r>
-              <w:rPr/>
+          </w:tcPr>
+          <w:p>
+            <w:r>
               <w:t>Display nothing in that space (no empty placeholder)</w:t>
             </w:r>
           </w:p>
@@ -561,14 +467,9 @@
         <w:tc>
           <w:tcPr>
             <w:tcW w:w="3405" w:type="dxa"/>
-            <w:tcMar/>
-          </w:tcPr>
-          <w:p>
-            <w:pPr>
-              <w:pStyle w:val="Normal"/>
-            </w:pPr>
-            <w:r>
-              <w:rPr/>
+          </w:tcPr>
+          <w:p>
+            <w:r>
               <w:t>Team page has many members</w:t>
             </w:r>
           </w:p>
@@ -576,14 +477,9 @@
         <w:tc>
           <w:tcPr>
             <w:tcW w:w="5955" w:type="dxa"/>
-            <w:tcMar/>
-          </w:tcPr>
-          <w:p>
-            <w:pPr>
-              <w:pStyle w:val="Normal"/>
-            </w:pPr>
-            <w:r>
-              <w:rPr/>
+          </w:tcPr>
+          <w:p>
+            <w:r>
               <w:t>Display is a responsive grid like 3 columns wrapping on desktop</w:t>
             </w:r>
           </w:p>
@@ -596,14 +492,9 @@
         <w:tc>
           <w:tcPr>
             <w:tcW w:w="3405" w:type="dxa"/>
-            <w:tcMar/>
-          </w:tcPr>
-          <w:p>
-            <w:pPr>
-              <w:pStyle w:val="Normal"/>
-            </w:pPr>
-            <w:r>
-              <w:rPr/>
+          </w:tcPr>
+          <w:p>
+            <w:r>
               <w:t>User tried to access team page without login</w:t>
             </w:r>
           </w:p>
@@ -611,14 +502,9 @@
         <w:tc>
           <w:tcPr>
             <w:tcW w:w="5955" w:type="dxa"/>
-            <w:tcMar/>
-          </w:tcPr>
-          <w:p>
-            <w:pPr>
-              <w:pStyle w:val="Normal"/>
-            </w:pPr>
-            <w:r>
-              <w:rPr/>
+          </w:tcPr>
+          <w:p>
+            <w:r>
               <w:t>Redirect to login page (existing behaviour)</w:t>
             </w:r>
           </w:p>
@@ -627,96 +513,88 @@
     </w:tbl>
     <w:p>
       <w:pPr>
-        <w:pStyle w:val="Normal"/>
-        <w:suppressLineNumbers w:val="0"/>
-        <w:bidi w:val="0"/>
-        <w:spacing w:before="0" w:beforeAutospacing="off" w:after="60" w:afterAutospacing="off" w:line="259" w:lineRule="auto"/>
-        <w:ind w:left="0" w:right="0"/>
-        <w:jc w:val="left"/>
-      </w:pPr>
-    </w:p>
-    <w:p>
-      <w:pPr>
-        <w:pStyle w:val="Normal"/>
-        <w:suppressLineNumbers w:val="0"/>
-        <w:bidi w:val="0"/>
-        <w:spacing w:before="0" w:beforeAutospacing="off" w:after="60" w:afterAutospacing="off" w:line="259" w:lineRule="auto"/>
-        <w:ind w:left="0" w:right="0"/>
-        <w:jc w:val="left"/>
-        <w:rPr>
-          <w:color w:val="BF4E14" w:themeColor="accent2" w:themeTint="FF" w:themeShade="BF"/>
-        </w:rPr>
-      </w:pPr>
-      <w:r>
-        <w:rPr>
-          <w:color w:val="BF4E14" w:themeColor="accent2" w:themeTint="FF" w:themeShade="BF"/>
+        <w:spacing w:after="60" w:line="259" w:lineRule="auto"/>
+      </w:pPr>
+    </w:p>
+    <w:p>
+      <w:pPr>
+        <w:spacing w:after="60" w:line="259" w:lineRule="auto"/>
+        <w:rPr>
+          <w:color w:val="BF4E14" w:themeColor="accent2" w:themeShade="BF"/>
+        </w:rPr>
+      </w:pPr>
+      <w:r>
+        <w:rPr>
+          <w:color w:val="BF4E14" w:themeColor="accent2" w:themeShade="BF"/>
         </w:rPr>
         <w:t xml:space="preserve">Group 77, Reviewer </w:t>
       </w:r>
       <w:r>
         <w:rPr>
-          <w:color w:val="BF4E14" w:themeColor="accent2" w:themeTint="FF" w:themeShade="BF"/>
+          <w:color w:val="BF4E14" w:themeColor="accent2" w:themeShade="BF"/>
         </w:rPr>
         <w:t>T</w:t>
       </w:r>
       <w:r>
         <w:rPr>
-          <w:color w:val="BF4E14" w:themeColor="accent2" w:themeTint="FF" w:themeShade="BF"/>
+          <w:color w:val="BF4E14" w:themeColor="accent2" w:themeShade="BF"/>
         </w:rPr>
         <w:t xml:space="preserve">racking </w:t>
       </w:r>
       <w:r>
         <w:rPr>
-          <w:color w:val="BF4E14" w:themeColor="accent2" w:themeTint="FF" w:themeShade="BF"/>
+          <w:color w:val="BF4E14" w:themeColor="accent2" w:themeShade="BF"/>
         </w:rPr>
         <w:t>E</w:t>
       </w:r>
       <w:r>
         <w:rPr>
-          <w:color w:val="BF4E14" w:themeColor="accent2" w:themeTint="FF" w:themeShade="BF"/>
+          <w:color w:val="BF4E14" w:themeColor="accent2" w:themeShade="BF"/>
         </w:rPr>
         <w:t xml:space="preserve">valuation </w:t>
       </w:r>
-      <w:r>
-        <w:rPr>
-          <w:color w:val="BF4E14" w:themeColor="accent2" w:themeTint="FF" w:themeShade="BF"/>
+      <w:proofErr w:type="gramStart"/>
+      <w:r>
+        <w:rPr>
+          <w:color w:val="BF4E14" w:themeColor="accent2" w:themeShade="BF"/>
         </w:rPr>
         <w:t>F</w:t>
       </w:r>
       <w:r>
         <w:rPr>
-          <w:color w:val="BF4E14" w:themeColor="accent2" w:themeTint="FF" w:themeShade="BF"/>
-        </w:rPr>
-        <w:t>or PJS T</w:t>
-      </w:r>
-      <w:r>
-        <w:rPr>
-          <w:color w:val="BF4E14" w:themeColor="accent2" w:themeTint="FF" w:themeShade="BF"/>
+          <w:color w:val="BF4E14" w:themeColor="accent2" w:themeShade="BF"/>
+        </w:rPr>
+        <w:t>or</w:t>
+      </w:r>
+      <w:proofErr w:type="gramEnd"/>
+      <w:r>
+        <w:rPr>
+          <w:color w:val="BF4E14" w:themeColor="accent2" w:themeShade="BF"/>
+        </w:rPr>
+        <w:t xml:space="preserve"> PJS T</w:t>
+      </w:r>
+      <w:r>
+        <w:rPr>
+          <w:color w:val="BF4E14" w:themeColor="accent2" w:themeShade="BF"/>
         </w:rPr>
         <w:t>EAM A</w:t>
       </w:r>
     </w:p>
     <w:p>
       <w:pPr>
-        <w:pStyle w:val="Normal"/>
-        <w:suppressLineNumbers w:val="0"/>
-        <w:bidi w:val="0"/>
-        <w:spacing w:before="0" w:beforeAutospacing="off" w:after="60" w:afterAutospacing="off" w:line="259" w:lineRule="auto"/>
-        <w:ind w:left="0" w:right="0"/>
-        <w:jc w:val="left"/>
+        <w:spacing w:after="60" w:line="259" w:lineRule="auto"/>
       </w:pPr>
     </w:p>
     <w:tbl>
       <w:tblPr>
         <w:tblStyle w:val="TableGrid"/>
-        <w:bidiVisual w:val="0"/>
         <w:tblW w:w="0" w:type="auto"/>
         <w:tblLook w:val="06A0" w:firstRow="1" w:lastRow="0" w:firstColumn="1" w:lastColumn="0" w:noHBand="1" w:noVBand="1"/>
       </w:tblPr>
       <w:tblGrid>
-        <w:gridCol w:w="1785"/>
-        <w:gridCol w:w="1725"/>
-        <w:gridCol w:w="3510"/>
+        <w:gridCol w:w="1783"/>
+        <w:gridCol w:w="1723"/>
+        <w:gridCol w:w="3504"/>
         <w:gridCol w:w="2340"/>
       </w:tblGrid>
       <w:tr>
@@ -727,14 +605,9 @@
           <w:tcPr>
             <w:tcW w:w="1785" w:type="dxa"/>
             <w:shd w:val="clear" w:color="auto" w:fill="FFC000"/>
-            <w:tcMar/>
-          </w:tcPr>
-          <w:p>
-            <w:pPr>
-              <w:pStyle w:val="Normal"/>
-            </w:pPr>
-            <w:r>
-              <w:rPr/>
+          </w:tcPr>
+          <w:p>
+            <w:r>
               <w:t>Name</w:t>
             </w:r>
           </w:p>
@@ -743,14 +616,9 @@
           <w:tcPr>
             <w:tcW w:w="1725" w:type="dxa"/>
             <w:shd w:val="clear" w:color="auto" w:fill="FFC000"/>
-            <w:tcMar/>
-          </w:tcPr>
-          <w:p>
-            <w:pPr>
-              <w:pStyle w:val="Normal"/>
-            </w:pPr>
-            <w:r>
-              <w:rPr/>
+          </w:tcPr>
+          <w:p>
+            <w:r>
               <w:t>Role</w:t>
             </w:r>
           </w:p>
@@ -759,14 +627,9 @@
           <w:tcPr>
             <w:tcW w:w="3510" w:type="dxa"/>
             <w:shd w:val="clear" w:color="auto" w:fill="FFC000"/>
-            <w:tcMar/>
-          </w:tcPr>
-          <w:p>
-            <w:pPr>
-              <w:pStyle w:val="Normal"/>
-            </w:pPr>
-            <w:r>
-              <w:rPr/>
+          </w:tcPr>
+          <w:p>
+            <w:r>
               <w:t>Blurb</w:t>
             </w:r>
           </w:p>
@@ -775,11 +638,9 @@
           <w:tcPr>
             <w:tcW w:w="2340" w:type="dxa"/>
             <w:shd w:val="clear" w:color="auto" w:fill="FFC000"/>
-            <w:tcMar/>
-          </w:tcPr>
-          <w:p>
-            <w:r>
-              <w:rPr/>
+          </w:tcPr>
+          <w:p>
+            <w:r>
               <w:t>Photo</w:t>
             </w:r>
           </w:p>
@@ -792,14 +653,9 @@
         <w:tc>
           <w:tcPr>
             <w:tcW w:w="1785" w:type="dxa"/>
-            <w:tcMar/>
-          </w:tcPr>
-          <w:p>
-            <w:pPr>
-              <w:pStyle w:val="Normal"/>
-            </w:pPr>
-            <w:r>
-              <w:rPr/>
+          </w:tcPr>
+          <w:p>
+            <w:r>
               <w:t>Connor Eyles</w:t>
             </w:r>
           </w:p>
@@ -807,14 +663,9 @@
         <w:tc>
           <w:tcPr>
             <w:tcW w:w="1725" w:type="dxa"/>
-            <w:tcMar/>
-          </w:tcPr>
-          <w:p>
-            <w:pPr>
-              <w:pStyle w:val="Normal"/>
-            </w:pPr>
-            <w:r>
-              <w:rPr/>
+          </w:tcPr>
+          <w:p>
+            <w:r>
               <w:t>PM – Project Manager</w:t>
             </w:r>
           </w:p>
@@ -822,74 +673,59 @@
         <w:tc>
           <w:tcPr>
             <w:tcW w:w="3510" w:type="dxa"/>
-            <w:tcMar/>
-          </w:tcPr>
-          <w:p>
-            <w:pPr>
-              <w:pStyle w:val="Normal"/>
-            </w:pPr>
-            <w:r>
-              <w:rPr/>
+          </w:tcPr>
+          <w:p>
+            <w:r>
               <w:t xml:space="preserve">As the project manager for group 77, I keep the team aligned with our goals and ensure we deliver on time. I </w:t>
             </w:r>
             <w:r>
-              <w:rPr/>
-              <w:t xml:space="preserve">manage the backlog, </w:t>
-            </w:r>
-            <w:r>
-              <w:rPr/>
-              <w:t>facilitate</w:t>
-            </w:r>
-            <w:r>
-              <w:rPr/>
-              <w:t xml:space="preserve"> meetings, and make sure everyone has what they need to succeed in the team.</w:t>
+              <w:t>manage the backlog, facilitate meetings, and make sure everyone has what they need to succeed in the team.</w:t>
             </w:r>
           </w:p>
         </w:tc>
         <w:tc>
           <w:tcPr>
             <w:tcW w:w="2340" w:type="dxa"/>
-            <w:tcMar/>
-          </w:tcPr>
-          <w:p>
-            <w:pPr>
-              <w:pStyle w:val="Normal"/>
-            </w:pPr>
-            <w:r>
+          </w:tcPr>
+          <w:p>
+            <w:r>
+              <w:rPr>
+                <w:noProof/>
+              </w:rPr>
               <w:drawing>
-                <wp:inline wp14:editId="521BA0CB" wp14:anchorId="21418C1D">
+                <wp:inline distT="0" distB="0" distL="0" distR="0" wp14:anchorId="21418C1D" wp14:editId="521BA0CB">
                   <wp:extent cx="1343025" cy="1343025"/>
                   <wp:effectExtent l="0" t="0" r="0" b="0"/>
                   <wp:docPr id="204865777" name="drawing"/>
                   <wp:cNvGraphicFramePr>
-                    <a:graphicFrameLocks noChangeAspect="1"/>
+                    <a:graphicFrameLocks xmlns:a="http://schemas.openxmlformats.org/drawingml/2006/main" noChangeAspect="1"/>
                   </wp:cNvGraphicFramePr>
-                  <a:graphic>
-                    <a:graphicData xmlns:a="http://schemas.openxmlformats.org/drawingml/2006/main" uri="http://schemas.openxmlformats.org/drawingml/2006/picture">
+                  <a:graphic xmlns:a="http://schemas.openxmlformats.org/drawingml/2006/main">
+                    <a:graphicData uri="http://schemas.openxmlformats.org/drawingml/2006/picture">
                       <pic:pic xmlns:pic="http://schemas.openxmlformats.org/drawingml/2006/picture">
-                        <pic:nvPicPr xmlns:pic="http://schemas.openxmlformats.org/drawingml/2006/picture">
-                          <pic:cNvPr xmlns:pic="http://schemas.openxmlformats.org/drawingml/2006/picture" id="204865777" name="Picture 204865777"/>
-                          <pic:cNvPicPr xmlns:pic="http://schemas.openxmlformats.org/drawingml/2006/picture"/>
+                        <pic:nvPicPr>
+                          <pic:cNvPr id="204865777" name="Picture 204865777"/>
+                          <pic:cNvPicPr/>
                         </pic:nvPicPr>
-                        <pic:blipFill xmlns:pic="http://schemas.openxmlformats.org/drawingml/2006/picture">
-                          <a:blip xmlns:r="http://schemas.openxmlformats.org/officeDocument/2006/relationships" xmlns:a="http://schemas.openxmlformats.org/drawingml/2006/main" r:embed="rId1952304417">
-                            <a:extLst xmlns:a="http://schemas.openxmlformats.org/drawingml/2006/main">
-                              <a:ext xmlns:a="http://schemas.openxmlformats.org/drawingml/2006/main" uri="{28A0092B-C50C-407E-A947-70E740481C1C}">
+                        <pic:blipFill>
+                          <a:blip r:embed="rId10">
+                            <a:extLst>
+                              <a:ext uri="{28A0092B-C50C-407E-A947-70E740481C1C}">
                                 <a14:useLocalDpi xmlns:a14="http://schemas.microsoft.com/office/drawing/2010/main"/>
                               </a:ext>
                             </a:extLst>
                           </a:blip>
-                          <a:stretch xmlns:a="http://schemas.openxmlformats.org/drawingml/2006/main">
-                            <a:fillRect xmlns:a="http://schemas.openxmlformats.org/drawingml/2006/main"/>
+                          <a:stretch>
+                            <a:fillRect/>
                           </a:stretch>
                         </pic:blipFill>
-                        <pic:spPr xmlns:pic="http://schemas.openxmlformats.org/drawingml/2006/picture">
-                          <a:xfrm xmlns:a="http://schemas.openxmlformats.org/drawingml/2006/main">
-                            <a:off xmlns:a="http://schemas.openxmlformats.org/drawingml/2006/main" x="0" y="0"/>
-                            <a:ext xmlns:a="http://schemas.openxmlformats.org/drawingml/2006/main" cx="1343025" cy="1343025"/>
+                        <pic:spPr>
+                          <a:xfrm>
+                            <a:off x="0" y="0"/>
+                            <a:ext cx="1343025" cy="1343025"/>
                           </a:xfrm>
-                          <a:prstGeom xmlns:a="http://schemas.openxmlformats.org/drawingml/2006/main" prst="rect">
-                            <a:avLst xmlns:a="http://schemas.openxmlformats.org/drawingml/2006/main"/>
+                          <a:prstGeom prst="rect">
+                            <a:avLst/>
                           </a:prstGeom>
                         </pic:spPr>
                       </pic:pic>
@@ -908,14 +744,10 @@
         <w:tc>
           <w:tcPr>
             <w:tcW w:w="1785" w:type="dxa"/>
-            <w:tcMar/>
-          </w:tcPr>
-          <w:p>
-            <w:pPr>
-              <w:pStyle w:val="Normal"/>
-            </w:pPr>
-            <w:r>
-              <w:rPr/>
+          </w:tcPr>
+          <w:p>
+            <w:r>
+              <w:lastRenderedPageBreak/>
               <w:t>Martel Kho</w:t>
             </w:r>
           </w:p>
@@ -923,18 +755,12 @@
         <w:tc>
           <w:tcPr>
             <w:tcW w:w="1725" w:type="dxa"/>
-            <w:tcMar/>
-          </w:tcPr>
-          <w:p>
-            <w:pPr>
-              <w:pStyle w:val="Normal"/>
-            </w:pPr>
-            <w:r>
-              <w:rPr/>
+          </w:tcPr>
+          <w:p>
+            <w:r>
               <w:t>DEV 1</w:t>
             </w:r>
             <w:r>
-              <w:rPr/>
               <w:t xml:space="preserve"> - Developer</w:t>
             </w:r>
           </w:p>
@@ -942,22 +768,12 @@
         <w:tc>
           <w:tcPr>
             <w:tcW w:w="3510" w:type="dxa"/>
-            <w:tcMar/>
-          </w:tcPr>
-          <w:p>
-            <w:pPr>
-              <w:pStyle w:val="Normal"/>
-            </w:pPr>
-            <w:r>
-              <w:rPr/>
-              <w:t>I’m</w:t>
-            </w:r>
-            <w:r>
-              <w:rPr/>
-              <w:t xml:space="preserve"> a developer on group 77, responsible for building the frontend and </w:t>
-            </w:r>
-            <w:r>
-              <w:rPr/>
+          </w:tcPr>
+          <w:p>
+            <w:r>
+              <w:t xml:space="preserve">I’m a developer on group 77, responsible for building the frontend and </w:t>
+            </w:r>
+            <w:r>
               <w:t>implementing features. I focus on writing clean, maintainable code and ensuring the app works seamlessly for the users.</w:t>
             </w:r>
             <w:r>
@@ -967,7 +783,6 @@
               <w:br/>
             </w:r>
             <w:r>
-              <w:rPr/>
               <w:t>I also help in backend tasks!</w:t>
             </w:r>
           </w:p>
@@ -975,47 +790,46 @@
         <w:tc>
           <w:tcPr>
             <w:tcW w:w="2340" w:type="dxa"/>
-            <w:tcMar/>
-          </w:tcPr>
-          <w:p>
-            <w:pPr>
-              <w:pStyle w:val="Normal"/>
-            </w:pPr>
-            <w:r>
+          </w:tcPr>
+          <w:p>
+            <w:r>
+              <w:rPr>
+                <w:noProof/>
+              </w:rPr>
               <w:drawing>
-                <wp:inline wp14:editId="2F8CACF0" wp14:anchorId="63BF78D5">
+                <wp:inline distT="0" distB="0" distL="0" distR="0" wp14:anchorId="63BF78D5" wp14:editId="2F8CACF0">
                   <wp:extent cx="1343025" cy="1343025"/>
                   <wp:effectExtent l="0" t="0" r="0" b="0"/>
                   <wp:docPr id="1640380788" name="drawing"/>
                   <wp:cNvGraphicFramePr>
-                    <a:graphicFrameLocks noChangeAspect="1"/>
+                    <a:graphicFrameLocks xmlns:a="http://schemas.openxmlformats.org/drawingml/2006/main" noChangeAspect="1"/>
                   </wp:cNvGraphicFramePr>
-                  <a:graphic>
-                    <a:graphicData xmlns:a="http://schemas.openxmlformats.org/drawingml/2006/main" uri="http://schemas.openxmlformats.org/drawingml/2006/picture">
+                  <a:graphic xmlns:a="http://schemas.openxmlformats.org/drawingml/2006/main">
+                    <a:graphicData uri="http://schemas.openxmlformats.org/drawingml/2006/picture">
                       <pic:pic xmlns:pic="http://schemas.openxmlformats.org/drawingml/2006/picture">
-                        <pic:nvPicPr xmlns:pic="http://schemas.openxmlformats.org/drawingml/2006/picture">
-                          <pic:cNvPr xmlns:pic="http://schemas.openxmlformats.org/drawingml/2006/picture" id="204865777" name="Picture 204865777"/>
-                          <pic:cNvPicPr xmlns:pic="http://schemas.openxmlformats.org/drawingml/2006/picture"/>
+                        <pic:nvPicPr>
+                          <pic:cNvPr id="204865777" name="Picture 204865777"/>
+                          <pic:cNvPicPr/>
                         </pic:nvPicPr>
-                        <pic:blipFill xmlns:pic="http://schemas.openxmlformats.org/drawingml/2006/picture">
-                          <a:blip xmlns:r="http://schemas.openxmlformats.org/officeDocument/2006/relationships" xmlns:a="http://schemas.openxmlformats.org/drawingml/2006/main" r:embed="rId1952304417">
-                            <a:extLst xmlns:a="http://schemas.openxmlformats.org/drawingml/2006/main">
-                              <a:ext xmlns:a="http://schemas.openxmlformats.org/drawingml/2006/main" uri="{28A0092B-C50C-407E-A947-70E740481C1C}">
+                        <pic:blipFill>
+                          <a:blip r:embed="rId10">
+                            <a:extLst>
+                              <a:ext uri="{28A0092B-C50C-407E-A947-70E740481C1C}">
                                 <a14:useLocalDpi xmlns:a14="http://schemas.microsoft.com/office/drawing/2010/main"/>
                               </a:ext>
                             </a:extLst>
                           </a:blip>
-                          <a:stretch xmlns:a="http://schemas.openxmlformats.org/drawingml/2006/main">
-                            <a:fillRect xmlns:a="http://schemas.openxmlformats.org/drawingml/2006/main"/>
+                          <a:stretch>
+                            <a:fillRect/>
                           </a:stretch>
                         </pic:blipFill>
-                        <pic:spPr xmlns:pic="http://schemas.openxmlformats.org/drawingml/2006/picture">
-                          <a:xfrm xmlns:a="http://schemas.openxmlformats.org/drawingml/2006/main">
-                            <a:off xmlns:a="http://schemas.openxmlformats.org/drawingml/2006/main" x="0" y="0"/>
-                            <a:ext xmlns:a="http://schemas.openxmlformats.org/drawingml/2006/main" cx="1343025" cy="1343025"/>
+                        <pic:spPr>
+                          <a:xfrm>
+                            <a:off x="0" y="0"/>
+                            <a:ext cx="1343025" cy="1343025"/>
                           </a:xfrm>
-                          <a:prstGeom xmlns:a="http://schemas.openxmlformats.org/drawingml/2006/main" prst="rect">
-                            <a:avLst xmlns:a="http://schemas.openxmlformats.org/drawingml/2006/main"/>
+                          <a:prstGeom prst="rect">
+                            <a:avLst/>
                           </a:prstGeom>
                         </pic:spPr>
                       </pic:pic>
@@ -1034,14 +848,9 @@
         <w:tc>
           <w:tcPr>
             <w:tcW w:w="1785" w:type="dxa"/>
-            <w:tcMar/>
-          </w:tcPr>
-          <w:p>
-            <w:pPr>
-              <w:pStyle w:val="Normal"/>
-            </w:pPr>
-            <w:r>
-              <w:rPr/>
+          </w:tcPr>
+          <w:p>
+            <w:r>
               <w:t>Pasang Lhamu Sherpa</w:t>
             </w:r>
           </w:p>
@@ -1049,18 +858,12 @@
         <w:tc>
           <w:tcPr>
             <w:tcW w:w="1725" w:type="dxa"/>
-            <w:tcMar/>
-          </w:tcPr>
-          <w:p>
-            <w:pPr>
-              <w:pStyle w:val="Normal"/>
-            </w:pPr>
-            <w:r>
-              <w:rPr/>
+          </w:tcPr>
+          <w:p>
+            <w:r>
               <w:t>DEV 2</w:t>
             </w:r>
             <w:r>
-              <w:rPr/>
               <w:t xml:space="preserve"> - Developer</w:t>
             </w:r>
           </w:p>
@@ -1068,90 +871,68 @@
         <w:tc>
           <w:tcPr>
             <w:tcW w:w="3510" w:type="dxa"/>
-            <w:tcMar/>
-          </w:tcPr>
-          <w:p>
-            <w:pPr>
-              <w:pStyle w:val="Normal"/>
-            </w:pPr>
-            <w:r>
-              <w:rPr/>
-              <w:t>I'm</w:t>
-            </w:r>
-            <w:r>
-              <w:rPr/>
-              <w:t xml:space="preserve"> a </w:t>
-            </w:r>
-            <w:r>
-              <w:rPr/>
+          </w:tcPr>
+          <w:p>
+            <w:r>
+              <w:t xml:space="preserve">I'm a </w:t>
+            </w:r>
+            <w:r>
               <w:t>d</w:t>
             </w:r>
             <w:r>
-              <w:rPr/>
               <w:t xml:space="preserve">eveloper on </w:t>
             </w:r>
             <w:r>
-              <w:rPr/>
               <w:t>g</w:t>
             </w:r>
             <w:r>
-              <w:rPr/>
-              <w:t xml:space="preserve">roup 77, working on both frontend and backend tasks. </w:t>
-            </w:r>
-            <w:r>
-              <w:rPr/>
-              <w:t>I'm</w:t>
-            </w:r>
-            <w:r>
-              <w:rPr/>
-              <w:t xml:space="preserve"> passionate about solving technical challenges and making sure our code is robust and well tested.</w:t>
+              <w:t>roup 77, working on both frontend and backend tasks. I'm passionate about solving technical challenges and making sure our code is robust and well tested.</w:t>
             </w:r>
           </w:p>
         </w:tc>
         <w:tc>
           <w:tcPr>
             <w:tcW w:w="2340" w:type="dxa"/>
-            <w:tcMar/>
-          </w:tcPr>
-          <w:p>
-            <w:pPr>
-              <w:pStyle w:val="Normal"/>
-            </w:pPr>
-            <w:r>
+          </w:tcPr>
+          <w:p>
+            <w:r>
+              <w:rPr>
+                <w:noProof/>
+              </w:rPr>
               <w:drawing>
-                <wp:inline wp14:editId="21DDE93C" wp14:anchorId="53F43B4B">
+                <wp:inline distT="0" distB="0" distL="0" distR="0" wp14:anchorId="53F43B4B" wp14:editId="21DDE93C">
                   <wp:extent cx="1343025" cy="1343025"/>
                   <wp:effectExtent l="0" t="0" r="0" b="0"/>
                   <wp:docPr id="482947374" name="drawing"/>
                   <wp:cNvGraphicFramePr>
-                    <a:graphicFrameLocks noChangeAspect="1"/>
+                    <a:graphicFrameLocks xmlns:a="http://schemas.openxmlformats.org/drawingml/2006/main" noChangeAspect="1"/>
                   </wp:cNvGraphicFramePr>
-                  <a:graphic>
-                    <a:graphicData xmlns:a="http://schemas.openxmlformats.org/drawingml/2006/main" uri="http://schemas.openxmlformats.org/drawingml/2006/picture">
+                  <a:graphic xmlns:a="http://schemas.openxmlformats.org/drawingml/2006/main">
+                    <a:graphicData uri="http://schemas.openxmlformats.org/drawingml/2006/picture">
                       <pic:pic xmlns:pic="http://schemas.openxmlformats.org/drawingml/2006/picture">
-                        <pic:nvPicPr xmlns:pic="http://schemas.openxmlformats.org/drawingml/2006/picture">
-                          <pic:cNvPr xmlns:pic="http://schemas.openxmlformats.org/drawingml/2006/picture" id="482947374" name="Picture 482947374"/>
-                          <pic:cNvPicPr xmlns:pic="http://schemas.openxmlformats.org/drawingml/2006/picture"/>
+                        <pic:nvPicPr>
+                          <pic:cNvPr id="482947374" name="Picture 482947374"/>
+                          <pic:cNvPicPr/>
                         </pic:nvPicPr>
-                        <pic:blipFill xmlns:pic="http://schemas.openxmlformats.org/drawingml/2006/picture">
-                          <a:blip xmlns:r="http://schemas.openxmlformats.org/officeDocument/2006/relationships" xmlns:a="http://schemas.openxmlformats.org/drawingml/2006/main" r:embed="rId1272016510">
-                            <a:extLst xmlns:a="http://schemas.openxmlformats.org/drawingml/2006/main">
-                              <a:ext xmlns:a="http://schemas.openxmlformats.org/drawingml/2006/main" uri="{28A0092B-C50C-407E-A947-70E740481C1C}">
+                        <pic:blipFill>
+                          <a:blip r:embed="rId11">
+                            <a:extLst>
+                              <a:ext uri="{28A0092B-C50C-407E-A947-70E740481C1C}">
                                 <a14:useLocalDpi xmlns:a14="http://schemas.microsoft.com/office/drawing/2010/main"/>
                               </a:ext>
                             </a:extLst>
                           </a:blip>
-                          <a:stretch xmlns:a="http://schemas.openxmlformats.org/drawingml/2006/main">
-                            <a:fillRect xmlns:a="http://schemas.openxmlformats.org/drawingml/2006/main"/>
+                          <a:stretch>
+                            <a:fillRect/>
                           </a:stretch>
                         </pic:blipFill>
-                        <pic:spPr xmlns:pic="http://schemas.openxmlformats.org/drawingml/2006/picture">
-                          <a:xfrm xmlns:a="http://schemas.openxmlformats.org/drawingml/2006/main">
-                            <a:off xmlns:a="http://schemas.openxmlformats.org/drawingml/2006/main" x="0" y="0"/>
-                            <a:ext xmlns:a="http://schemas.openxmlformats.org/drawingml/2006/main" cx="1343025" cy="1343025"/>
+                        <pic:spPr>
+                          <a:xfrm>
+                            <a:off x="0" y="0"/>
+                            <a:ext cx="1343025" cy="1343025"/>
                           </a:xfrm>
-                          <a:prstGeom xmlns:a="http://schemas.openxmlformats.org/drawingml/2006/main" prst="rect">
-                            <a:avLst xmlns:a="http://schemas.openxmlformats.org/drawingml/2006/main"/>
+                          <a:prstGeom prst="rect">
+                            <a:avLst/>
                           </a:prstGeom>
                         </pic:spPr>
                       </pic:pic>
@@ -1170,14 +951,9 @@
         <w:tc>
           <w:tcPr>
             <w:tcW w:w="1785" w:type="dxa"/>
-            <w:tcMar/>
-          </w:tcPr>
-          <w:p>
-            <w:pPr>
-              <w:pStyle w:val="Normal"/>
-            </w:pPr>
-            <w:r>
-              <w:rPr/>
+          </w:tcPr>
+          <w:p>
+            <w:r>
               <w:t>Mahin Mubashir Islam</w:t>
             </w:r>
           </w:p>
@@ -1185,18 +961,12 @@
         <w:tc>
           <w:tcPr>
             <w:tcW w:w="1725" w:type="dxa"/>
-            <w:tcMar/>
-          </w:tcPr>
-          <w:p>
-            <w:pPr>
-              <w:pStyle w:val="Normal"/>
-            </w:pPr>
-            <w:r>
-              <w:rPr/>
+          </w:tcPr>
+          <w:p>
+            <w:r>
               <w:t>UX</w:t>
             </w:r>
             <w:r>
-              <w:rPr/>
               <w:t xml:space="preserve"> - Designer</w:t>
             </w:r>
           </w:p>
@@ -1204,14 +974,9 @@
         <w:tc>
           <w:tcPr>
             <w:tcW w:w="3510" w:type="dxa"/>
-            <w:tcMar/>
-          </w:tcPr>
-          <w:p>
-            <w:pPr>
-              <w:pStyle w:val="Normal"/>
-            </w:pPr>
-            <w:r>
-              <w:rPr/>
+          </w:tcPr>
+          <w:p>
+            <w:r>
               <w:t>As the UX designer for group 77, I create intuitive and visually appealing designs that enhance the user experience. I translate requirements into mockups and ensure our interface is both functional and beautiful.</w:t>
             </w:r>
           </w:p>
@@ -1219,47 +984,46 @@
         <w:tc>
           <w:tcPr>
             <w:tcW w:w="2340" w:type="dxa"/>
-            <w:tcMar/>
-          </w:tcPr>
-          <w:p>
-            <w:pPr>
-              <w:pStyle w:val="Normal"/>
-            </w:pPr>
-            <w:r>
+          </w:tcPr>
+          <w:p>
+            <w:r>
+              <w:rPr>
+                <w:noProof/>
+              </w:rPr>
               <w:drawing>
-                <wp:inline wp14:editId="7D9289E2" wp14:anchorId="1FEB0AA0">
+                <wp:inline distT="0" distB="0" distL="0" distR="0" wp14:anchorId="1FEB0AA0" wp14:editId="7D9289E2">
                   <wp:extent cx="1343025" cy="1343025"/>
                   <wp:effectExtent l="0" t="0" r="0" b="0"/>
                   <wp:docPr id="1581597423" name="drawing"/>
                   <wp:cNvGraphicFramePr>
-                    <a:graphicFrameLocks noChangeAspect="1"/>
+                    <a:graphicFrameLocks xmlns:a="http://schemas.openxmlformats.org/drawingml/2006/main" noChangeAspect="1"/>
                   </wp:cNvGraphicFramePr>
-                  <a:graphic>
-                    <a:graphicData xmlns:a="http://schemas.openxmlformats.org/drawingml/2006/main" uri="http://schemas.openxmlformats.org/drawingml/2006/picture">
+                  <a:graphic xmlns:a="http://schemas.openxmlformats.org/drawingml/2006/main">
+                    <a:graphicData uri="http://schemas.openxmlformats.org/drawingml/2006/picture">
                       <pic:pic xmlns:pic="http://schemas.openxmlformats.org/drawingml/2006/picture">
-                        <pic:nvPicPr xmlns:pic="http://schemas.openxmlformats.org/drawingml/2006/picture">
-                          <pic:cNvPr xmlns:pic="http://schemas.openxmlformats.org/drawingml/2006/picture" id="204865777" name="Picture 204865777"/>
-                          <pic:cNvPicPr xmlns:pic="http://schemas.openxmlformats.org/drawingml/2006/picture"/>
+                        <pic:nvPicPr>
+                          <pic:cNvPr id="204865777" name="Picture 204865777"/>
+                          <pic:cNvPicPr/>
                         </pic:nvPicPr>
-                        <pic:blipFill xmlns:pic="http://schemas.openxmlformats.org/drawingml/2006/picture">
-                          <a:blip xmlns:r="http://schemas.openxmlformats.org/officeDocument/2006/relationships" xmlns:a="http://schemas.openxmlformats.org/drawingml/2006/main" r:embed="rId1952304417">
-                            <a:extLst xmlns:a="http://schemas.openxmlformats.org/drawingml/2006/main">
-                              <a:ext xmlns:a="http://schemas.openxmlformats.org/drawingml/2006/main" uri="{28A0092B-C50C-407E-A947-70E740481C1C}">
+                        <pic:blipFill>
+                          <a:blip r:embed="rId10">
+                            <a:extLst>
+                              <a:ext uri="{28A0092B-C50C-407E-A947-70E740481C1C}">
                                 <a14:useLocalDpi xmlns:a14="http://schemas.microsoft.com/office/drawing/2010/main"/>
                               </a:ext>
                             </a:extLst>
                           </a:blip>
-                          <a:stretch xmlns:a="http://schemas.openxmlformats.org/drawingml/2006/main">
-                            <a:fillRect xmlns:a="http://schemas.openxmlformats.org/drawingml/2006/main"/>
+                          <a:stretch>
+                            <a:fillRect/>
                           </a:stretch>
                         </pic:blipFill>
-                        <pic:spPr xmlns:pic="http://schemas.openxmlformats.org/drawingml/2006/picture">
-                          <a:xfrm xmlns:a="http://schemas.openxmlformats.org/drawingml/2006/main">
-                            <a:off xmlns:a="http://schemas.openxmlformats.org/drawingml/2006/main" x="0" y="0"/>
-                            <a:ext xmlns:a="http://schemas.openxmlformats.org/drawingml/2006/main" cx="1343025" cy="1343025"/>
+                        <pic:spPr>
+                          <a:xfrm>
+                            <a:off x="0" y="0"/>
+                            <a:ext cx="1343025" cy="1343025"/>
                           </a:xfrm>
-                          <a:prstGeom xmlns:a="http://schemas.openxmlformats.org/drawingml/2006/main" prst="rect">
-                            <a:avLst xmlns:a="http://schemas.openxmlformats.org/drawingml/2006/main"/>
+                          <a:prstGeom prst="rect">
+                            <a:avLst/>
                           </a:prstGeom>
                         </pic:spPr>
                       </pic:pic>
@@ -1278,14 +1042,9 @@
         <w:tc>
           <w:tcPr>
             <w:tcW w:w="1785" w:type="dxa"/>
-            <w:tcMar/>
-          </w:tcPr>
-          <w:p>
-            <w:pPr>
-              <w:pStyle w:val="Normal"/>
-            </w:pPr>
-            <w:r>
-              <w:rPr/>
+          </w:tcPr>
+          <w:p>
+            <w:r>
               <w:t>Jahan Haidari</w:t>
             </w:r>
           </w:p>
@@ -1293,14 +1052,9 @@
         <w:tc>
           <w:tcPr>
             <w:tcW w:w="1725" w:type="dxa"/>
-            <w:tcMar/>
-          </w:tcPr>
-          <w:p>
-            <w:pPr>
-              <w:pStyle w:val="Normal"/>
-            </w:pPr>
-            <w:r>
-              <w:rPr/>
+          </w:tcPr>
+          <w:p>
+            <w:r>
               <w:t>BA – Business Analyst</w:t>
             </w:r>
           </w:p>
@@ -1308,14 +1062,9 @@
         <w:tc>
           <w:tcPr>
             <w:tcW w:w="3510" w:type="dxa"/>
-            <w:tcMar/>
-          </w:tcPr>
-          <w:p>
-            <w:pPr>
-              <w:pStyle w:val="Normal"/>
-            </w:pPr>
-            <w:r>
-              <w:rPr/>
+          </w:tcPr>
+          <w:p>
+            <w:r>
               <w:t>I'm the business analyst for group 77, responsible for gathering requirements, documenting specifications, and bridging the gap between the client and our development team. I ensure we deliver exactly what the client needs.</w:t>
             </w:r>
           </w:p>
@@ -1323,47 +1072,46 @@
         <w:tc>
           <w:tcPr>
             <w:tcW w:w="2340" w:type="dxa"/>
-            <w:tcMar/>
-          </w:tcPr>
-          <w:p>
-            <w:pPr>
-              <w:pStyle w:val="Normal"/>
-            </w:pPr>
-            <w:r>
+          </w:tcPr>
+          <w:p>
+            <w:r>
+              <w:rPr>
+                <w:noProof/>
+              </w:rPr>
               <w:drawing>
-                <wp:inline wp14:editId="336AEAA0" wp14:anchorId="1ABE708F">
+                <wp:inline distT="0" distB="0" distL="0" distR="0" wp14:anchorId="1ABE708F" wp14:editId="336AEAA0">
                   <wp:extent cx="1343025" cy="1343025"/>
                   <wp:effectExtent l="0" t="0" r="0" b="0"/>
                   <wp:docPr id="1670617276" name="drawing"/>
                   <wp:cNvGraphicFramePr>
-                    <a:graphicFrameLocks noChangeAspect="1"/>
+                    <a:graphicFrameLocks xmlns:a="http://schemas.openxmlformats.org/drawingml/2006/main" noChangeAspect="1"/>
                   </wp:cNvGraphicFramePr>
-                  <a:graphic>
-                    <a:graphicData xmlns:a="http://schemas.openxmlformats.org/drawingml/2006/main" uri="http://schemas.openxmlformats.org/drawingml/2006/picture">
+                  <a:graphic xmlns:a="http://schemas.openxmlformats.org/drawingml/2006/main">
+                    <a:graphicData uri="http://schemas.openxmlformats.org/drawingml/2006/picture">
                       <pic:pic xmlns:pic="http://schemas.openxmlformats.org/drawingml/2006/picture">
-                        <pic:nvPicPr xmlns:pic="http://schemas.openxmlformats.org/drawingml/2006/picture">
-                          <pic:cNvPr xmlns:pic="http://schemas.openxmlformats.org/drawingml/2006/picture" id="204865777" name="Picture 204865777"/>
-                          <pic:cNvPicPr xmlns:pic="http://schemas.openxmlformats.org/drawingml/2006/picture"/>
+                        <pic:nvPicPr>
+                          <pic:cNvPr id="204865777" name="Picture 204865777"/>
+                          <pic:cNvPicPr/>
                         </pic:nvPicPr>
-                        <pic:blipFill xmlns:pic="http://schemas.openxmlformats.org/drawingml/2006/picture">
-                          <a:blip xmlns:r="http://schemas.openxmlformats.org/officeDocument/2006/relationships" xmlns:a="http://schemas.openxmlformats.org/drawingml/2006/main" r:embed="rId1952304417">
-                            <a:extLst xmlns:a="http://schemas.openxmlformats.org/drawingml/2006/main">
-                              <a:ext xmlns:a="http://schemas.openxmlformats.org/drawingml/2006/main" uri="{28A0092B-C50C-407E-A947-70E740481C1C}">
+                        <pic:blipFill>
+                          <a:blip r:embed="rId10">
+                            <a:extLst>
+                              <a:ext uri="{28A0092B-C50C-407E-A947-70E740481C1C}">
                                 <a14:useLocalDpi xmlns:a14="http://schemas.microsoft.com/office/drawing/2010/main"/>
                               </a:ext>
                             </a:extLst>
                           </a:blip>
-                          <a:stretch xmlns:a="http://schemas.openxmlformats.org/drawingml/2006/main">
-                            <a:fillRect xmlns:a="http://schemas.openxmlformats.org/drawingml/2006/main"/>
+                          <a:stretch>
+                            <a:fillRect/>
                           </a:stretch>
                         </pic:blipFill>
-                        <pic:spPr xmlns:pic="http://schemas.openxmlformats.org/drawingml/2006/picture">
-                          <a:xfrm xmlns:a="http://schemas.openxmlformats.org/drawingml/2006/main">
-                            <a:off xmlns:a="http://schemas.openxmlformats.org/drawingml/2006/main" x="0" y="0"/>
-                            <a:ext xmlns:a="http://schemas.openxmlformats.org/drawingml/2006/main" cx="1343025" cy="1343025"/>
+                        <pic:spPr>
+                          <a:xfrm>
+                            <a:off x="0" y="0"/>
+                            <a:ext cx="1343025" cy="1343025"/>
                           </a:xfrm>
-                          <a:prstGeom xmlns:a="http://schemas.openxmlformats.org/drawingml/2006/main" prst="rect">
-                            <a:avLst xmlns:a="http://schemas.openxmlformats.org/drawingml/2006/main"/>
+                          <a:prstGeom prst="rect">
+                            <a:avLst/>
                           </a:prstGeom>
                         </pic:spPr>
                       </pic:pic>
@@ -1378,87 +1126,87 @@
     </w:tbl>
     <w:p>
       <w:pPr>
-        <w:pStyle w:val="Normal"/>
-        <w:suppressLineNumbers w:val="0"/>
-        <w:bidi w:val="0"/>
-        <w:spacing w:before="0" w:beforeAutospacing="off" w:after="60" w:afterAutospacing="off" w:line="259" w:lineRule="auto"/>
-        <w:ind w:left="0" w:right="0"/>
-        <w:jc w:val="left"/>
-      </w:pPr>
-    </w:p>
-    <w:p>
-      <w:pPr>
-        <w:pStyle w:val="Normal"/>
-        <w:suppressLineNumbers w:val="0"/>
-        <w:bidi w:val="0"/>
-        <w:spacing w:before="0" w:beforeAutospacing="off" w:after="60" w:afterAutospacing="off" w:line="259" w:lineRule="auto"/>
-        <w:ind w:left="0" w:right="0"/>
-        <w:jc w:val="left"/>
-      </w:pPr>
-      <w:r>
-        <w:rPr>
-          <w:b w:val="1"/>
-          <w:bCs w:val="1"/>
-        </w:rPr>
-        <w:t xml:space="preserve">Deliverable: </w:t>
-      </w:r>
-      <w:r>
-        <w:rPr/>
-        <w:t xml:space="preserve">Mock sprint requirements group 77 Loop workspace document </w:t>
-      </w:r>
-      <w:r>
-        <w:rPr/>
-        <w:t>committed to team repo under /doc branch</w:t>
-      </w:r>
-      <w:r>
-        <w:rPr/>
-        <w:t>.</w:t>
-      </w:r>
-    </w:p>
-    <w:p>
-      <w:pPr>
-        <w:spacing w:after="140"/>
-      </w:pPr>
-      <w:r>
-        <w:rPr>
-          <w:b w:val="1"/>
-          <w:bCs w:val="1"/>
-        </w:rPr>
-        <w:t xml:space="preserve">Note for next role: </w:t>
-      </w:r>
-      <w:r>
-        <w:rPr>
-          <w:b w:val="0"/>
-          <w:bCs w:val="0"/>
-        </w:rPr>
-        <w:t>UX designer use these requirements to design the login page and team page mockups. Requirements are marked "styling only" for the login page do not change validation or authentication logic.</w:t>
-      </w:r>
-    </w:p>
-    <w:p>
-      <w:pPr>
-        <w:shd w:val="clear" w:color="auto" w:fill="16204F"/>
-        <w:spacing w:after="120"/>
-        <w:ind w:left="100" w:right="100"/>
+        <w:spacing w:after="60" w:line="259" w:lineRule="auto"/>
+      </w:pPr>
+    </w:p>
+    <w:p>
+      <w:pPr>
+        <w:spacing w:after="60" w:line="259" w:lineRule="auto"/>
       </w:pPr>
       <w:r>
         <w:rPr>
           <w:b/>
           <w:bCs/>
-          <w:color w:val="FFFFFF"/>
-        </w:rPr>
-        <w:t xml:space="preserve">Git URL:  </w:t>
-      </w:r>
-      <w:r>
-        <w:rPr>
-          <w:rFonts w:ascii="Consolas" w:hAnsi="Consolas" w:eastAsia="Consolas" w:cs="Consolas"/>
-          <w:color w:val="8FD3D6"/>
-        </w:rPr>
-        <w:t>https://github.com/team-byte-size/team-page/blob/main/docs/requirements.md</w:t>
+        </w:rPr>
+        <w:t xml:space="preserve">Deliverable: </w:t>
+      </w:r>
+      <w:r>
+        <w:t xml:space="preserve">Mock sprint requirements group 77 Loop workspace document </w:t>
+      </w:r>
+      <w:r>
+        <w:t>committed to team repo under /doc branch</w:t>
+      </w:r>
+      <w:r>
+        <w:t>.</w:t>
+      </w:r>
+    </w:p>
+    <w:p>
+      <w:pPr>
+        <w:spacing w:after="140"/>
+      </w:pPr>
+      <w:r>
+        <w:rPr>
+          <w:b/>
+          <w:bCs/>
+        </w:rPr>
+        <w:t xml:space="preserve">Note for next role: </w:t>
+      </w:r>
+      <w:r>
+        <w:t xml:space="preserve">UX designer </w:t>
+      </w:r>
+      <w:proofErr w:type="gramStart"/>
+      <w:r>
+        <w:t>use</w:t>
+      </w:r>
+      <w:proofErr w:type="gramEnd"/>
+      <w:r>
+        <w:t xml:space="preserve"> these requirements to design the login page and team page mockups. Requirements are marked "styling only" for the login page do not change validation or authentication logic.</w:t>
       </w:r>
     </w:p>
     <w:p>
       <w:pPr>
         <w:spacing w:after="260"/>
+        <w:rPr>
+          <w:b/>
+          <w:bCs/>
+          <w:color w:val="000000" w:themeColor="text1"/>
+        </w:rPr>
+      </w:pPr>
+      <w:r>
+        <w:rPr>
+          <w:b/>
+          <w:bCs/>
+          <w:color w:val="000000" w:themeColor="text1"/>
+        </w:rPr>
+        <w:t xml:space="preserve">Git URL: </w:t>
+      </w:r>
+      <w:hyperlink r:id="rId12" w:history="1">
+        <w:r>
+          <w:rPr>
+            <w:rStyle w:val="Hyperlink"/>
+            <w:b/>
+            <w:bCs/>
+          </w:rPr>
+          <w:t>https://github.com/connor9838/task2-garage-boilerplate-basic/blob/docs/G77%20Team%20A%20Mock%20PRD.pdf</w:t>
+        </w:r>
+      </w:hyperlink>
+    </w:p>
+    <w:p>
+      <w:pPr>
+        <w:spacing w:after="260"/>
+        <w:rPr>
+          <w:color w:val="000000" w:themeColor="text1"/>
+        </w:rPr>
       </w:pPr>
     </w:p>
     <w:p>
@@ -1467,22 +1215,19 @@
         <w:spacing w:before="320" w:after="140"/>
       </w:pPr>
       <w:r>
-        <w:t xml:space="preserve">[Login Restyling Bootstrap] </w:t>
-      </w:r>
-      <w:r>
-        <w:t>Task 2 — Design Login Style &amp; Team Page Layout</w:t>
+        <w:t>[Login Restyling Bootstrap] Task 2 — Design Login Style &amp; Team Page Layout</w:t>
       </w:r>
     </w:p>
     <w:tbl>
       <w:tblPr>
         <w:tblW w:w="9000" w:type="dxa"/>
         <w:tblBorders>
-          <w:top w:val="single" w:color="auto" w:sz="4" w:space="0"/>
-          <w:left w:val="single" w:color="auto" w:sz="4" w:space="0"/>
-          <w:bottom w:val="single" w:color="auto" w:sz="4" w:space="0"/>
-          <w:right w:val="single" w:color="auto" w:sz="4" w:space="0"/>
-          <w:insideH w:val="single" w:color="auto" w:sz="4" w:space="0"/>
-          <w:insideV w:val="single" w:color="auto" w:sz="4" w:space="0"/>
+          <w:top w:val="single" w:sz="4" w:space="0" w:color="auto"/>
+          <w:left w:val="single" w:sz="4" w:space="0" w:color="auto"/>
+          <w:bottom w:val="single" w:sz="4" w:space="0" w:color="auto"/>
+          <w:right w:val="single" w:sz="4" w:space="0" w:color="auto"/>
+          <w:insideH w:val="single" w:sz="4" w:space="0" w:color="auto"/>
+          <w:insideV w:val="single" w:sz="4" w:space="0" w:color="auto"/>
         </w:tblBorders>
         <w:tblCellMar>
           <w:left w:w="10" w:type="dxa"/>
@@ -1497,12 +1242,6 @@
         <w:gridCol w:w="2000"/>
       </w:tblGrid>
       <w:tr>
-        <w:tblPrEx>
-          <w:tblCellMar>
-            <w:top w:w="0" w:type="dxa"/>
-            <w:bottom w:w="0" w:type="dxa"/>
-          </w:tblCellMar>
-        </w:tblPrEx>
         <w:tc>
           <w:tcPr>
             <w:tcW w:w="1800" w:type="dxa"/>
@@ -1522,6 +1261,7 @@
                 <w:bCs/>
                 <w:color w:val="1E2761"/>
               </w:rPr>
+              <w:lastRenderedPageBreak/>
               <w:t>Role</w:t>
             </w:r>
           </w:p>
@@ -1690,7 +1430,7 @@
                     </pic:cNvPicPr>
                   </pic:nvPicPr>
                   <pic:blipFill>
-                    <a:blip r:embed="rId7">
+                    <a:blip r:embed="rId13">
                       <a:extLst>
                         <a:ext uri="{28A0092B-C50C-407E-A947-70E740481C1C}">
                           <a14:useLocalDpi xmlns:a14="http://schemas.microsoft.com/office/drawing/2010/main" val="0"/>
@@ -1733,22 +1473,19 @@
         <w:spacing w:before="320" w:after="140"/>
       </w:pPr>
       <w:r>
-        <w:t xml:space="preserve">[Login Restyling Bootstrap] </w:t>
-      </w:r>
-      <w:r>
-        <w:t>Task 3 — Validate Design Against Requirements</w:t>
+        <w:t>[Login Restyling Bootstrap] Task 3 — Validate Design Against Requirements</w:t>
       </w:r>
     </w:p>
     <w:tbl>
       <w:tblPr>
         <w:tblW w:w="9000" w:type="dxa"/>
         <w:tblBorders>
-          <w:top w:val="single" w:color="auto" w:sz="4" w:space="0"/>
-          <w:left w:val="single" w:color="auto" w:sz="4" w:space="0"/>
-          <w:bottom w:val="single" w:color="auto" w:sz="4" w:space="0"/>
-          <w:right w:val="single" w:color="auto" w:sz="4" w:space="0"/>
-          <w:insideH w:val="single" w:color="auto" w:sz="4" w:space="0"/>
-          <w:insideV w:val="single" w:color="auto" w:sz="4" w:space="0"/>
+          <w:top w:val="single" w:sz="4" w:space="0" w:color="auto"/>
+          <w:left w:val="single" w:sz="4" w:space="0" w:color="auto"/>
+          <w:bottom w:val="single" w:sz="4" w:space="0" w:color="auto"/>
+          <w:right w:val="single" w:sz="4" w:space="0" w:color="auto"/>
+          <w:insideH w:val="single" w:sz="4" w:space="0" w:color="auto"/>
+          <w:insideV w:val="single" w:sz="4" w:space="0" w:color="auto"/>
         </w:tblBorders>
         <w:tblCellMar>
           <w:left w:w="10" w:type="dxa"/>
@@ -1763,12 +1500,6 @@
         <w:gridCol w:w="2000"/>
       </w:tblGrid>
       <w:tr>
-        <w:tblPrEx>
-          <w:tblCellMar>
-            <w:top w:w="0" w:type="dxa"/>
-            <w:bottom w:w="0" w:type="dxa"/>
-          </w:tblCellMar>
-        </w:tblPrEx>
         <w:tc>
           <w:tcPr>
             <w:tcW w:w="1800" w:type="dxa"/>
@@ -1941,7 +1672,7 @@
       </w:r>
       <w:r>
         <w:rPr>
-          <w:rFonts w:ascii="Consolas" w:hAnsi="Consolas" w:eastAsia="Consolas" w:cs="Consolas"/>
+          <w:rFonts w:ascii="Consolas" w:eastAsia="Consolas" w:hAnsi="Consolas" w:cs="Consolas"/>
           <w:color w:val="8FD3D6"/>
         </w:rPr>
         <w:t>https://github.com/team-byte-size/team-page/blob/main/docs/design-validation.md</w:t>
@@ -1958,22 +1689,20 @@
         <w:spacing w:before="320" w:after="140"/>
       </w:pPr>
       <w:r>
-        <w:t xml:space="preserve">[Login Restyling Bootstrap] </w:t>
-      </w:r>
-      <w:r>
-        <w:t>Task 4 — Style Login Page</w:t>
+        <w:lastRenderedPageBreak/>
+        <w:t>[Login Restyling Bootstrap] Task 4 — Style Login Page</w:t>
       </w:r>
     </w:p>
     <w:tbl>
       <w:tblPr>
         <w:tblW w:w="9000" w:type="dxa"/>
         <w:tblBorders>
-          <w:top w:val="single" w:color="auto" w:sz="4" w:space="0"/>
-          <w:left w:val="single" w:color="auto" w:sz="4" w:space="0"/>
-          <w:bottom w:val="single" w:color="auto" w:sz="4" w:space="0"/>
-          <w:right w:val="single" w:color="auto" w:sz="4" w:space="0"/>
-          <w:insideH w:val="single" w:color="auto" w:sz="4" w:space="0"/>
-          <w:insideV w:val="single" w:color="auto" w:sz="4" w:space="0"/>
+          <w:top w:val="single" w:sz="4" w:space="0" w:color="auto"/>
+          <w:left w:val="single" w:sz="4" w:space="0" w:color="auto"/>
+          <w:bottom w:val="single" w:sz="4" w:space="0" w:color="auto"/>
+          <w:right w:val="single" w:sz="4" w:space="0" w:color="auto"/>
+          <w:insideH w:val="single" w:sz="4" w:space="0" w:color="auto"/>
+          <w:insideV w:val="single" w:sz="4" w:space="0" w:color="auto"/>
         </w:tblBorders>
         <w:tblCellMar>
           <w:left w:w="10" w:type="dxa"/>
@@ -1988,12 +1717,6 @@
         <w:gridCol w:w="2000"/>
       </w:tblGrid>
       <w:tr>
-        <w:tblPrEx>
-          <w:tblCellMar>
-            <w:top w:w="0" w:type="dxa"/>
-            <w:bottom w:w="0" w:type="dxa"/>
-          </w:tblCellMar>
-        </w:tblPrEx>
         <w:tc>
           <w:tcPr>
             <w:tcW w:w="1800" w:type="dxa"/>
@@ -2156,7 +1879,7 @@
         <w:spacing w:after="120"/>
         <w:ind w:left="100" w:right="100"/>
         <w:rPr>
-          <w:rFonts w:ascii="Consolas" w:hAnsi="Consolas" w:eastAsia="Consolas" w:cs="Consolas"/>
+          <w:rFonts w:ascii="Consolas" w:eastAsia="Consolas" w:hAnsi="Consolas" w:cs="Consolas"/>
           <w:color w:val="8FD3D6"/>
         </w:rPr>
       </w:pPr>
@@ -2168,11 +1891,11 @@
         </w:rPr>
         <w:t xml:space="preserve">Git URL (commit):  </w:t>
       </w:r>
-      <w:hyperlink w:history="1" r:id="rId8">
+      <w:hyperlink r:id="rId14" w:history="1">
         <w:r>
           <w:rPr>
             <w:rStyle w:val="Hyperlink"/>
-            <w:rFonts w:ascii="Consolas" w:hAnsi="Consolas" w:eastAsia="Consolas" w:cs="Consolas"/>
+            <w:rFonts w:ascii="Consolas" w:eastAsia="Consolas" w:hAnsi="Consolas" w:cs="Consolas"/>
           </w:rPr>
           <w:t>https://github.com/team-byte-size/team-page/commit/4a1c9e2</w:t>
         </w:r>
@@ -2188,7 +1911,7 @@
     <w:p>
       <w:pPr>
         <w:rPr>
-          <w:rFonts w:ascii="Times New Roman" w:hAnsi="Times New Roman" w:eastAsia="Times New Roman" w:cs="Times New Roman"/>
+          <w:rFonts w:ascii="Times New Roman" w:eastAsia="Times New Roman" w:hAnsi="Times New Roman" w:cs="Times New Roman"/>
           <w:sz w:val="24"/>
           <w:szCs w:val="24"/>
         </w:rPr>
@@ -2213,7 +1936,7 @@
       </w:pPr>
       <w:r>
         <w:rPr>
-          <w:rFonts w:ascii="Times New Roman" w:hAnsi="Times New Roman" w:eastAsia="Times New Roman" w:cs="Times New Roman"/>
+          <w:rFonts w:ascii="Times New Roman" w:eastAsia="Times New Roman" w:hAnsi="Times New Roman" w:cs="Times New Roman"/>
           <w:noProof/>
           <w:sz w:val="24"/>
           <w:szCs w:val="24"/>
@@ -2236,7 +1959,7 @@
                     </pic:cNvPicPr>
                   </pic:nvPicPr>
                   <pic:blipFill>
-                    <a:blip r:embed="rId9">
+                    <a:blip r:embed="rId15">
                       <a:extLst>
                         <a:ext uri="{28A0092B-C50C-407E-A947-70E740481C1C}">
                           <a14:useLocalDpi xmlns:a14="http://schemas.microsoft.com/office/drawing/2010/main" val="0"/>
@@ -2279,22 +2002,19 @@
         <w:spacing w:before="320" w:after="140"/>
       </w:pPr>
       <w:r>
-        <w:t xml:space="preserve">[Login Restyling Bootstrap] </w:t>
-      </w:r>
-      <w:r>
-        <w:t>Task 5 — Build Team Page &amp; Auth Redirect</w:t>
+        <w:t>[Login Restyling Bootstrap] Task 5 — Build Team Page &amp; Auth Redirect</w:t>
       </w:r>
     </w:p>
     <w:tbl>
       <w:tblPr>
         <w:tblW w:w="9000" w:type="dxa"/>
         <w:tblBorders>
-          <w:top w:val="single" w:color="auto" w:sz="4" w:space="0"/>
-          <w:left w:val="single" w:color="auto" w:sz="4" w:space="0"/>
-          <w:bottom w:val="single" w:color="auto" w:sz="4" w:space="0"/>
-          <w:right w:val="single" w:color="auto" w:sz="4" w:space="0"/>
-          <w:insideH w:val="single" w:color="auto" w:sz="4" w:space="0"/>
-          <w:insideV w:val="single" w:color="auto" w:sz="4" w:space="0"/>
+          <w:top w:val="single" w:sz="4" w:space="0" w:color="auto"/>
+          <w:left w:val="single" w:sz="4" w:space="0" w:color="auto"/>
+          <w:bottom w:val="single" w:sz="4" w:space="0" w:color="auto"/>
+          <w:right w:val="single" w:sz="4" w:space="0" w:color="auto"/>
+          <w:insideH w:val="single" w:sz="4" w:space="0" w:color="auto"/>
+          <w:insideV w:val="single" w:sz="4" w:space="0" w:color="auto"/>
         </w:tblBorders>
         <w:tblCellMar>
           <w:left w:w="10" w:type="dxa"/>
@@ -2309,12 +2029,6 @@
         <w:gridCol w:w="2000"/>
       </w:tblGrid>
       <w:tr>
-        <w:tblPrEx>
-          <w:tblCellMar>
-            <w:top w:w="0" w:type="dxa"/>
-            <w:bottom w:w="0" w:type="dxa"/>
-          </w:tblCellMar>
-        </w:tblPrEx>
         <w:tc>
           <w:tcPr>
             <w:tcW w:w="1800" w:type="dxa"/>
@@ -2479,7 +2193,7 @@
       </w:r>
       <w:r>
         <w:rPr>
-          <w:rFonts w:ascii="Consolas" w:hAnsi="Consolas" w:eastAsia="Consolas" w:cs="Consolas"/>
+          <w:rFonts w:ascii="Consolas" w:eastAsia="Consolas" w:hAnsi="Consolas" w:cs="Consolas"/>
           <w:color w:val="8FD3D6"/>
         </w:rPr>
         <w:t>https://github.com/team-byte-size/team-page/commit/7f3b8d1</w:t>
@@ -2493,6 +2207,7 @@
         <w:rPr>
           <w:noProof/>
         </w:rPr>
+        <w:lastRenderedPageBreak/>
         <w:drawing>
           <wp:inline distT="0" distB="0" distL="0" distR="0" wp14:anchorId="1D426C83" wp14:editId="65256AE1">
             <wp:extent cx="3503930" cy="2589530"/>
@@ -2511,7 +2226,7 @@
                     </pic:cNvPicPr>
                   </pic:nvPicPr>
                   <pic:blipFill>
-                    <a:blip r:embed="rId10">
+                    <a:blip r:embed="rId16">
                       <a:extLst>
                         <a:ext uri="{28A0092B-C50C-407E-A947-70E740481C1C}">
                           <a14:useLocalDpi xmlns:a14="http://schemas.microsoft.com/office/drawing/2010/main" val="0"/>
@@ -2549,22 +2264,19 @@
         <w:spacing w:before="320" w:after="140"/>
       </w:pPr>
       <w:r>
-        <w:t xml:space="preserve">[Login Restyling Bootstrap] </w:t>
-      </w:r>
-      <w:r>
-        <w:t>Task 6 — Test Login → Redirect → Team Page Flow</w:t>
+        <w:t>[Login Restyling Bootstrap] Task 6 — Test Login → Redirect → Team Page Flow</w:t>
       </w:r>
     </w:p>
     <w:tbl>
       <w:tblPr>
         <w:tblW w:w="9000" w:type="dxa"/>
         <w:tblBorders>
-          <w:top w:val="single" w:color="auto" w:sz="4" w:space="0"/>
-          <w:left w:val="single" w:color="auto" w:sz="4" w:space="0"/>
-          <w:bottom w:val="single" w:color="auto" w:sz="4" w:space="0"/>
-          <w:right w:val="single" w:color="auto" w:sz="4" w:space="0"/>
-          <w:insideH w:val="single" w:color="auto" w:sz="4" w:space="0"/>
-          <w:insideV w:val="single" w:color="auto" w:sz="4" w:space="0"/>
+          <w:top w:val="single" w:sz="4" w:space="0" w:color="auto"/>
+          <w:left w:val="single" w:sz="4" w:space="0" w:color="auto"/>
+          <w:bottom w:val="single" w:sz="4" w:space="0" w:color="auto"/>
+          <w:right w:val="single" w:sz="4" w:space="0" w:color="auto"/>
+          <w:insideH w:val="single" w:sz="4" w:space="0" w:color="auto"/>
+          <w:insideV w:val="single" w:sz="4" w:space="0" w:color="auto"/>
         </w:tblBorders>
         <w:tblCellMar>
           <w:left w:w="10" w:type="dxa"/>
@@ -2579,12 +2291,6 @@
         <w:gridCol w:w="2000"/>
       </w:tblGrid>
       <w:tr>
-        <w:tblPrEx>
-          <w:tblCellMar>
-            <w:top w:w="0" w:type="dxa"/>
-            <w:bottom w:w="0" w:type="dxa"/>
-          </w:tblCellMar>
-        </w:tblPrEx>
         <w:tc>
           <w:tcPr>
             <w:tcW w:w="1800" w:type="dxa"/>
@@ -2749,7 +2455,7 @@
       </w:r>
       <w:r>
         <w:rPr>
-          <w:rFonts w:ascii="Consolas" w:hAnsi="Consolas" w:eastAsia="Consolas" w:cs="Consolas"/>
+          <w:rFonts w:ascii="Consolas" w:eastAsia="Consolas" w:hAnsi="Consolas" w:cs="Consolas"/>
           <w:color w:val="8FD3D6"/>
         </w:rPr>
         <w:t>https://github.com/team-byte-size/team-page/blob/main/tests/flow.spec.js</w:t>
@@ -2771,7 +2477,7 @@
       </w:r>
       <w:r>
         <w:rPr>
-          <w:rFonts w:ascii="Consolas" w:hAnsi="Consolas" w:eastAsia="Consolas" w:cs="Consolas"/>
+          <w:rFonts w:ascii="Consolas" w:eastAsia="Consolas" w:hAnsi="Consolas" w:cs="Consolas"/>
           <w:color w:val="8FD3D6"/>
         </w:rPr>
         <w:t>https://github.com/team-byte-size/team-page/blob/main/docs/test-report-flow.md</w:t>
@@ -2788,22 +2494,19 @@
         <w:spacing w:before="320" w:after="140"/>
       </w:pPr>
       <w:r>
-        <w:t xml:space="preserve">[Login Restyling Bootstrap] </w:t>
-      </w:r>
-      <w:r>
-        <w:t>Task 7 — Test Edge Cases &amp; Log Bugs</w:t>
+        <w:t>[Login Restyling Bootstrap] Task 7 — Test Edge Cases &amp; Log Bugs</w:t>
       </w:r>
     </w:p>
     <w:tbl>
       <w:tblPr>
         <w:tblW w:w="9000" w:type="dxa"/>
         <w:tblBorders>
-          <w:top w:val="single" w:color="auto" w:sz="4" w:space="0"/>
-          <w:left w:val="single" w:color="auto" w:sz="4" w:space="0"/>
-          <w:bottom w:val="single" w:color="auto" w:sz="4" w:space="0"/>
-          <w:right w:val="single" w:color="auto" w:sz="4" w:space="0"/>
-          <w:insideH w:val="single" w:color="auto" w:sz="4" w:space="0"/>
-          <w:insideV w:val="single" w:color="auto" w:sz="4" w:space="0"/>
+          <w:top w:val="single" w:sz="4" w:space="0" w:color="auto"/>
+          <w:left w:val="single" w:sz="4" w:space="0" w:color="auto"/>
+          <w:bottom w:val="single" w:sz="4" w:space="0" w:color="auto"/>
+          <w:right w:val="single" w:sz="4" w:space="0" w:color="auto"/>
+          <w:insideH w:val="single" w:sz="4" w:space="0" w:color="auto"/>
+          <w:insideV w:val="single" w:sz="4" w:space="0" w:color="auto"/>
         </w:tblBorders>
         <w:tblCellMar>
           <w:left w:w="10" w:type="dxa"/>
@@ -2818,12 +2521,6 @@
         <w:gridCol w:w="2000"/>
       </w:tblGrid>
       <w:tr>
-        <w:tblPrEx>
-          <w:tblCellMar>
-            <w:top w:w="0" w:type="dxa"/>
-            <w:bottom w:w="0" w:type="dxa"/>
-          </w:tblCellMar>
-        </w:tblPrEx>
         <w:tc>
           <w:tcPr>
             <w:tcW w:w="1800" w:type="dxa"/>
@@ -2984,11 +2681,12 @@
           <w:bCs/>
           <w:color w:val="FFFFFF"/>
         </w:rPr>
+        <w:lastRenderedPageBreak/>
         <w:t xml:space="preserve">Git URL (test script):  </w:t>
       </w:r>
       <w:r>
         <w:rPr>
-          <w:rFonts w:ascii="Consolas" w:hAnsi="Consolas" w:eastAsia="Consolas" w:cs="Consolas"/>
+          <w:rFonts w:ascii="Consolas" w:eastAsia="Consolas" w:hAnsi="Consolas" w:cs="Consolas"/>
           <w:color w:val="8FD3D6"/>
         </w:rPr>
         <w:t>https://github.com/team-byte-size/team-page/blob/main/tests/edge.spec.js</w:t>
@@ -2998,12 +2696,12 @@
       <w:tblPr>
         <w:tblW w:w="9000" w:type="dxa"/>
         <w:tblBorders>
-          <w:top w:val="single" w:color="auto" w:sz="4" w:space="0"/>
-          <w:left w:val="single" w:color="auto" w:sz="4" w:space="0"/>
-          <w:bottom w:val="single" w:color="auto" w:sz="4" w:space="0"/>
-          <w:right w:val="single" w:color="auto" w:sz="4" w:space="0"/>
-          <w:insideH w:val="single" w:color="auto" w:sz="4" w:space="0"/>
-          <w:insideV w:val="single" w:color="auto" w:sz="4" w:space="0"/>
+          <w:top w:val="single" w:sz="4" w:space="0" w:color="auto"/>
+          <w:left w:val="single" w:sz="4" w:space="0" w:color="auto"/>
+          <w:bottom w:val="single" w:sz="4" w:space="0" w:color="auto"/>
+          <w:right w:val="single" w:sz="4" w:space="0" w:color="auto"/>
+          <w:insideH w:val="single" w:sz="4" w:space="0" w:color="auto"/>
+          <w:insideV w:val="single" w:sz="4" w:space="0" w:color="auto"/>
         </w:tblBorders>
         <w:tblCellMar>
           <w:left w:w="10" w:type="dxa"/>
@@ -3015,20 +2713,14 @@
         <w:gridCol w:w="9000"/>
       </w:tblGrid>
       <w:tr>
-        <w:tblPrEx>
-          <w:tblCellMar>
-            <w:top w:w="0" w:type="dxa"/>
-            <w:bottom w:w="0" w:type="dxa"/>
-          </w:tblCellMar>
-        </w:tblPrEx>
         <w:tc>
           <w:tcPr>
             <w:tcW w:w="9000" w:type="dxa"/>
             <w:tcBorders>
-              <w:top w:val="dashed" w:color="AAAAAA" w:sz="4" w:space="0"/>
-              <w:left w:val="dashed" w:color="AAAAAA" w:sz="4" w:space="0"/>
-              <w:bottom w:val="dashed" w:color="AAAAAA" w:sz="4" w:space="0"/>
-              <w:right w:val="dashed" w:color="AAAAAA" w:sz="4" w:space="0"/>
+              <w:top w:val="dashed" w:sz="4" w:space="0" w:color="AAAAAA"/>
+              <w:left w:val="dashed" w:sz="4" w:space="0" w:color="AAAAAA"/>
+              <w:bottom w:val="dashed" w:sz="4" w:space="0" w:color="AAAAAA"/>
+              <w:right w:val="dashed" w:sz="4" w:space="0" w:color="AAAAAA"/>
             </w:tcBorders>
             <w:shd w:val="clear" w:color="auto" w:fill="F0F0F0"/>
             <w:tcMar>
@@ -3075,22 +2767,19 @@
         <w:spacing w:before="320" w:after="140"/>
       </w:pPr>
       <w:r>
-        <w:t xml:space="preserve">[Login Restyling Bootstrap] </w:t>
-      </w:r>
-      <w:r>
-        <w:t>Task 8 — Final Review &amp; Sign-Off</w:t>
+        <w:t>[Login Restyling Bootstrap] Task 8 — Final Review &amp; Sign-Off</w:t>
       </w:r>
     </w:p>
     <w:tbl>
       <w:tblPr>
         <w:tblW w:w="9000" w:type="dxa"/>
         <w:tblBorders>
-          <w:top w:val="single" w:color="auto" w:sz="4" w:space="0"/>
-          <w:left w:val="single" w:color="auto" w:sz="4" w:space="0"/>
-          <w:bottom w:val="single" w:color="auto" w:sz="4" w:space="0"/>
-          <w:right w:val="single" w:color="auto" w:sz="4" w:space="0"/>
-          <w:insideH w:val="single" w:color="auto" w:sz="4" w:space="0"/>
-          <w:insideV w:val="single" w:color="auto" w:sz="4" w:space="0"/>
+          <w:top w:val="single" w:sz="4" w:space="0" w:color="auto"/>
+          <w:left w:val="single" w:sz="4" w:space="0" w:color="auto"/>
+          <w:bottom w:val="single" w:sz="4" w:space="0" w:color="auto"/>
+          <w:right w:val="single" w:sz="4" w:space="0" w:color="auto"/>
+          <w:insideH w:val="single" w:sz="4" w:space="0" w:color="auto"/>
+          <w:insideV w:val="single" w:sz="4" w:space="0" w:color="auto"/>
         </w:tblBorders>
         <w:tblCellMar>
           <w:left w:w="10" w:type="dxa"/>
@@ -3105,12 +2794,6 @@
         <w:gridCol w:w="2000"/>
       </w:tblGrid>
       <w:tr>
-        <w:tblPrEx>
-          <w:tblCellMar>
-            <w:top w:w="0" w:type="dxa"/>
-            <w:bottom w:w="0" w:type="dxa"/>
-          </w:tblCellMar>
-        </w:tblPrEx>
         <w:tc>
           <w:tcPr>
             <w:tcW w:w="1800" w:type="dxa"/>
@@ -3275,7 +2958,7 @@
       </w:r>
       <w:r>
         <w:rPr>
-          <w:rFonts w:ascii="Consolas" w:hAnsi="Consolas" w:eastAsia="Consolas" w:cs="Consolas"/>
+          <w:rFonts w:ascii="Consolas" w:eastAsia="Consolas" w:hAnsi="Consolas" w:cs="Consolas"/>
           <w:color w:val="8FD3D6"/>
         </w:rPr>
         <w:t>https://github.com/team-byte-size/team-page/blob/main/docs/signoff.md</w:t>
@@ -3287,8 +2970,8 @@
       </w:pPr>
     </w:p>
     <w:sectPr>
-      <w:headerReference w:type="default" r:id="rId11"/>
-      <w:pgSz w:w="12240" w:h="15840" w:orient="portrait"/>
+      <w:headerReference w:type="default" r:id="rId17"/>
+      <w:pgSz w:w="12240" w:h="15840"/>
       <w:pgMar w:top="1440" w:right="1440" w:bottom="1440" w:left="1440" w:header="708" w:footer="708" w:gutter="0"/>
       <w:cols w:space="720"/>
       <w:docGrid w:linePitch="360"/>
@@ -3298,7 +2981,7 @@
 </file>
 
 <file path=word/endnotes.xml><?xml version="1.0" encoding="utf-8"?>
-<w:endnotes xmlns:wpc="http://schemas.microsoft.com/office/word/2010/wordprocessingCanvas" xmlns:cx="http://schemas.microsoft.com/office/drawing/2014/chartex" xmlns:cx1="http://schemas.microsoft.com/office/drawing/2015/9/8/chartex" xmlns:cx2="http://schemas.microsoft.com/office/drawing/2015/10/21/chartex" xmlns:cx3="http://schemas.microsoft.com/office/drawing/2016/5/9/chartex" xmlns:cx4="http://schemas.microsoft.com/office/drawing/2016/5/10/chartex" xmlns:cx5="http://schemas.microsoft.com/office/drawing/2016/5/11/chartex" xmlns:cx6="http://schemas.microsoft.com/office/drawing/2016/5/12/chartex" xmlns:cx7="http://schemas.microsoft.com/office/drawing/2016/5/13/chartex" xmlns:cx8="http://schemas.microsoft.com/office/drawing/2016/5/14/chartex" xmlns:mc="http://schemas.openxmlformats.org/markup-compatibility/2006" xmlns:m="http://schemas.openxmlformats.org/officeDocument/2006/math" xmlns:aink="http://schemas.microsoft.com/office/drawing/2016/ink" xmlns:am3d="http://schemas.microsoft.com/office/drawing/2017/model3d" xmlns:oel="http://schemas.microsoft.com/office/2019/extlst" xmlns:r="http://schemas.openxmlformats.org/officeDocument/2006/relationships" xmlns:wp14="http://schemas.microsoft.com/office/word/2010/wordprocessingDrawing" xmlns:wp="http://schemas.openxmlformats.org/drawingml/2006/wordprocessingDrawing" xmlns:wpg="http://schemas.microsoft.com/office/word/2010/wordprocessingGroup" xmlns:wpi="http://schemas.microsoft.com/office/word/2010/wordprocessingInk" xmlns:wps="http://schemas.microsoft.com/office/word/2010/wordprocessingShape" xmlns:o="urn:schemas-microsoft-com:office:office" xmlns:v="urn:schemas-microsoft-com:vml" xmlns:w10="urn:schemas-microsoft-com:office:word" xmlns:w="http://schemas.openxmlformats.org/wordprocessingml/2006/main" xmlns:w14="http://schemas.microsoft.com/office/word/2010/wordml" xmlns:w15="http://schemas.microsoft.com/office/word/2012/wordml" xmlns:w16cei="http://schemas.microsoft.com/office/word/2026/wordml/cei" xmlns:w16cex="http://schemas.microsoft.com/office/word/2018/wordml/cex" xmlns:w16cid="http://schemas.microsoft.com/office/word/2016/wordml/cid" xmlns:w16="http://schemas.microsoft.com/office/word/2018/wordml" xmlns:w16sdtdh="http://schemas.microsoft.com/office/word/2020/wordml/sdtdatahash" xmlns:w16sdtfl="http://schemas.microsoft.com/office/word/2024/wordml/sdtformatlock" xmlns:w16se="http://schemas.microsoft.com/office/word/2015/wordml/symex" xmlns:w16du="http://schemas.microsoft.com/office/word/2023/wordml/word16du" xmlns:wne="http://schemas.microsoft.com/office/word/2006/wordml" mc:Ignorable="w14 w15 w16se w16cid w16 w16cex w16sdtdh w16sdtfl w16du wp14">
+<w:endnotes xmlns:wpc="http://schemas.microsoft.com/office/word/2010/wordprocessingCanvas" xmlns:cx="http://schemas.microsoft.com/office/drawing/2014/chartex" xmlns:cx1="http://schemas.microsoft.com/office/drawing/2015/9/8/chartex" xmlns:cx2="http://schemas.microsoft.com/office/drawing/2015/10/21/chartex" xmlns:cx3="http://schemas.microsoft.com/office/drawing/2016/5/9/chartex" xmlns:cx4="http://schemas.microsoft.com/office/drawing/2016/5/10/chartex" xmlns:cx5="http://schemas.microsoft.com/office/drawing/2016/5/11/chartex" xmlns:cx6="http://schemas.microsoft.com/office/drawing/2016/5/12/chartex" xmlns:cx7="http://schemas.microsoft.com/office/drawing/2016/5/13/chartex" xmlns:cx8="http://schemas.microsoft.com/office/drawing/2016/5/14/chartex" xmlns:mc="http://schemas.openxmlformats.org/markup-compatibility/2006" xmlns:aink="http://schemas.microsoft.com/office/drawing/2016/ink" xmlns:am3d="http://schemas.microsoft.com/office/drawing/2017/model3d" xmlns:o="urn:schemas-microsoft-com:office:office" xmlns:oel="http://schemas.microsoft.com/office/2019/extlst" xmlns:r="http://schemas.openxmlformats.org/officeDocument/2006/relationships" xmlns:m="http://schemas.openxmlformats.org/officeDocument/2006/math" xmlns:v="urn:schemas-microsoft-com:vml" xmlns:wp14="http://schemas.microsoft.com/office/word/2010/wordprocessingDrawing" xmlns:wp="http://schemas.openxmlformats.org/drawingml/2006/wordprocessingDrawing" xmlns:w10="urn:schemas-microsoft-com:office:word" xmlns:w="http://schemas.openxmlformats.org/wordprocessingml/2006/main" xmlns:w14="http://schemas.microsoft.com/office/word/2010/wordml" xmlns:w15="http://schemas.microsoft.com/office/word/2012/wordml" xmlns:w16cei="http://schemas.microsoft.com/office/word/2026/wordml/cei" xmlns:w16cex="http://schemas.microsoft.com/office/word/2018/wordml/cex" xmlns:w16cid="http://schemas.microsoft.com/office/word/2016/wordml/cid" xmlns:w16="http://schemas.microsoft.com/office/word/2018/wordml" xmlns:w16du="http://schemas.microsoft.com/office/word/2023/wordml/word16du" xmlns:w16sdtdh="http://schemas.microsoft.com/office/word/2020/wordml/sdtdatahash" xmlns:w16sdtfl="http://schemas.microsoft.com/office/word/2024/wordml/sdtformatlock" xmlns:w16se="http://schemas.microsoft.com/office/word/2015/wordml/symex" xmlns:wpg="http://schemas.microsoft.com/office/word/2010/wordprocessingGroup" xmlns:wpi="http://schemas.microsoft.com/office/word/2010/wordprocessingInk" xmlns:wne="http://schemas.microsoft.com/office/word/2006/wordml" xmlns:wps="http://schemas.microsoft.com/office/word/2010/wordprocessingShape" mc:Ignorable="w14 w15 w16se w16cid w16 w16cex w16sdtdh w16sdtfl w16du wp14">
   <w:endnote w:type="separator" w:id="-1">
     <w:p>
       <w:r>
@@ -3317,7 +3000,7 @@
 </file>
 
 <file path=word/footnotes.xml><?xml version="1.0" encoding="utf-8"?>
-<w:footnotes xmlns:wpc="http://schemas.microsoft.com/office/word/2010/wordprocessingCanvas" xmlns:cx="http://schemas.microsoft.com/office/drawing/2014/chartex" xmlns:cx1="http://schemas.microsoft.com/office/drawing/2015/9/8/chartex" xmlns:cx2="http://schemas.microsoft.com/office/drawing/2015/10/21/chartex" xmlns:cx3="http://schemas.microsoft.com/office/drawing/2016/5/9/chartex" xmlns:cx4="http://schemas.microsoft.com/office/drawing/2016/5/10/chartex" xmlns:cx5="http://schemas.microsoft.com/office/drawing/2016/5/11/chartex" xmlns:cx6="http://schemas.microsoft.com/office/drawing/2016/5/12/chartex" xmlns:cx7="http://schemas.microsoft.com/office/drawing/2016/5/13/chartex" xmlns:cx8="http://schemas.microsoft.com/office/drawing/2016/5/14/chartex" xmlns:mc="http://schemas.openxmlformats.org/markup-compatibility/2006" xmlns:m="http://schemas.openxmlformats.org/officeDocument/2006/math" xmlns:aink="http://schemas.microsoft.com/office/drawing/2016/ink" xmlns:am3d="http://schemas.microsoft.com/office/drawing/2017/model3d" xmlns:oel="http://schemas.microsoft.com/office/2019/extlst" xmlns:r="http://schemas.openxmlformats.org/officeDocument/2006/relationships" xmlns:wp14="http://schemas.microsoft.com/office/word/2010/wordprocessingDrawing" xmlns:wp="http://schemas.openxmlformats.org/drawingml/2006/wordprocessingDrawing" xmlns:wpg="http://schemas.microsoft.com/office/word/2010/wordprocessingGroup" xmlns:wpi="http://schemas.microsoft.com/office/word/2010/wordprocessingInk" xmlns:wps="http://schemas.microsoft.com/office/word/2010/wordprocessingShape" xmlns:o="urn:schemas-microsoft-com:office:office" xmlns:v="urn:schemas-microsoft-com:vml" xmlns:w10="urn:schemas-microsoft-com:office:word" xmlns:w="http://schemas.openxmlformats.org/wordprocessingml/2006/main" xmlns:w14="http://schemas.microsoft.com/office/word/2010/wordml" xmlns:w15="http://schemas.microsoft.com/office/word/2012/wordml" xmlns:w16cei="http://schemas.microsoft.com/office/word/2026/wordml/cei" xmlns:w16cex="http://schemas.microsoft.com/office/word/2018/wordml/cex" xmlns:w16cid="http://schemas.microsoft.com/office/word/2016/wordml/cid" xmlns:w16="http://schemas.microsoft.com/office/word/2018/wordml" xmlns:w16sdtdh="http://schemas.microsoft.com/office/word/2020/wordml/sdtdatahash" xmlns:w16sdtfl="http://schemas.microsoft.com/office/word/2024/wordml/sdtformatlock" xmlns:w16se="http://schemas.microsoft.com/office/word/2015/wordml/symex" xmlns:w16du="http://schemas.microsoft.com/office/word/2023/wordml/word16du" xmlns:wne="http://schemas.microsoft.com/office/word/2006/wordml" mc:Ignorable="w14 w15 w16se w16cid w16 w16cex w16sdtdh w16sdtfl w16du wp14">
+<w:footnotes xmlns:wpc="http://schemas.microsoft.com/office/word/2010/wordprocessingCanvas" xmlns:cx="http://schemas.microsoft.com/office/drawing/2014/chartex" xmlns:cx1="http://schemas.microsoft.com/office/drawing/2015/9/8/chartex" xmlns:cx2="http://schemas.microsoft.com/office/drawing/2015/10/21/chartex" xmlns:cx3="http://schemas.microsoft.com/office/drawing/2016/5/9/chartex" xmlns:cx4="http://schemas.microsoft.com/office/drawing/2016/5/10/chartex" xmlns:cx5="http://schemas.microsoft.com/office/drawing/2016/5/11/chartex" xmlns:cx6="http://schemas.microsoft.com/office/drawing/2016/5/12/chartex" xmlns:cx7="http://schemas.microsoft.com/office/drawing/2016/5/13/chartex" xmlns:cx8="http://schemas.microsoft.com/office/drawing/2016/5/14/chartex" xmlns:mc="http://schemas.openxmlformats.org/markup-compatibility/2006" xmlns:aink="http://schemas.microsoft.com/office/drawing/2016/ink" xmlns:am3d="http://schemas.microsoft.com/office/drawing/2017/model3d" xmlns:o="urn:schemas-microsoft-com:office:office" xmlns:oel="http://schemas.microsoft.com/office/2019/extlst" xmlns:r="http://schemas.openxmlformats.org/officeDocument/2006/relationships" xmlns:m="http://schemas.openxmlformats.org/officeDocument/2006/math" xmlns:v="urn:schemas-microsoft-com:vml" xmlns:wp14="http://schemas.microsoft.com/office/word/2010/wordprocessingDrawing" xmlns:wp="http://schemas.openxmlformats.org/drawingml/2006/wordprocessingDrawing" xmlns:w10="urn:schemas-microsoft-com:office:word" xmlns:w="http://schemas.openxmlformats.org/wordprocessingml/2006/main" xmlns:w14="http://schemas.microsoft.com/office/word/2010/wordml" xmlns:w15="http://schemas.microsoft.com/office/word/2012/wordml" xmlns:w16cei="http://schemas.microsoft.com/office/word/2026/wordml/cei" xmlns:w16cex="http://schemas.microsoft.com/office/word/2018/wordml/cex" xmlns:w16cid="http://schemas.microsoft.com/office/word/2016/wordml/cid" xmlns:w16="http://schemas.microsoft.com/office/word/2018/wordml" xmlns:w16du="http://schemas.microsoft.com/office/word/2023/wordml/word16du" xmlns:w16sdtdh="http://schemas.microsoft.com/office/word/2020/wordml/sdtdatahash" xmlns:w16sdtfl="http://schemas.microsoft.com/office/word/2024/wordml/sdtformatlock" xmlns:w16se="http://schemas.microsoft.com/office/word/2015/wordml/symex" xmlns:wpg="http://schemas.microsoft.com/office/word/2010/wordprocessingGroup" xmlns:wpi="http://schemas.microsoft.com/office/word/2010/wordprocessingInk" xmlns:wne="http://schemas.microsoft.com/office/word/2006/wordml" xmlns:wps="http://schemas.microsoft.com/office/word/2010/wordprocessingShape" mc:Ignorable="w14 w15 w16se w16cid w16 w16cex w16sdtdh w16sdtfl w16du wp14">
   <w:footnote w:type="separator" w:id="-1">
     <w:p>
       <w:r>
@@ -3336,7 +3019,7 @@
 </file>
 
 <file path=word/header1.xml><?xml version="1.0" encoding="utf-8"?>
-<w:hdr xmlns:wpc="http://schemas.microsoft.com/office/word/2010/wordprocessingCanvas" xmlns:cx="http://schemas.microsoft.com/office/drawing/2014/chartex" xmlns:cx1="http://schemas.microsoft.com/office/drawing/2015/9/8/chartex" xmlns:cx2="http://schemas.microsoft.com/office/drawing/2015/10/21/chartex" xmlns:cx3="http://schemas.microsoft.com/office/drawing/2016/5/9/chartex" xmlns:cx4="http://schemas.microsoft.com/office/drawing/2016/5/10/chartex" xmlns:cx5="http://schemas.microsoft.com/office/drawing/2016/5/11/chartex" xmlns:cx6="http://schemas.microsoft.com/office/drawing/2016/5/12/chartex" xmlns:cx7="http://schemas.microsoft.com/office/drawing/2016/5/13/chartex" xmlns:cx8="http://schemas.microsoft.com/office/drawing/2016/5/14/chartex" xmlns:mc="http://schemas.openxmlformats.org/markup-compatibility/2006" xmlns:m="http://schemas.openxmlformats.org/officeDocument/2006/math" xmlns:aink="http://schemas.microsoft.com/office/drawing/2016/ink" xmlns:am3d="http://schemas.microsoft.com/office/drawing/2017/model3d" xmlns:oel="http://schemas.microsoft.com/office/2019/extlst" xmlns:r="http://schemas.openxmlformats.org/officeDocument/2006/relationships" xmlns:wp14="http://schemas.microsoft.com/office/word/2010/wordprocessingDrawing" xmlns:wp="http://schemas.openxmlformats.org/drawingml/2006/wordprocessingDrawing" xmlns:wpg="http://schemas.microsoft.com/office/word/2010/wordprocessingGroup" xmlns:wpi="http://schemas.microsoft.com/office/word/2010/wordprocessingInk" xmlns:wps="http://schemas.microsoft.com/office/word/2010/wordprocessingShape" xmlns:o="urn:schemas-microsoft-com:office:office" xmlns:v="urn:schemas-microsoft-com:vml" xmlns:w10="urn:schemas-microsoft-com:office:word" xmlns:w="http://schemas.openxmlformats.org/wordprocessingml/2006/main" xmlns:w14="http://schemas.microsoft.com/office/word/2010/wordml" xmlns:w15="http://schemas.microsoft.com/office/word/2012/wordml" xmlns:w16cei="http://schemas.microsoft.com/office/word/2026/wordml/cei" xmlns:w16cex="http://schemas.microsoft.com/office/word/2018/wordml/cex" xmlns:w16cid="http://schemas.microsoft.com/office/word/2016/wordml/cid" xmlns:w16="http://schemas.microsoft.com/office/word/2018/wordml" xmlns:w16sdtdh="http://schemas.microsoft.com/office/word/2020/wordml/sdtdatahash" xmlns:w16sdtfl="http://schemas.microsoft.com/office/word/2024/wordml/sdtformatlock" xmlns:w16se="http://schemas.microsoft.com/office/word/2015/wordml/symex" xmlns:w16du="http://schemas.microsoft.com/office/word/2023/wordml/word16du" xmlns:wne="http://schemas.microsoft.com/office/word/2006/wordml" xmlns:a="http://schemas.openxmlformats.org/drawingml/2006/main" xmlns:pic="http://schemas.openxmlformats.org/drawingml/2006/picture" xmlns:a14="http://schemas.microsoft.com/office/drawing/2010/main" mc:Ignorable="w14 w15 w16se w16cid w16 w16cex w16sdtdh w16sdtfl w16du wp14">
+<w:hdr xmlns:wpc="http://schemas.microsoft.com/office/word/2010/wordprocessingCanvas" xmlns:cx="http://schemas.microsoft.com/office/drawing/2014/chartex" xmlns:cx1="http://schemas.microsoft.com/office/drawing/2015/9/8/chartex" xmlns:cx2="http://schemas.microsoft.com/office/drawing/2015/10/21/chartex" xmlns:cx3="http://schemas.microsoft.com/office/drawing/2016/5/9/chartex" xmlns:cx4="http://schemas.microsoft.com/office/drawing/2016/5/10/chartex" xmlns:cx5="http://schemas.microsoft.com/office/drawing/2016/5/11/chartex" xmlns:cx6="http://schemas.microsoft.com/office/drawing/2016/5/12/chartex" xmlns:cx7="http://schemas.microsoft.com/office/drawing/2016/5/13/chartex" xmlns:cx8="http://schemas.microsoft.com/office/drawing/2016/5/14/chartex" xmlns:mc="http://schemas.openxmlformats.org/markup-compatibility/2006" xmlns:aink="http://schemas.microsoft.com/office/drawing/2016/ink" xmlns:am3d="http://schemas.microsoft.com/office/drawing/2017/model3d" xmlns:o="urn:schemas-microsoft-com:office:office" xmlns:oel="http://schemas.microsoft.com/office/2019/extlst" xmlns:r="http://schemas.openxmlformats.org/officeDocument/2006/relationships" xmlns:m="http://schemas.openxmlformats.org/officeDocument/2006/math" xmlns:v="urn:schemas-microsoft-com:vml" xmlns:wp14="http://schemas.microsoft.com/office/word/2010/wordprocessingDrawing" xmlns:wp="http://schemas.openxmlformats.org/drawingml/2006/wordprocessingDrawing" xmlns:w10="urn:schemas-microsoft-com:office:word" xmlns:w="http://schemas.openxmlformats.org/wordprocessingml/2006/main" xmlns:w14="http://schemas.microsoft.com/office/word/2010/wordml" xmlns:w15="http://schemas.microsoft.com/office/word/2012/wordml" xmlns:w16cei="http://schemas.microsoft.com/office/word/2026/wordml/cei" xmlns:w16cex="http://schemas.microsoft.com/office/word/2018/wordml/cex" xmlns:w16cid="http://schemas.microsoft.com/office/word/2016/wordml/cid" xmlns:w16="http://schemas.microsoft.com/office/word/2018/wordml" xmlns:w16du="http://schemas.microsoft.com/office/word/2023/wordml/word16du" xmlns:w16sdtdh="http://schemas.microsoft.com/office/word/2020/wordml/sdtdatahash" xmlns:w16sdtfl="http://schemas.microsoft.com/office/word/2024/wordml/sdtformatlock" xmlns:w16se="http://schemas.microsoft.com/office/word/2015/wordml/symex" xmlns:wpg="http://schemas.microsoft.com/office/word/2010/wordprocessingGroup" xmlns:wpi="http://schemas.microsoft.com/office/word/2010/wordprocessingInk" xmlns:wne="http://schemas.microsoft.com/office/word/2006/wordml" xmlns:wps="http://schemas.microsoft.com/office/word/2010/wordprocessingShape" mc:Ignorable="w14 w15 w16se w16cid w16 w16cex w16sdtdh w16sdtfl w16du wp14">
   <w:p>
     <w:pPr>
       <w:pStyle w:val="Header"/>
@@ -3400,7 +3083,7 @@
 </file>
 
 <file path=word/numbering.xml><?xml version="1.0" encoding="utf-8"?>
-<w:numbering xmlns:wpc="http://schemas.microsoft.com/office/word/2010/wordprocessingCanvas" xmlns:cx="http://schemas.microsoft.com/office/drawing/2014/chartex" xmlns:cx1="http://schemas.microsoft.com/office/drawing/2015/9/8/chartex" xmlns:cx2="http://schemas.microsoft.com/office/drawing/2015/10/21/chartex" xmlns:cx3="http://schemas.microsoft.com/office/drawing/2016/5/9/chartex" xmlns:cx4="http://schemas.microsoft.com/office/drawing/2016/5/10/chartex" xmlns:cx5="http://schemas.microsoft.com/office/drawing/2016/5/11/chartex" xmlns:cx6="http://schemas.microsoft.com/office/drawing/2016/5/12/chartex" xmlns:cx7="http://schemas.microsoft.com/office/drawing/2016/5/13/chartex" xmlns:cx8="http://schemas.microsoft.com/office/drawing/2016/5/14/chartex" xmlns:mc="http://schemas.openxmlformats.org/markup-compatibility/2006" xmlns:m="http://schemas.openxmlformats.org/officeDocument/2006/math" xmlns:aink="http://schemas.microsoft.com/office/drawing/2016/ink" xmlns:am3d="http://schemas.microsoft.com/office/drawing/2017/model3d" xmlns:oel="http://schemas.microsoft.com/office/2019/extlst" xmlns:r="http://schemas.openxmlformats.org/officeDocument/2006/relationships" xmlns:wp14="http://schemas.microsoft.com/office/word/2010/wordprocessingDrawing" xmlns:wp="http://schemas.openxmlformats.org/drawingml/2006/wordprocessingDrawing" xmlns:wpg="http://schemas.microsoft.com/office/word/2010/wordprocessingGroup" xmlns:wpi="http://schemas.microsoft.com/office/word/2010/wordprocessingInk" xmlns:wps="http://schemas.microsoft.com/office/word/2010/wordprocessingShape" xmlns:o="urn:schemas-microsoft-com:office:office" xmlns:v="urn:schemas-microsoft-com:vml" xmlns:w10="urn:schemas-microsoft-com:office:word" xmlns:w="http://schemas.openxmlformats.org/wordprocessingml/2006/main" xmlns:w14="http://schemas.microsoft.com/office/word/2010/wordml" xmlns:w15="http://schemas.microsoft.com/office/word/2012/wordml" xmlns:w16cei="http://schemas.microsoft.com/office/word/2026/wordml/cei" xmlns:w16cex="http://schemas.microsoft.com/office/word/2018/wordml/cex" xmlns:w16cid="http://schemas.microsoft.com/office/word/2016/wordml/cid" xmlns:w16="http://schemas.microsoft.com/office/word/2018/wordml" xmlns:w16sdtdh="http://schemas.microsoft.com/office/word/2020/wordml/sdtdatahash" xmlns:w16sdtfl="http://schemas.microsoft.com/office/word/2024/wordml/sdtformatlock" xmlns:w16se="http://schemas.microsoft.com/office/word/2015/wordml/symex" xmlns:w16du="http://schemas.microsoft.com/office/word/2023/wordml/word16du" xmlns:wne="http://schemas.microsoft.com/office/word/2006/wordml" mc:Ignorable="w14 w15 w16se w16cid w16 w16cex w16sdtdh w16sdtfl w16du wp14">
+<w:numbering xmlns:wpc="http://schemas.microsoft.com/office/word/2010/wordprocessingCanvas" xmlns:cx="http://schemas.microsoft.com/office/drawing/2014/chartex" xmlns:cx1="http://schemas.microsoft.com/office/drawing/2015/9/8/chartex" xmlns:cx2="http://schemas.microsoft.com/office/drawing/2015/10/21/chartex" xmlns:cx3="http://schemas.microsoft.com/office/drawing/2016/5/9/chartex" xmlns:cx4="http://schemas.microsoft.com/office/drawing/2016/5/10/chartex" xmlns:cx5="http://schemas.microsoft.com/office/drawing/2016/5/11/chartex" xmlns:cx6="http://schemas.microsoft.com/office/drawing/2016/5/12/chartex" xmlns:cx7="http://schemas.microsoft.com/office/drawing/2016/5/13/chartex" xmlns:cx8="http://schemas.microsoft.com/office/drawing/2016/5/14/chartex" xmlns:mc="http://schemas.openxmlformats.org/markup-compatibility/2006" xmlns:aink="http://schemas.microsoft.com/office/drawing/2016/ink" xmlns:am3d="http://schemas.microsoft.com/office/drawing/2017/model3d" xmlns:o="urn:schemas-microsoft-com:office:office" xmlns:oel="http://schemas.microsoft.com/office/2019/extlst" xmlns:r="http://schemas.openxmlformats.org/officeDocument/2006/relationships" xmlns:m="http://schemas.openxmlformats.org/officeDocument/2006/math" xmlns:v="urn:schemas-microsoft-com:vml" xmlns:wp14="http://schemas.microsoft.com/office/word/2010/wordprocessingDrawing" xmlns:wp="http://schemas.openxmlformats.org/drawingml/2006/wordprocessingDrawing" xmlns:w10="urn:schemas-microsoft-com:office:word" xmlns:w="http://schemas.openxmlformats.org/wordprocessingml/2006/main" xmlns:w14="http://schemas.microsoft.com/office/word/2010/wordml" xmlns:w15="http://schemas.microsoft.com/office/word/2012/wordml" xmlns:w16cei="http://schemas.microsoft.com/office/word/2026/wordml/cei" xmlns:w16cex="http://schemas.microsoft.com/office/word/2018/wordml/cex" xmlns:w16cid="http://schemas.microsoft.com/office/word/2016/wordml/cid" xmlns:w16="http://schemas.microsoft.com/office/word/2018/wordml" xmlns:w16du="http://schemas.microsoft.com/office/word/2023/wordml/word16du" xmlns:w16sdtdh="http://schemas.microsoft.com/office/word/2020/wordml/sdtdatahash" xmlns:w16sdtfl="http://schemas.microsoft.com/office/word/2024/wordml/sdtformatlock" xmlns:w16se="http://schemas.microsoft.com/office/word/2015/wordml/symex" xmlns:wpg="http://schemas.microsoft.com/office/word/2010/wordprocessingGroup" xmlns:wpi="http://schemas.microsoft.com/office/word/2010/wordprocessingInk" xmlns:wne="http://schemas.microsoft.com/office/word/2006/wordml" xmlns:wps="http://schemas.microsoft.com/office/word/2010/wordprocessingShape" mc:Ignorable="w14 w15 w16se w16cid w16 w16cex w16sdtdh w16sdtfl w16du wp14">
   <w:abstractNum w:abstractNumId="0" w15:restartNumberingAfterBreak="0">
     <w:nsid w:val="050B24B6"/>
     <w:multiLevelType w:val="hybridMultilevel"/>
@@ -3497,11 +3180,11 @@
 </file>
 
 <file path=word/styles.xml><?xml version="1.0" encoding="utf-8"?>
-<w:styles xmlns:wp14="http://schemas.microsoft.com/office/word/2010/wordprocessingDrawing" xmlns:mc="http://schemas.openxmlformats.org/markup-compatibility/2006" xmlns:r="http://schemas.openxmlformats.org/officeDocument/2006/relationships" xmlns:w="http://schemas.openxmlformats.org/wordprocessingml/2006/main" xmlns:w14="http://schemas.microsoft.com/office/word/2010/wordml" xmlns:w15="http://schemas.microsoft.com/office/word/2012/wordml" xmlns:w16cex="http://schemas.microsoft.com/office/word/2018/wordml/cex" xmlns:w16cid="http://schemas.microsoft.com/office/word/2016/wordml/cid" xmlns:w16="http://schemas.microsoft.com/office/word/2018/wordml" xmlns:w16sdtdh="http://schemas.microsoft.com/office/word/2020/wordml/sdtdatahash" xmlns:w16sdtfl="http://schemas.microsoft.com/office/word/2024/wordml/sdtformatlock" xmlns:w16se="http://schemas.microsoft.com/office/word/2015/wordml/symex" xmlns:w16du="http://schemas.microsoft.com/office/word/2023/wordml/word16du" mc:Ignorable="w14 w15 w16se w16cid w16 w16cex w16sdtdh w16sdtfl w16du wp14">
+<w:styles xmlns:mc="http://schemas.openxmlformats.org/markup-compatibility/2006" xmlns:r="http://schemas.openxmlformats.org/officeDocument/2006/relationships" xmlns:w="http://schemas.openxmlformats.org/wordprocessingml/2006/main" xmlns:w14="http://schemas.microsoft.com/office/word/2010/wordml" xmlns:w15="http://schemas.microsoft.com/office/word/2012/wordml" xmlns:w16cex="http://schemas.microsoft.com/office/word/2018/wordml/cex" xmlns:w16cid="http://schemas.microsoft.com/office/word/2016/wordml/cid" xmlns:w16="http://schemas.microsoft.com/office/word/2018/wordml" xmlns:w16du="http://schemas.microsoft.com/office/word/2023/wordml/word16du" xmlns:w16sdtdh="http://schemas.microsoft.com/office/word/2020/wordml/sdtdatahash" xmlns:w16sdtfl="http://schemas.microsoft.com/office/word/2024/wordml/sdtformatlock" xmlns:w16se="http://schemas.microsoft.com/office/word/2015/wordml/symex" mc:Ignorable="w14 w15 w16se w16cid w16 w16cex w16sdtdh w16sdtfl w16du">
   <w:docDefaults>
     <w:rPrDefault>
       <w:rPr>
-        <w:rFonts w:ascii="Calibri" w:hAnsi="Calibri" w:eastAsia="Calibri" w:cs="Calibri"/>
+        <w:rFonts w:ascii="Calibri" w:eastAsia="Calibri" w:hAnsi="Calibri" w:cs="Calibri"/>
         <w:sz w:val="22"/>
         <w:szCs w:val="22"/>
         <w:lang w:val="en-AU" w:eastAsia="en-GB" w:bidi="ar-SA"/>
@@ -3512,14 +3195,14 @@
   <w:latentStyles w:defLockedState="0" w:defUIPriority="99" w:defSemiHidden="0" w:defUnhideWhenUsed="0" w:defQFormat="0" w:count="376">
     <w:lsdException w:name="Normal" w:uiPriority="0" w:qFormat="1"/>
     <w:lsdException w:name="heading 1" w:uiPriority="9" w:qFormat="1"/>
-    <w:lsdException w:name="heading 2" w:uiPriority="9" w:semiHidden="1" w:unhideWhenUsed="1" w:qFormat="1"/>
-    <w:lsdException w:name="heading 3" w:uiPriority="9" w:semiHidden="1" w:unhideWhenUsed="1" w:qFormat="1"/>
-    <w:lsdException w:name="heading 4" w:uiPriority="9" w:semiHidden="1" w:unhideWhenUsed="1" w:qFormat="1"/>
-    <w:lsdException w:name="heading 5" w:uiPriority="9" w:semiHidden="1" w:unhideWhenUsed="1" w:qFormat="1"/>
-    <w:lsdException w:name="heading 6" w:uiPriority="9" w:semiHidden="1" w:unhideWhenUsed="1" w:qFormat="1"/>
-    <w:lsdException w:name="heading 7" w:uiPriority="9" w:semiHidden="1" w:unhideWhenUsed="1" w:qFormat="1"/>
-    <w:lsdException w:name="heading 8" w:uiPriority="9" w:semiHidden="1" w:unhideWhenUsed="1" w:qFormat="1"/>
-    <w:lsdException w:name="heading 9" w:uiPriority="9" w:semiHidden="1" w:unhideWhenUsed="1" w:qFormat="1"/>
+    <w:lsdException w:name="heading 2" w:semiHidden="1" w:uiPriority="9" w:unhideWhenUsed="1" w:qFormat="1"/>
+    <w:lsdException w:name="heading 3" w:semiHidden="1" w:uiPriority="9" w:unhideWhenUsed="1" w:qFormat="1"/>
+    <w:lsdException w:name="heading 4" w:semiHidden="1" w:uiPriority="9" w:unhideWhenUsed="1" w:qFormat="1"/>
+    <w:lsdException w:name="heading 5" w:semiHidden="1" w:uiPriority="9" w:unhideWhenUsed="1" w:qFormat="1"/>
+    <w:lsdException w:name="heading 6" w:semiHidden="1" w:uiPriority="9" w:unhideWhenUsed="1" w:qFormat="1"/>
+    <w:lsdException w:name="heading 7" w:semiHidden="1" w:uiPriority="9" w:unhideWhenUsed="1" w:qFormat="1"/>
+    <w:lsdException w:name="heading 8" w:semiHidden="1" w:uiPriority="9" w:unhideWhenUsed="1" w:qFormat="1"/>
+    <w:lsdException w:name="heading 9" w:semiHidden="1" w:uiPriority="9" w:unhideWhenUsed="1" w:qFormat="1"/>
     <w:lsdException w:name="index 1" w:semiHidden="1" w:unhideWhenUsed="1"/>
     <w:lsdException w:name="index 2" w:semiHidden="1" w:unhideWhenUsed="1"/>
     <w:lsdException w:name="index 3" w:semiHidden="1" w:unhideWhenUsed="1"/>
@@ -3529,22 +3212,22 @@
     <w:lsdException w:name="index 7" w:semiHidden="1" w:unhideWhenUsed="1"/>
     <w:lsdException w:name="index 8" w:semiHidden="1" w:unhideWhenUsed="1"/>
     <w:lsdException w:name="index 9" w:semiHidden="1" w:unhideWhenUsed="1"/>
-    <w:lsdException w:name="toc 1" w:uiPriority="39" w:semiHidden="1" w:unhideWhenUsed="1"/>
-    <w:lsdException w:name="toc 2" w:uiPriority="39" w:semiHidden="1" w:unhideWhenUsed="1"/>
-    <w:lsdException w:name="toc 3" w:uiPriority="39" w:semiHidden="1" w:unhideWhenUsed="1"/>
-    <w:lsdException w:name="toc 4" w:uiPriority="39" w:semiHidden="1" w:unhideWhenUsed="1"/>
-    <w:lsdException w:name="toc 5" w:uiPriority="39" w:semiHidden="1" w:unhideWhenUsed="1"/>
-    <w:lsdException w:name="toc 6" w:uiPriority="39" w:semiHidden="1" w:unhideWhenUsed="1"/>
-    <w:lsdException w:name="toc 7" w:uiPriority="39" w:semiHidden="1" w:unhideWhenUsed="1"/>
-    <w:lsdException w:name="toc 8" w:uiPriority="39" w:semiHidden="1" w:unhideWhenUsed="1"/>
-    <w:lsdException w:name="toc 9" w:uiPriority="39" w:semiHidden="1" w:unhideWhenUsed="1"/>
+    <w:lsdException w:name="toc 1" w:semiHidden="1" w:uiPriority="39" w:unhideWhenUsed="1"/>
+    <w:lsdException w:name="toc 2" w:semiHidden="1" w:uiPriority="39" w:unhideWhenUsed="1"/>
+    <w:lsdException w:name="toc 3" w:semiHidden="1" w:uiPriority="39" w:unhideWhenUsed="1"/>
+    <w:lsdException w:name="toc 4" w:semiHidden="1" w:uiPriority="39" w:unhideWhenUsed="1"/>
+    <w:lsdException w:name="toc 5" w:semiHidden="1" w:uiPriority="39" w:unhideWhenUsed="1"/>
+    <w:lsdException w:name="toc 6" w:semiHidden="1" w:uiPriority="39" w:unhideWhenUsed="1"/>
+    <w:lsdException w:name="toc 7" w:semiHidden="1" w:uiPriority="39" w:unhideWhenUsed="1"/>
+    <w:lsdException w:name="toc 8" w:semiHidden="1" w:uiPriority="39" w:unhideWhenUsed="1"/>
+    <w:lsdException w:name="toc 9" w:semiHidden="1" w:uiPriority="39" w:unhideWhenUsed="1"/>
     <w:lsdException w:name="Normal Indent" w:semiHidden="1" w:unhideWhenUsed="1"/>
     <w:lsdException w:name="footnote text" w:semiHidden="1" w:unhideWhenUsed="1"/>
     <w:lsdException w:name="annotation text" w:semiHidden="1" w:unhideWhenUsed="1"/>
     <w:lsdException w:name="header" w:semiHidden="1" w:unhideWhenUsed="1"/>
     <w:lsdException w:name="footer" w:semiHidden="1" w:unhideWhenUsed="1"/>
     <w:lsdException w:name="index heading" w:semiHidden="1" w:unhideWhenUsed="1"/>
-    <w:lsdException w:name="caption" w:uiPriority="35" w:semiHidden="1" w:unhideWhenUsed="1" w:qFormat="1"/>
+    <w:lsdException w:name="caption" w:semiHidden="1" w:uiPriority="35" w:unhideWhenUsed="1" w:qFormat="1"/>
     <w:lsdException w:name="table of figures" w:semiHidden="1" w:unhideWhenUsed="1"/>
     <w:lsdException w:name="envelope address" w:semiHidden="1" w:unhideWhenUsed="1"/>
     <w:lsdException w:name="envelope return" w:semiHidden="1" w:unhideWhenUsed="1"/>
@@ -3575,7 +3258,7 @@
     <w:lsdException w:name="Title" w:uiPriority="10" w:qFormat="1"/>
     <w:lsdException w:name="Closing" w:semiHidden="1" w:unhideWhenUsed="1"/>
     <w:lsdException w:name="Signature" w:semiHidden="1" w:unhideWhenUsed="1"/>
-    <w:lsdException w:name="Default Paragraph Font" w:uiPriority="1" w:semiHidden="1" w:unhideWhenUsed="1"/>
+    <w:lsdException w:name="Default Paragraph Font" w:semiHidden="1" w:uiPriority="1" w:unhideWhenUsed="1"/>
     <w:lsdException w:name="Body Text" w:semiHidden="1" w:unhideWhenUsed="1"/>
     <w:lsdException w:name="Body Text Indent" w:semiHidden="1" w:unhideWhenUsed="1"/>
     <w:lsdException w:name="List Continue" w:semiHidden="1" w:unhideWhenUsed="1"/>
@@ -3775,8 +3458,8 @@
     <w:lsdException w:name="Subtle Reference" w:uiPriority="31" w:qFormat="1"/>
     <w:lsdException w:name="Intense Reference" w:uiPriority="32" w:qFormat="1"/>
     <w:lsdException w:name="Book Title" w:uiPriority="33" w:qFormat="1"/>
-    <w:lsdException w:name="Bibliography" w:uiPriority="37" w:semiHidden="1" w:unhideWhenUsed="1"/>
-    <w:lsdException w:name="TOC Heading" w:uiPriority="39" w:semiHidden="1" w:unhideWhenUsed="1" w:qFormat="1"/>
+    <w:lsdException w:name="Bibliography" w:semiHidden="1" w:uiPriority="37" w:unhideWhenUsed="1"/>
+    <w:lsdException w:name="TOC Heading" w:semiHidden="1" w:uiPriority="39" w:unhideWhenUsed="1" w:qFormat="1"/>
     <w:lsdException w:name="Plain Table 1" w:uiPriority="41"/>
     <w:lsdException w:name="Plain Table 2" w:uiPriority="42"/>
     <w:lsdException w:name="Plain Table 3" w:uiPriority="43"/>
@@ -3887,7 +3570,7 @@
     <w:lsdException w:name="Unresolved Mention" w:semiHidden="1" w:unhideWhenUsed="1"/>
     <w:lsdException w:name="Smart Link" w:semiHidden="1" w:unhideWhenUsed="1"/>
   </w:latentStyles>
-  <w:style w:type="paragraph" w:styleId="Normal" w:default="1">
+  <w:style w:type="paragraph" w:default="1" w:styleId="Normal">
     <w:name w:val="Normal"/>
     <w:qFormat/>
   </w:style>
@@ -3899,7 +3582,7 @@
       <w:outlineLvl w:val="0"/>
     </w:pPr>
     <w:rPr>
-      <w:rFonts w:ascii="Cambria" w:hAnsi="Cambria" w:eastAsia="Cambria" w:cs="Cambria"/>
+      <w:rFonts w:ascii="Cambria" w:eastAsia="Cambria" w:hAnsi="Cambria" w:cs="Cambria"/>
       <w:b/>
       <w:bCs/>
       <w:color w:val="1E2761"/>
@@ -3978,13 +3661,13 @@
       <w:color w:val="1F4D78"/>
     </w:rPr>
   </w:style>
-  <w:style w:type="character" w:styleId="DefaultParagraphFont" w:default="1">
+  <w:style w:type="character" w:default="1" w:styleId="DefaultParagraphFont">
     <w:name w:val="Default Paragraph Font"/>
     <w:uiPriority w:val="1"/>
     <w:semiHidden/>
     <w:unhideWhenUsed/>
   </w:style>
-  <w:style w:type="table" w:styleId="TableNormal" w:default="1">
+  <w:style w:type="table" w:default="1" w:styleId="TableNormal">
     <w:name w:val="Normal Table"/>
     <w:uiPriority w:val="99"/>
     <w:semiHidden/>
@@ -3999,7 +3682,7 @@
       </w:tblCellMar>
     </w:tblPr>
   </w:style>
-  <w:style w:type="numbering" w:styleId="NoList" w:default="1">
+  <w:style w:type="numbering" w:default="1" w:styleId="NoList">
     <w:name w:val="No List"/>
     <w:uiPriority w:val="99"/>
     <w:semiHidden/>
@@ -4010,7 +3693,7 @@
     <w:uiPriority w:val="10"/>
     <w:qFormat/>
     <w:rPr>
-      <w:rFonts w:ascii="Cambria" w:hAnsi="Cambria" w:eastAsia="Cambria" w:cs="Cambria"/>
+      <w:rFonts w:ascii="Cambria" w:eastAsia="Cambria" w:hAnsi="Cambria" w:cs="Cambria"/>
       <w:b/>
       <w:bCs/>
       <w:color w:val="1E2761"/>
@@ -4018,7 +3701,7 @@
       <w:szCs w:val="40"/>
     </w:rPr>
   </w:style>
-  <w:style w:type="paragraph" w:styleId="Strong1" w:customStyle="1">
+  <w:style w:type="paragraph" w:customStyle="1" w:styleId="Strong1">
     <w:name w:val="Strong1"/>
     <w:qFormat/>
     <w:rPr>
@@ -4059,7 +3742,7 @@
       <w:szCs w:val="20"/>
     </w:rPr>
   </w:style>
-  <w:style w:type="character" w:styleId="FootnoteTextChar" w:customStyle="1">
+  <w:style w:type="character" w:customStyle="1" w:styleId="FootnoteTextChar">
     <w:name w:val="Footnote Text Char"/>
     <w:link w:val="FootnoteText"/>
     <w:uiPriority w:val="99"/>
@@ -4090,7 +3773,7 @@
       <w:szCs w:val="20"/>
     </w:rPr>
   </w:style>
-  <w:style w:type="character" w:styleId="EndnoteTextChar" w:customStyle="1">
+  <w:style w:type="character" w:customStyle="1" w:styleId="EndnoteTextChar">
     <w:name w:val="Endnote Text Char"/>
     <w:link w:val="EndnoteText"/>
     <w:uiPriority w:val="99"/>
@@ -4124,7 +3807,7 @@
       <w:spacing w:before="100" w:beforeAutospacing="1" w:after="100" w:afterAutospacing="1"/>
     </w:pPr>
     <w:rPr>
-      <w:rFonts w:ascii="Times New Roman" w:hAnsi="Times New Roman" w:eastAsia="Times New Roman" w:cs="Times New Roman"/>
+      <w:rFonts w:ascii="Times New Roman" w:eastAsia="Times New Roman" w:hAnsi="Times New Roman" w:cs="Times New Roman"/>
       <w:sz w:val="24"/>
       <w:szCs w:val="24"/>
     </w:rPr>
@@ -4143,7 +3826,7 @@
       </w:tabs>
     </w:pPr>
   </w:style>
-  <w:style w:type="character" w:styleId="HeaderChar" w:customStyle="1">
+  <w:style w:type="character" w:customStyle="1" w:styleId="HeaderChar">
     <w:name w:val="Header Char"/>
     <w:basedOn w:val="DefaultParagraphFont"/>
     <w:link w:val="Header"/>
@@ -4164,44 +3847,34 @@
       </w:tabs>
     </w:pPr>
   </w:style>
-  <w:style w:type="character" w:styleId="FooterChar" w:customStyle="1">
+  <w:style w:type="character" w:customStyle="1" w:styleId="FooterChar">
     <w:name w:val="Footer Char"/>
     <w:basedOn w:val="DefaultParagraphFont"/>
     <w:link w:val="Footer"/>
     <w:uiPriority w:val="99"/>
     <w:rsid w:val="00F95A76"/>
   </w:style>
-  <w:style xmlns:w="http://schemas.openxmlformats.org/wordprocessingml/2006/main" w:type="table" w:styleId="TableGrid">
-    <w:name xmlns:w="http://schemas.openxmlformats.org/wordprocessingml/2006/main" w:val="Table Grid"/>
-    <w:basedOn xmlns:w="http://schemas.openxmlformats.org/wordprocessingml/2006/main" w:val="TableNormal"/>
-    <w:uiPriority xmlns:w="http://schemas.openxmlformats.org/wordprocessingml/2006/main" w:val="59"/>
-    <w:rsid xmlns:w="http://schemas.openxmlformats.org/wordprocessingml/2006/main" w:val="00FB4123"/>
-    <w:pPr xmlns:w="http://schemas.openxmlformats.org/wordprocessingml/2006/main">
-      <w:spacing w:after="0" w:line="240" w:lineRule="auto"/>
-    </w:pPr>
-    <w:tblPr xmlns:w="http://schemas.openxmlformats.org/wordprocessingml/2006/main">
-      <w:tblInd w:w="0" w:type="dxa"/>
+  <w:style w:type="table" w:styleId="TableGrid">
+    <w:name w:val="Table Grid"/>
+    <w:basedOn w:val="TableNormal"/>
+    <w:uiPriority w:val="59"/>
+    <w:rsid w:val="00FB4123"/>
+    <w:tblPr>
       <w:tblBorders>
-        <w:top w:val="single" w:color="000000" w:themeColor="text1" w:sz="4" w:space="0"/>
-        <w:left w:val="single" w:color="000000" w:themeColor="text1" w:sz="4" w:space="0"/>
-        <w:bottom w:val="single" w:color="000000" w:themeColor="text1" w:sz="4" w:space="0"/>
-        <w:right w:val="single" w:color="000000" w:themeColor="text1" w:sz="4" w:space="0"/>
-        <w:insideH w:val="single" w:color="000000" w:themeColor="text1" w:sz="4" w:space="0"/>
-        <w:insideV w:val="single" w:color="000000" w:themeColor="text1" w:sz="4" w:space="0"/>
+        <w:top w:val="single" w:sz="4" w:space="0" w:color="000000" w:themeColor="text1"/>
+        <w:left w:val="single" w:sz="4" w:space="0" w:color="000000" w:themeColor="text1"/>
+        <w:bottom w:val="single" w:sz="4" w:space="0" w:color="000000" w:themeColor="text1"/>
+        <w:right w:val="single" w:sz="4" w:space="0" w:color="000000" w:themeColor="text1"/>
+        <w:insideH w:val="single" w:sz="4" w:space="0" w:color="000000" w:themeColor="text1"/>
+        <w:insideV w:val="single" w:sz="4" w:space="0" w:color="000000" w:themeColor="text1"/>
       </w:tblBorders>
-      <w:tblCellMar>
-        <w:top w:w="0" w:type="dxa"/>
-        <w:left w:w="108" w:type="dxa"/>
-        <w:bottom w:w="0" w:type="dxa"/>
-        <w:right w:w="108" w:type="dxa"/>
-      </w:tblCellMar>
     </w:tblPr>
   </w:style>
 </w:styles>
 </file>
 
 <file path=word/theme/theme1.xml><?xml version="1.0" encoding="utf-8"?>
-<a:theme xmlns:a="http://schemas.openxmlformats.org/drawingml/2006/main" xmlns:thm15="http://schemas.microsoft.com/office/thememl/2012/main" name="Office Theme">
+<a:theme xmlns:a="http://schemas.openxmlformats.org/drawingml/2006/main" name="Office Theme">
   <a:themeElements>
     <a:clrScheme name="Office">
       <a:dk1>
@@ -4516,6 +4189,15 @@
 </file>
 
 <file path=customXml/item1.xml><?xml version="1.0" encoding="utf-8"?>
+<?mso-contentType ?>
+<FormTemplates xmlns="http://schemas.microsoft.com/sharepoint/v3/contenttype/forms">
+  <Display>DocumentLibraryForm</Display>
+  <Edit>DocumentLibraryForm</Edit>
+  <New>DocumentLibraryForm</New>
+</FormTemplates>
+</file>
+
+<file path=customXml/item2.xml><?xml version="1.0" encoding="utf-8"?>
 <ct:contentTypeSchema xmlns:ct="http://schemas.microsoft.com/office/2006/metadata/contentType" xmlns:ma="http://schemas.microsoft.com/office/2006/metadata/properties/metaAttributes" ct:_="" ma:_="" ma:contentTypeName="Document" ma:contentTypeID="0x01010096DE152E2C6A8C42B049878071E35BFA" ma:contentTypeVersion="9" ma:contentTypeDescription="Create a new document." ma:contentTypeScope="" ma:versionID="595b8f023b5cacfb86084034b1c0c701">
   <xsd:schema xmlns:xsd="http://www.w3.org/2001/XMLSchema" xmlns:xs="http://www.w3.org/2001/XMLSchema" xmlns:p="http://schemas.microsoft.com/office/2006/metadata/properties" xmlns:ns2="26c2b24a-a057-4aca-9b64-9bcaa58ad00d" targetNamespace="http://schemas.microsoft.com/office/2006/metadata/properties" ma:root="true" ma:fieldsID="e1ae442cdb69f0fb03c4561f9e8ca2e1" ns2:_="">
     <xsd:import namespace="26c2b24a-a057-4aca-9b64-9bcaa58ad00d"/>
@@ -4687,15 +4369,6 @@
 </ct:contentTypeSchema>
 </file>
 
-<file path=customXml/item2.xml><?xml version="1.0" encoding="utf-8"?>
-<?mso-contentType ?>
-<FormTemplates xmlns="http://schemas.microsoft.com/sharepoint/v3/contenttype/forms">
-  <Display>DocumentLibraryForm</Display>
-  <Edit>DocumentLibraryForm</Edit>
-  <New>DocumentLibraryForm</New>
-</FormTemplates>
-</file>
-
 <file path=customXml/item3.xml><?xml version="1.0" encoding="utf-8"?>
 <p:properties xmlns:p="http://schemas.microsoft.com/office/2006/metadata/properties" xmlns:xsi="http://www.w3.org/2001/XMLSchema-instance" xmlns:pc="http://schemas.microsoft.com/office/infopath/2007/PartnerControls">
   <documentManagement>
@@ -4707,15 +4380,39 @@
 </file>
 
 <file path=customXml/itemProps1.xml><?xml version="1.0" encoding="utf-8"?>
-<ds:datastoreItem xmlns:ds="http://schemas.openxmlformats.org/officeDocument/2006/customXml" ds:itemID="{C4D2F875-ABDF-4D51-A09D-E87814E66E0E}"/>
+<ds:datastoreItem xmlns:ds="http://schemas.openxmlformats.org/officeDocument/2006/customXml" ds:itemID="{CC260152-CF42-4DBE-8A6A-9EF25B1A2E2C}">
+  <ds:schemaRefs>
+    <ds:schemaRef ds:uri="http://schemas.microsoft.com/sharepoint/v3/contenttype/forms"/>
+  </ds:schemaRefs>
+</ds:datastoreItem>
 </file>
 
 <file path=customXml/itemProps2.xml><?xml version="1.0" encoding="utf-8"?>
-<ds:datastoreItem xmlns:ds="http://schemas.openxmlformats.org/officeDocument/2006/customXml" ds:itemID="{CC260152-CF42-4DBE-8A6A-9EF25B1A2E2C}"/>
+<ds:datastoreItem xmlns:ds="http://schemas.openxmlformats.org/officeDocument/2006/customXml" ds:itemID="{C4D2F875-ABDF-4D51-A09D-E87814E66E0E}">
+  <ds:schemaRefs>
+    <ds:schemaRef ds:uri="http://schemas.microsoft.com/office/2006/metadata/contentType"/>
+    <ds:schemaRef ds:uri="http://schemas.microsoft.com/office/2006/metadata/properties/metaAttributes"/>
+    <ds:schemaRef ds:uri="http://www.w3.org/2001/XMLSchema"/>
+    <ds:schemaRef ds:uri="http://schemas.microsoft.com/office/2006/metadata/properties"/>
+    <ds:schemaRef ds:uri="26c2b24a-a057-4aca-9b64-9bcaa58ad00d"/>
+    <ds:schemaRef ds:uri="http://schemas.microsoft.com/office/2006/documentManagement/types"/>
+    <ds:schemaRef ds:uri="http://schemas.microsoft.com/office/infopath/2007/PartnerControls"/>
+    <ds:schemaRef ds:uri="http://schemas.openxmlformats.org/package/2006/metadata/core-properties"/>
+    <ds:schemaRef ds:uri="http://purl.org/dc/elements/1.1/"/>
+    <ds:schemaRef ds:uri="http://purl.org/dc/terms/"/>
+    <ds:schemaRef ds:uri="http://schemas.microsoft.com/internal/obd"/>
+  </ds:schemaRefs>
+</ds:datastoreItem>
 </file>
 
 <file path=customXml/itemProps3.xml><?xml version="1.0" encoding="utf-8"?>
-<ds:datastoreItem xmlns:ds="http://schemas.openxmlformats.org/officeDocument/2006/customXml" ds:itemID="{FA5B846C-893C-4D38-A72D-4C8C278906C0}"/>
+<ds:datastoreItem xmlns:ds="http://schemas.openxmlformats.org/officeDocument/2006/customXml" ds:itemID="{FA5B846C-893C-4D38-A72D-4C8C278906C0}">
+  <ds:schemaRefs>
+    <ds:schemaRef ds:uri="http://schemas.microsoft.com/office/2006/metadata/properties"/>
+    <ds:schemaRef ds:uri="http://schemas.microsoft.com/office/infopath/2007/PartnerControls"/>
+    <ds:schemaRef ds:uri="26c2b24a-a057-4aca-9b64-9bcaa58ad00d"/>
+  </ds:schemaRefs>
+</ds:datastoreItem>
 </file>
 
 <file path=docMetadata/LabelInfo.xml><?xml version="1.0" encoding="utf-8"?>

</xml_diff>

<commit_message>
Amended the BA task on master doc with github link
</commit_message>
<xml_diff>
--- a/G77 Team A Master Doc.docx
+++ b/G77 Team A Master Doc.docx
@@ -1,6 +1,6 @@
 
 <file path=word/document.xml><?xml version="1.0" encoding="utf-8"?>
-<w:document xmlns:wpc="http://schemas.microsoft.com/office/word/2010/wordprocessingCanvas" xmlns:cx="http://schemas.microsoft.com/office/drawing/2014/chartex" xmlns:cx1="http://schemas.microsoft.com/office/drawing/2015/9/8/chartex" xmlns:cx2="http://schemas.microsoft.com/office/drawing/2015/10/21/chartex" xmlns:cx3="http://schemas.microsoft.com/office/drawing/2016/5/9/chartex" xmlns:cx4="http://schemas.microsoft.com/office/drawing/2016/5/10/chartex" xmlns:cx5="http://schemas.microsoft.com/office/drawing/2016/5/11/chartex" xmlns:cx6="http://schemas.microsoft.com/office/drawing/2016/5/12/chartex" xmlns:cx7="http://schemas.microsoft.com/office/drawing/2016/5/13/chartex" xmlns:cx8="http://schemas.microsoft.com/office/drawing/2016/5/14/chartex" xmlns:mc="http://schemas.openxmlformats.org/markup-compatibility/2006" xmlns:aink="http://schemas.microsoft.com/office/drawing/2016/ink" xmlns:am3d="http://schemas.microsoft.com/office/drawing/2017/model3d" xmlns:o="urn:schemas-microsoft-com:office:office" xmlns:oel="http://schemas.microsoft.com/office/2019/extlst" xmlns:r="http://schemas.openxmlformats.org/officeDocument/2006/relationships" xmlns:m="http://schemas.openxmlformats.org/officeDocument/2006/math" xmlns:v="urn:schemas-microsoft-com:vml" xmlns:wp14="http://schemas.microsoft.com/office/word/2010/wordprocessingDrawing" xmlns:wp="http://schemas.openxmlformats.org/drawingml/2006/wordprocessingDrawing" xmlns:w10="urn:schemas-microsoft-com:office:word" xmlns:w="http://schemas.openxmlformats.org/wordprocessingml/2006/main" xmlns:w14="http://schemas.microsoft.com/office/word/2010/wordml" xmlns:w15="http://schemas.microsoft.com/office/word/2012/wordml" xmlns:w16cei="http://schemas.microsoft.com/office/word/2026/wordml/cei" xmlns:w16cex="http://schemas.microsoft.com/office/word/2018/wordml/cex" xmlns:w16cid="http://schemas.microsoft.com/office/word/2016/wordml/cid" xmlns:w16="http://schemas.microsoft.com/office/word/2018/wordml" xmlns:w16du="http://schemas.microsoft.com/office/word/2023/wordml/word16du" xmlns:w16sdtdh="http://schemas.microsoft.com/office/word/2020/wordml/sdtdatahash" xmlns:w16sdtfl="http://schemas.microsoft.com/office/word/2024/wordml/sdtformatlock" xmlns:w16se="http://schemas.microsoft.com/office/word/2015/wordml/symex" xmlns:wpg="http://schemas.microsoft.com/office/word/2010/wordprocessingGroup" xmlns:wpi="http://schemas.microsoft.com/office/word/2010/wordprocessingInk" xmlns:wne="http://schemas.microsoft.com/office/word/2006/wordml" xmlns:wps="http://schemas.microsoft.com/office/word/2010/wordprocessingShape" mc:Ignorable="w14 w15 w16se w16cid w16 w16cex w16sdtdh w16sdtfl w16du wp14">
+<w:document xmlns:wpc="http://schemas.microsoft.com/office/word/2010/wordprocessingCanvas" xmlns:cx="http://schemas.microsoft.com/office/drawing/2014/chartex" xmlns:cx1="http://schemas.microsoft.com/office/drawing/2015/9/8/chartex" xmlns:cx2="http://schemas.microsoft.com/office/drawing/2015/10/21/chartex" xmlns:cx3="http://schemas.microsoft.com/office/drawing/2016/5/9/chartex" xmlns:cx4="http://schemas.microsoft.com/office/drawing/2016/5/10/chartex" xmlns:cx5="http://schemas.microsoft.com/office/drawing/2016/5/11/chartex" xmlns:cx6="http://schemas.microsoft.com/office/drawing/2016/5/12/chartex" xmlns:cx7="http://schemas.microsoft.com/office/drawing/2016/5/13/chartex" xmlns:cx8="http://schemas.microsoft.com/office/drawing/2016/5/14/chartex" xmlns:mc="http://schemas.openxmlformats.org/markup-compatibility/2006" xmlns:m="http://schemas.openxmlformats.org/officeDocument/2006/math" xmlns:aink="http://schemas.microsoft.com/office/drawing/2016/ink" xmlns:am3d="http://schemas.microsoft.com/office/drawing/2017/model3d" xmlns:oel="http://schemas.microsoft.com/office/2019/extlst" xmlns:r="http://schemas.openxmlformats.org/officeDocument/2006/relationships" xmlns:wp14="http://schemas.microsoft.com/office/word/2010/wordprocessingDrawing" xmlns:wp="http://schemas.openxmlformats.org/drawingml/2006/wordprocessingDrawing" xmlns:wpg="http://schemas.microsoft.com/office/word/2010/wordprocessingGroup" xmlns:wpi="http://schemas.microsoft.com/office/word/2010/wordprocessingInk" xmlns:wps="http://schemas.microsoft.com/office/word/2010/wordprocessingShape" xmlns:o="urn:schemas-microsoft-com:office:office" xmlns:v="urn:schemas-microsoft-com:vml" xmlns:w10="urn:schemas-microsoft-com:office:word" xmlns:w="http://schemas.openxmlformats.org/wordprocessingml/2006/main" xmlns:w14="http://schemas.microsoft.com/office/word/2010/wordml" xmlns:w15="http://schemas.microsoft.com/office/word/2012/wordml" xmlns:w16cei="http://schemas.microsoft.com/office/word/2026/wordml/cei" xmlns:w16cex="http://schemas.microsoft.com/office/word/2018/wordml/cex" xmlns:w16cid="http://schemas.microsoft.com/office/word/2016/wordml/cid" xmlns:w16="http://schemas.microsoft.com/office/word/2018/wordml" xmlns:w16sdtdh="http://schemas.microsoft.com/office/word/2020/wordml/sdtdatahash" xmlns:w16sdtfl="http://schemas.microsoft.com/office/word/2024/wordml/sdtformatlock" xmlns:w16se="http://schemas.microsoft.com/office/word/2015/wordml/symex" xmlns:w16du="http://schemas.microsoft.com/office/word/2023/wordml/word16du" xmlns:wne="http://schemas.microsoft.com/office/word/2006/wordml" xmlns:a="http://schemas.openxmlformats.org/drawingml/2006/main" xmlns:pic="http://schemas.openxmlformats.org/drawingml/2006/picture" xmlns:a14="http://schemas.microsoft.com/office/drawing/2010/main" mc:Ignorable="w14 w15 w16se w16cid w16 w16cex w16sdtdh w16sdtfl w16du wp14">
   <w:body>
     <w:p>
       <w:pPr>
@@ -69,7 +69,7 @@
     <w:p>
       <w:pPr>
         <w:pBdr>
-          <w:bottom w:val="single" w:sz="6" w:space="4" w:color="D5D9E6"/>
+          <w:bottom w:val="single" w:color="D5D9E6" w:sz="6" w:space="4"/>
         </w:pBdr>
         <w:spacing w:after="240"/>
       </w:pPr>
@@ -80,19 +80,25 @@
         <w:spacing w:before="320" w:after="140"/>
       </w:pPr>
       <w:r>
-        <w:t>[Login Restyling Bootstrap] Task 1 —Write Requirements: Team Page &amp; Login Styling</w:t>
+        <w:t>[Login Restyling Bootstrap]</w:t>
+      </w:r>
+      <w:r>
+        <w:t xml:space="preserve"> </w:t>
+      </w:r>
+      <w:r>
+        <w:t>Task 1 —Write Requirements: Team Page &amp; Login Styling</w:t>
       </w:r>
     </w:p>
     <w:tbl>
       <w:tblPr>
         <w:tblW w:w="9000" w:type="dxa"/>
         <w:tblBorders>
-          <w:top w:val="single" w:sz="4" w:space="0" w:color="auto"/>
-          <w:left w:val="single" w:sz="4" w:space="0" w:color="auto"/>
-          <w:bottom w:val="single" w:sz="4" w:space="0" w:color="auto"/>
-          <w:right w:val="single" w:sz="4" w:space="0" w:color="auto"/>
-          <w:insideH w:val="single" w:sz="4" w:space="0" w:color="auto"/>
-          <w:insideV w:val="single" w:sz="4" w:space="0" w:color="auto"/>
+          <w:top w:val="single" w:color="auto" w:sz="4" w:space="0"/>
+          <w:left w:val="single" w:color="auto" w:sz="4" w:space="0"/>
+          <w:bottom w:val="single" w:color="auto" w:sz="4" w:space="0"/>
+          <w:right w:val="single" w:color="auto" w:sz="4" w:space="0"/>
+          <w:insideH w:val="single" w:color="auto" w:sz="4" w:space="0"/>
+          <w:insideV w:val="single" w:color="auto" w:sz="4" w:space="0"/>
         </w:tblBorders>
         <w:tblCellMar>
           <w:left w:w="10" w:type="dxa"/>
@@ -107,6 +113,12 @@
         <w:gridCol w:w="2000"/>
       </w:tblGrid>
       <w:tr>
+        <w:tblPrEx>
+          <w:tblCellMar>
+            <w:top w:w="0" w:type="dxa"/>
+            <w:bottom w:w="0" w:type="dxa"/>
+          </w:tblCellMar>
+        </w:tblPrEx>
         <w:tc>
           <w:tcPr>
             <w:tcW w:w="1800" w:type="dxa"/>
@@ -199,7 +211,12 @@
           </w:tcPr>
           <w:p>
             <w:pPr>
-              <w:spacing w:line="259" w:lineRule="auto"/>
+              <w:pStyle w:val="Normal"/>
+              <w:suppressLineNumbers w:val="0"/>
+              <w:bidi w:val="0"/>
+              <w:spacing w:before="0" w:beforeAutospacing="off" w:after="0" w:afterAutospacing="off" w:line="259" w:lineRule="auto"/>
+              <w:ind w:left="0" w:right="0"/>
+              <w:jc w:val="left"/>
             </w:pPr>
             <w:r>
               <w:rPr>
@@ -244,969 +261,207 @@
     </w:p>
     <w:p>
       <w:pPr>
-        <w:spacing w:after="60" w:line="259" w:lineRule="auto"/>
-      </w:pPr>
-      <w:r>
-        <w:rPr>
-          <w:b/>
-          <w:bCs/>
+        <w:pStyle w:val="Normal"/>
+        <w:suppressLineNumbers w:val="0"/>
+        <w:spacing w:before="0" w:beforeAutospacing="off" w:after="0" w:afterAutospacing="off"/>
+        <w:jc w:val="left"/>
+      </w:pPr>
+      <w:r>
+        <w:rPr>
+          <w:b w:val="1"/>
+          <w:bCs w:val="1"/>
         </w:rPr>
         <w:t xml:space="preserve">Done: </w:t>
       </w:r>
       <w:r>
-        <w:t>Documented required fields for the team page</w:t>
-      </w:r>
-      <w:r>
-        <w:t>.</w:t>
+        <w:rPr>
+          <w:rFonts w:ascii="Calibri" w:hAnsi="Calibri" w:eastAsia="Calibri" w:cs="Calibri"/>
+          <w:noProof w:val="0"/>
+          <w:color w:val="000000" w:themeColor="text1" w:themeTint="FF" w:themeShade="FF"/>
+          <w:sz w:val="25"/>
+          <w:szCs w:val="25"/>
+          <w:lang w:val="en-AU"/>
+        </w:rPr>
+        <w:t>Wrote requirements document for team page and login styling.</w:t>
       </w:r>
       <w:r>
         <w:br/>
       </w:r>
       <w:r>
-        <w:t xml:space="preserve">Note: The login work is only for the styling no changes are made to the </w:t>
-      </w:r>
-      <w:r>
-        <w:t xml:space="preserve">existing </w:t>
-      </w:r>
-      <w:r>
-        <w:t>authentication login</w:t>
-      </w:r>
-      <w:r>
-        <w:t xml:space="preserve"> and session behaviour.</w:t>
-      </w:r>
-      <w:r>
-        <w:br/>
-      </w:r>
-      <w:r>
-        <w:rPr>
-          <w:color w:val="BF4E14" w:themeColor="accent2" w:themeShade="BF"/>
-        </w:rPr>
-        <w:t>Edge case and expected behaviour?</w:t>
-      </w:r>
-    </w:p>
-    <w:tbl>
-      <w:tblPr>
-        <w:tblStyle w:val="TableGrid"/>
-        <w:tblW w:w="0" w:type="auto"/>
-        <w:tblLook w:val="06A0" w:firstRow="1" w:lastRow="0" w:firstColumn="1" w:lastColumn="0" w:noHBand="1" w:noVBand="1"/>
-      </w:tblPr>
-      <w:tblGrid>
-        <w:gridCol w:w="3402"/>
-        <w:gridCol w:w="5948"/>
-      </w:tblGrid>
-      <w:tr>
-        <w:trPr>
-          <w:trHeight w:val="300"/>
-        </w:trPr>
-        <w:tc>
-          <w:tcPr>
-            <w:tcW w:w="3405" w:type="dxa"/>
-            <w:shd w:val="clear" w:color="auto" w:fill="FFC000"/>
-          </w:tcPr>
-          <w:p>
-            <w:r>
-              <w:t>Edge case</w:t>
-            </w:r>
-          </w:p>
-        </w:tc>
-        <w:tc>
-          <w:tcPr>
-            <w:tcW w:w="5955" w:type="dxa"/>
-            <w:shd w:val="clear" w:color="auto" w:fill="FFC000"/>
-          </w:tcPr>
-          <w:p>
-            <w:r>
-              <w:t>Expected Behaviour</w:t>
-            </w:r>
-          </w:p>
-        </w:tc>
-      </w:tr>
-      <w:tr>
-        <w:trPr>
-          <w:trHeight w:val="300"/>
-        </w:trPr>
-        <w:tc>
-          <w:tcPr>
-            <w:tcW w:w="3405" w:type="dxa"/>
-          </w:tcPr>
-          <w:p>
-            <w:r>
-              <w:t>User enters invalid credentials</w:t>
-            </w:r>
-          </w:p>
-        </w:tc>
-        <w:tc>
-          <w:tcPr>
-            <w:tcW w:w="5955" w:type="dxa"/>
-          </w:tcPr>
-          <w:p>
-            <w:r>
-              <w:t>Show error message this is existing behaviour but restyled with red text for better visibility.</w:t>
-            </w:r>
-          </w:p>
-        </w:tc>
-      </w:tr>
-      <w:tr>
-        <w:trPr>
-          <w:trHeight w:val="300"/>
-        </w:trPr>
-        <w:tc>
-          <w:tcPr>
-            <w:tcW w:w="3405" w:type="dxa"/>
-          </w:tcPr>
-          <w:p>
-            <w:r>
-              <w:t>User is logged in</w:t>
-            </w:r>
-          </w:p>
-        </w:tc>
-        <w:tc>
-          <w:tcPr>
-            <w:tcW w:w="5955" w:type="dxa"/>
-          </w:tcPr>
-          <w:p>
-            <w:r>
-              <w:t xml:space="preserve">Redirect directly to team page </w:t>
-            </w:r>
-            <w:r>
-              <w:t>(</w:t>
-            </w:r>
-            <w:r>
-              <w:t>existing behaviour</w:t>
-            </w:r>
-            <w:r>
-              <w:t>)</w:t>
-            </w:r>
-          </w:p>
-        </w:tc>
-      </w:tr>
-      <w:tr>
-        <w:trPr>
-          <w:trHeight w:val="300"/>
-        </w:trPr>
-        <w:tc>
-          <w:tcPr>
-            <w:tcW w:w="3405" w:type="dxa"/>
-          </w:tcPr>
-          <w:p>
-            <w:r>
-              <w:t>Member has no photo</w:t>
-            </w:r>
-          </w:p>
-        </w:tc>
-        <w:tc>
-          <w:tcPr>
-            <w:tcW w:w="5955" w:type="dxa"/>
-          </w:tcPr>
-          <w:p>
-            <w:r>
-              <w:t>Display placeholder avatar initials or the default icon</w:t>
-            </w:r>
-          </w:p>
-        </w:tc>
-      </w:tr>
-      <w:tr>
-        <w:trPr>
-          <w:trHeight w:val="300"/>
-        </w:trPr>
-        <w:tc>
-          <w:tcPr>
-            <w:tcW w:w="3405" w:type="dxa"/>
-          </w:tcPr>
-          <w:p>
-            <w:r>
-              <w:t xml:space="preserve">Member blurb exceeds 200 </w:t>
-            </w:r>
-            <w:proofErr w:type="gramStart"/>
-            <w:r>
-              <w:t>char</w:t>
-            </w:r>
-            <w:proofErr w:type="gramEnd"/>
-          </w:p>
-        </w:tc>
-        <w:tc>
-          <w:tcPr>
-            <w:tcW w:w="5955" w:type="dxa"/>
-          </w:tcPr>
-          <w:p>
-            <w:r>
-              <w:t>Truncate with ... or allow scrolling within the card</w:t>
-            </w:r>
-          </w:p>
-        </w:tc>
-      </w:tr>
-      <w:tr>
-        <w:trPr>
-          <w:trHeight w:val="300"/>
-        </w:trPr>
-        <w:tc>
-          <w:tcPr>
-            <w:tcW w:w="3405" w:type="dxa"/>
-          </w:tcPr>
-          <w:p>
-            <w:r>
-              <w:t>Member has no blurb</w:t>
-            </w:r>
-          </w:p>
-        </w:tc>
-        <w:tc>
-          <w:tcPr>
-            <w:tcW w:w="5955" w:type="dxa"/>
-          </w:tcPr>
-          <w:p>
-            <w:r>
-              <w:t>Display nothing in that space (no empty placeholder)</w:t>
-            </w:r>
-          </w:p>
-        </w:tc>
-      </w:tr>
-      <w:tr>
-        <w:trPr>
-          <w:trHeight w:val="300"/>
-        </w:trPr>
-        <w:tc>
-          <w:tcPr>
-            <w:tcW w:w="3405" w:type="dxa"/>
-          </w:tcPr>
-          <w:p>
-            <w:r>
-              <w:t>Team page has many members</w:t>
-            </w:r>
-          </w:p>
-        </w:tc>
-        <w:tc>
-          <w:tcPr>
-            <w:tcW w:w="5955" w:type="dxa"/>
-          </w:tcPr>
-          <w:p>
-            <w:r>
-              <w:t>Display is a responsive grid like 3 columns wrapping on desktop</w:t>
-            </w:r>
-          </w:p>
-        </w:tc>
-      </w:tr>
-      <w:tr>
-        <w:trPr>
-          <w:trHeight w:val="300"/>
-        </w:trPr>
-        <w:tc>
-          <w:tcPr>
-            <w:tcW w:w="3405" w:type="dxa"/>
-          </w:tcPr>
-          <w:p>
-            <w:r>
-              <w:t>User tried to access team page without login</w:t>
-            </w:r>
-          </w:p>
-        </w:tc>
-        <w:tc>
-          <w:tcPr>
-            <w:tcW w:w="5955" w:type="dxa"/>
-          </w:tcPr>
-          <w:p>
-            <w:r>
-              <w:t>Redirect to login page (existing behaviour)</w:t>
-            </w:r>
-          </w:p>
-        </w:tc>
-      </w:tr>
-    </w:tbl>
-    <w:p>
-      <w:pPr>
-        <w:spacing w:after="60" w:line="259" w:lineRule="auto"/>
-      </w:pPr>
-    </w:p>
-    <w:p>
-      <w:pPr>
-        <w:spacing w:after="60" w:line="259" w:lineRule="auto"/>
-        <w:rPr>
-          <w:color w:val="BF4E14" w:themeColor="accent2" w:themeShade="BF"/>
-        </w:rPr>
-      </w:pPr>
-      <w:r>
-        <w:rPr>
-          <w:color w:val="BF4E14" w:themeColor="accent2" w:themeShade="BF"/>
-        </w:rPr>
-        <w:t xml:space="preserve">Group 77, Reviewer </w:t>
-      </w:r>
-      <w:r>
-        <w:rPr>
-          <w:color w:val="BF4E14" w:themeColor="accent2" w:themeShade="BF"/>
-        </w:rPr>
-        <w:t>T</w:t>
-      </w:r>
-      <w:r>
-        <w:rPr>
-          <w:color w:val="BF4E14" w:themeColor="accent2" w:themeShade="BF"/>
-        </w:rPr>
-        <w:t xml:space="preserve">racking </w:t>
-      </w:r>
-      <w:r>
-        <w:rPr>
-          <w:color w:val="BF4E14" w:themeColor="accent2" w:themeShade="BF"/>
-        </w:rPr>
-        <w:t>E</w:t>
-      </w:r>
-      <w:r>
-        <w:rPr>
-          <w:color w:val="BF4E14" w:themeColor="accent2" w:themeShade="BF"/>
-        </w:rPr>
-        <w:t xml:space="preserve">valuation </w:t>
-      </w:r>
-      <w:proofErr w:type="gramStart"/>
-      <w:r>
-        <w:rPr>
-          <w:color w:val="BF4E14" w:themeColor="accent2" w:themeShade="BF"/>
-        </w:rPr>
-        <w:t>F</w:t>
-      </w:r>
-      <w:r>
-        <w:rPr>
-          <w:color w:val="BF4E14" w:themeColor="accent2" w:themeShade="BF"/>
-        </w:rPr>
-        <w:t>or</w:t>
-      </w:r>
-      <w:proofErr w:type="gramEnd"/>
-      <w:r>
-        <w:rPr>
-          <w:color w:val="BF4E14" w:themeColor="accent2" w:themeShade="BF"/>
-        </w:rPr>
-        <w:t xml:space="preserve"> PJS T</w:t>
-      </w:r>
-      <w:r>
-        <w:rPr>
-          <w:color w:val="BF4E14" w:themeColor="accent2" w:themeShade="BF"/>
-        </w:rPr>
-        <w:t>EAM A</w:t>
-      </w:r>
-    </w:p>
-    <w:p>
-      <w:pPr>
-        <w:spacing w:after="60" w:line="259" w:lineRule="auto"/>
-      </w:pPr>
-    </w:p>
-    <w:tbl>
-      <w:tblPr>
-        <w:tblStyle w:val="TableGrid"/>
-        <w:tblW w:w="0" w:type="auto"/>
-        <w:tblLook w:val="06A0" w:firstRow="1" w:lastRow="0" w:firstColumn="1" w:lastColumn="0" w:noHBand="1" w:noVBand="1"/>
-      </w:tblPr>
-      <w:tblGrid>
-        <w:gridCol w:w="1783"/>
-        <w:gridCol w:w="1723"/>
-        <w:gridCol w:w="3504"/>
-        <w:gridCol w:w="2340"/>
-      </w:tblGrid>
-      <w:tr>
-        <w:trPr>
-          <w:trHeight w:val="300"/>
-        </w:trPr>
-        <w:tc>
-          <w:tcPr>
-            <w:tcW w:w="1785" w:type="dxa"/>
-            <w:shd w:val="clear" w:color="auto" w:fill="FFC000"/>
-          </w:tcPr>
-          <w:p>
-            <w:r>
-              <w:t>Name</w:t>
-            </w:r>
-          </w:p>
-        </w:tc>
-        <w:tc>
-          <w:tcPr>
-            <w:tcW w:w="1725" w:type="dxa"/>
-            <w:shd w:val="clear" w:color="auto" w:fill="FFC000"/>
-          </w:tcPr>
-          <w:p>
-            <w:r>
-              <w:t>Role</w:t>
-            </w:r>
-          </w:p>
-        </w:tc>
-        <w:tc>
-          <w:tcPr>
-            <w:tcW w:w="3510" w:type="dxa"/>
-            <w:shd w:val="clear" w:color="auto" w:fill="FFC000"/>
-          </w:tcPr>
-          <w:p>
-            <w:r>
-              <w:t>Blurb</w:t>
-            </w:r>
-          </w:p>
-        </w:tc>
-        <w:tc>
-          <w:tcPr>
-            <w:tcW w:w="2340" w:type="dxa"/>
-            <w:shd w:val="clear" w:color="auto" w:fill="FFC000"/>
-          </w:tcPr>
-          <w:p>
-            <w:r>
-              <w:t>Photo</w:t>
-            </w:r>
-          </w:p>
-        </w:tc>
-      </w:tr>
-      <w:tr>
-        <w:trPr>
-          <w:trHeight w:val="300"/>
-        </w:trPr>
-        <w:tc>
-          <w:tcPr>
-            <w:tcW w:w="1785" w:type="dxa"/>
-          </w:tcPr>
-          <w:p>
-            <w:r>
-              <w:t>Connor Eyles</w:t>
-            </w:r>
-          </w:p>
-        </w:tc>
-        <w:tc>
-          <w:tcPr>
-            <w:tcW w:w="1725" w:type="dxa"/>
-          </w:tcPr>
-          <w:p>
-            <w:r>
-              <w:t>PM – Project Manager</w:t>
-            </w:r>
-          </w:p>
-        </w:tc>
-        <w:tc>
-          <w:tcPr>
-            <w:tcW w:w="3510" w:type="dxa"/>
-          </w:tcPr>
-          <w:p>
-            <w:r>
-              <w:t xml:space="preserve">As the project manager for group 77, I keep the team aligned with our goals and ensure we deliver on time. I </w:t>
-            </w:r>
-            <w:r>
-              <w:t>manage the backlog, facilitate meetings, and make sure everyone has what they need to succeed in the team.</w:t>
-            </w:r>
-          </w:p>
-        </w:tc>
-        <w:tc>
-          <w:tcPr>
-            <w:tcW w:w="2340" w:type="dxa"/>
-          </w:tcPr>
-          <w:p>
-            <w:r>
-              <w:rPr>
-                <w:noProof/>
-              </w:rPr>
-              <w:drawing>
-                <wp:inline distT="0" distB="0" distL="0" distR="0" wp14:anchorId="21418C1D" wp14:editId="521BA0CB">
-                  <wp:extent cx="1343025" cy="1343025"/>
-                  <wp:effectExtent l="0" t="0" r="0" b="0"/>
-                  <wp:docPr id="204865777" name="drawing"/>
-                  <wp:cNvGraphicFramePr>
-                    <a:graphicFrameLocks xmlns:a="http://schemas.openxmlformats.org/drawingml/2006/main" noChangeAspect="1"/>
-                  </wp:cNvGraphicFramePr>
-                  <a:graphic xmlns:a="http://schemas.openxmlformats.org/drawingml/2006/main">
-                    <a:graphicData uri="http://schemas.openxmlformats.org/drawingml/2006/picture">
-                      <pic:pic xmlns:pic="http://schemas.openxmlformats.org/drawingml/2006/picture">
-                        <pic:nvPicPr>
-                          <pic:cNvPr id="204865777" name="Picture 204865777"/>
-                          <pic:cNvPicPr/>
-                        </pic:nvPicPr>
-                        <pic:blipFill>
-                          <a:blip r:embed="rId10">
-                            <a:extLst>
-                              <a:ext uri="{28A0092B-C50C-407E-A947-70E740481C1C}">
-                                <a14:useLocalDpi xmlns:a14="http://schemas.microsoft.com/office/drawing/2010/main"/>
-                              </a:ext>
-                            </a:extLst>
-                          </a:blip>
-                          <a:stretch>
-                            <a:fillRect/>
-                          </a:stretch>
-                        </pic:blipFill>
-                        <pic:spPr>
-                          <a:xfrm>
-                            <a:off x="0" y="0"/>
-                            <a:ext cx="1343025" cy="1343025"/>
-                          </a:xfrm>
-                          <a:prstGeom prst="rect">
-                            <a:avLst/>
-                          </a:prstGeom>
-                        </pic:spPr>
-                      </pic:pic>
-                    </a:graphicData>
-                  </a:graphic>
-                </wp:inline>
-              </w:drawing>
-            </w:r>
-          </w:p>
-        </w:tc>
-      </w:tr>
-      <w:tr>
-        <w:trPr>
-          <w:trHeight w:val="300"/>
-        </w:trPr>
-        <w:tc>
-          <w:tcPr>
-            <w:tcW w:w="1785" w:type="dxa"/>
-          </w:tcPr>
-          <w:p>
-            <w:r>
-              <w:lastRenderedPageBreak/>
-              <w:t>Martel Kho</w:t>
-            </w:r>
-          </w:p>
-        </w:tc>
-        <w:tc>
-          <w:tcPr>
-            <w:tcW w:w="1725" w:type="dxa"/>
-          </w:tcPr>
-          <w:p>
-            <w:r>
-              <w:t>DEV 1</w:t>
-            </w:r>
-            <w:r>
-              <w:t xml:space="preserve"> - Developer</w:t>
-            </w:r>
-          </w:p>
-        </w:tc>
-        <w:tc>
-          <w:tcPr>
-            <w:tcW w:w="3510" w:type="dxa"/>
-          </w:tcPr>
-          <w:p>
-            <w:r>
-              <w:t xml:space="preserve">I’m a developer on group 77, responsible for building the frontend and </w:t>
-            </w:r>
-            <w:r>
-              <w:t>implementing features. I focus on writing clean, maintainable code and ensuring the app works seamlessly for the users.</w:t>
-            </w:r>
-            <w:r>
-              <w:br/>
-            </w:r>
-            <w:r>
-              <w:br/>
-            </w:r>
-            <w:r>
-              <w:t>I also help in backend tasks!</w:t>
-            </w:r>
-          </w:p>
-        </w:tc>
-        <w:tc>
-          <w:tcPr>
-            <w:tcW w:w="2340" w:type="dxa"/>
-          </w:tcPr>
-          <w:p>
-            <w:r>
-              <w:rPr>
-                <w:noProof/>
-              </w:rPr>
-              <w:drawing>
-                <wp:inline distT="0" distB="0" distL="0" distR="0" wp14:anchorId="63BF78D5" wp14:editId="2F8CACF0">
-                  <wp:extent cx="1343025" cy="1343025"/>
-                  <wp:effectExtent l="0" t="0" r="0" b="0"/>
-                  <wp:docPr id="1640380788" name="drawing"/>
-                  <wp:cNvGraphicFramePr>
-                    <a:graphicFrameLocks xmlns:a="http://schemas.openxmlformats.org/drawingml/2006/main" noChangeAspect="1"/>
-                  </wp:cNvGraphicFramePr>
-                  <a:graphic xmlns:a="http://schemas.openxmlformats.org/drawingml/2006/main">
-                    <a:graphicData uri="http://schemas.openxmlformats.org/drawingml/2006/picture">
-                      <pic:pic xmlns:pic="http://schemas.openxmlformats.org/drawingml/2006/picture">
-                        <pic:nvPicPr>
-                          <pic:cNvPr id="204865777" name="Picture 204865777"/>
-                          <pic:cNvPicPr/>
-                        </pic:nvPicPr>
-                        <pic:blipFill>
-                          <a:blip r:embed="rId10">
-                            <a:extLst>
-                              <a:ext uri="{28A0092B-C50C-407E-A947-70E740481C1C}">
-                                <a14:useLocalDpi xmlns:a14="http://schemas.microsoft.com/office/drawing/2010/main"/>
-                              </a:ext>
-                            </a:extLst>
-                          </a:blip>
-                          <a:stretch>
-                            <a:fillRect/>
-                          </a:stretch>
-                        </pic:blipFill>
-                        <pic:spPr>
-                          <a:xfrm>
-                            <a:off x="0" y="0"/>
-                            <a:ext cx="1343025" cy="1343025"/>
-                          </a:xfrm>
-                          <a:prstGeom prst="rect">
-                            <a:avLst/>
-                          </a:prstGeom>
-                        </pic:spPr>
-                      </pic:pic>
-                    </a:graphicData>
-                  </a:graphic>
-                </wp:inline>
-              </w:drawing>
-            </w:r>
-          </w:p>
-        </w:tc>
-      </w:tr>
-      <w:tr>
-        <w:trPr>
-          <w:trHeight w:val="300"/>
-        </w:trPr>
-        <w:tc>
-          <w:tcPr>
-            <w:tcW w:w="1785" w:type="dxa"/>
-          </w:tcPr>
-          <w:p>
-            <w:r>
-              <w:t>Pasang Lhamu Sherpa</w:t>
-            </w:r>
-          </w:p>
-        </w:tc>
-        <w:tc>
-          <w:tcPr>
-            <w:tcW w:w="1725" w:type="dxa"/>
-          </w:tcPr>
-          <w:p>
-            <w:r>
-              <w:t>DEV 2</w:t>
-            </w:r>
-            <w:r>
-              <w:t xml:space="preserve"> - Developer</w:t>
-            </w:r>
-          </w:p>
-        </w:tc>
-        <w:tc>
-          <w:tcPr>
-            <w:tcW w:w="3510" w:type="dxa"/>
-          </w:tcPr>
-          <w:p>
-            <w:r>
-              <w:t xml:space="preserve">I'm a </w:t>
-            </w:r>
-            <w:r>
-              <w:t>d</w:t>
-            </w:r>
-            <w:r>
-              <w:t xml:space="preserve">eveloper on </w:t>
-            </w:r>
-            <w:r>
-              <w:t>g</w:t>
-            </w:r>
-            <w:r>
-              <w:t>roup 77, working on both frontend and backend tasks. I'm passionate about solving technical challenges and making sure our code is robust and well tested.</w:t>
-            </w:r>
-          </w:p>
-        </w:tc>
-        <w:tc>
-          <w:tcPr>
-            <w:tcW w:w="2340" w:type="dxa"/>
-          </w:tcPr>
-          <w:p>
-            <w:r>
-              <w:rPr>
-                <w:noProof/>
-              </w:rPr>
-              <w:drawing>
-                <wp:inline distT="0" distB="0" distL="0" distR="0" wp14:anchorId="53F43B4B" wp14:editId="21DDE93C">
-                  <wp:extent cx="1343025" cy="1343025"/>
-                  <wp:effectExtent l="0" t="0" r="0" b="0"/>
-                  <wp:docPr id="482947374" name="drawing"/>
-                  <wp:cNvGraphicFramePr>
-                    <a:graphicFrameLocks xmlns:a="http://schemas.openxmlformats.org/drawingml/2006/main" noChangeAspect="1"/>
-                  </wp:cNvGraphicFramePr>
-                  <a:graphic xmlns:a="http://schemas.openxmlformats.org/drawingml/2006/main">
-                    <a:graphicData uri="http://schemas.openxmlformats.org/drawingml/2006/picture">
-                      <pic:pic xmlns:pic="http://schemas.openxmlformats.org/drawingml/2006/picture">
-                        <pic:nvPicPr>
-                          <pic:cNvPr id="482947374" name="Picture 482947374"/>
-                          <pic:cNvPicPr/>
-                        </pic:nvPicPr>
-                        <pic:blipFill>
-                          <a:blip r:embed="rId11">
-                            <a:extLst>
-                              <a:ext uri="{28A0092B-C50C-407E-A947-70E740481C1C}">
-                                <a14:useLocalDpi xmlns:a14="http://schemas.microsoft.com/office/drawing/2010/main"/>
-                              </a:ext>
-                            </a:extLst>
-                          </a:blip>
-                          <a:stretch>
-                            <a:fillRect/>
-                          </a:stretch>
-                        </pic:blipFill>
-                        <pic:spPr>
-                          <a:xfrm>
-                            <a:off x="0" y="0"/>
-                            <a:ext cx="1343025" cy="1343025"/>
-                          </a:xfrm>
-                          <a:prstGeom prst="rect">
-                            <a:avLst/>
-                          </a:prstGeom>
-                        </pic:spPr>
-                      </pic:pic>
-                    </a:graphicData>
-                  </a:graphic>
-                </wp:inline>
-              </w:drawing>
-            </w:r>
-          </w:p>
-        </w:tc>
-      </w:tr>
-      <w:tr>
-        <w:trPr>
-          <w:trHeight w:val="300"/>
-        </w:trPr>
-        <w:tc>
-          <w:tcPr>
-            <w:tcW w:w="1785" w:type="dxa"/>
-          </w:tcPr>
-          <w:p>
-            <w:r>
-              <w:t>Mahin Mubashir Islam</w:t>
-            </w:r>
-          </w:p>
-        </w:tc>
-        <w:tc>
-          <w:tcPr>
-            <w:tcW w:w="1725" w:type="dxa"/>
-          </w:tcPr>
-          <w:p>
-            <w:r>
-              <w:t>UX</w:t>
-            </w:r>
-            <w:r>
-              <w:t xml:space="preserve"> - Designer</w:t>
-            </w:r>
-          </w:p>
-        </w:tc>
-        <w:tc>
-          <w:tcPr>
-            <w:tcW w:w="3510" w:type="dxa"/>
-          </w:tcPr>
-          <w:p>
-            <w:r>
-              <w:t>As the UX designer for group 77, I create intuitive and visually appealing designs that enhance the user experience. I translate requirements into mockups and ensure our interface is both functional and beautiful.</w:t>
-            </w:r>
-          </w:p>
-        </w:tc>
-        <w:tc>
-          <w:tcPr>
-            <w:tcW w:w="2340" w:type="dxa"/>
-          </w:tcPr>
-          <w:p>
-            <w:r>
-              <w:rPr>
-                <w:noProof/>
-              </w:rPr>
-              <w:drawing>
-                <wp:inline distT="0" distB="0" distL="0" distR="0" wp14:anchorId="1FEB0AA0" wp14:editId="7D9289E2">
-                  <wp:extent cx="1343025" cy="1343025"/>
-                  <wp:effectExtent l="0" t="0" r="0" b="0"/>
-                  <wp:docPr id="1581597423" name="drawing"/>
-                  <wp:cNvGraphicFramePr>
-                    <a:graphicFrameLocks xmlns:a="http://schemas.openxmlformats.org/drawingml/2006/main" noChangeAspect="1"/>
-                  </wp:cNvGraphicFramePr>
-                  <a:graphic xmlns:a="http://schemas.openxmlformats.org/drawingml/2006/main">
-                    <a:graphicData uri="http://schemas.openxmlformats.org/drawingml/2006/picture">
-                      <pic:pic xmlns:pic="http://schemas.openxmlformats.org/drawingml/2006/picture">
-                        <pic:nvPicPr>
-                          <pic:cNvPr id="204865777" name="Picture 204865777"/>
-                          <pic:cNvPicPr/>
-                        </pic:nvPicPr>
-                        <pic:blipFill>
-                          <a:blip r:embed="rId10">
-                            <a:extLst>
-                              <a:ext uri="{28A0092B-C50C-407E-A947-70E740481C1C}">
-                                <a14:useLocalDpi xmlns:a14="http://schemas.microsoft.com/office/drawing/2010/main"/>
-                              </a:ext>
-                            </a:extLst>
-                          </a:blip>
-                          <a:stretch>
-                            <a:fillRect/>
-                          </a:stretch>
-                        </pic:blipFill>
-                        <pic:spPr>
-                          <a:xfrm>
-                            <a:off x="0" y="0"/>
-                            <a:ext cx="1343025" cy="1343025"/>
-                          </a:xfrm>
-                          <a:prstGeom prst="rect">
-                            <a:avLst/>
-                          </a:prstGeom>
-                        </pic:spPr>
-                      </pic:pic>
-                    </a:graphicData>
-                  </a:graphic>
-                </wp:inline>
-              </w:drawing>
-            </w:r>
-          </w:p>
-        </w:tc>
-      </w:tr>
-      <w:tr>
-        <w:trPr>
-          <w:trHeight w:val="300"/>
-        </w:trPr>
-        <w:tc>
-          <w:tcPr>
-            <w:tcW w:w="1785" w:type="dxa"/>
-          </w:tcPr>
-          <w:p>
-            <w:r>
-              <w:t>Jahan Haidari</w:t>
-            </w:r>
-          </w:p>
-        </w:tc>
-        <w:tc>
-          <w:tcPr>
-            <w:tcW w:w="1725" w:type="dxa"/>
-          </w:tcPr>
-          <w:p>
-            <w:r>
-              <w:t>BA – Business Analyst</w:t>
-            </w:r>
-          </w:p>
-        </w:tc>
-        <w:tc>
-          <w:tcPr>
-            <w:tcW w:w="3510" w:type="dxa"/>
-          </w:tcPr>
-          <w:p>
-            <w:r>
-              <w:t>I'm the business analyst for group 77, responsible for gathering requirements, documenting specifications, and bridging the gap between the client and our development team. I ensure we deliver exactly what the client needs.</w:t>
-            </w:r>
-          </w:p>
-        </w:tc>
-        <w:tc>
-          <w:tcPr>
-            <w:tcW w:w="2340" w:type="dxa"/>
-          </w:tcPr>
-          <w:p>
-            <w:r>
-              <w:rPr>
-                <w:noProof/>
-              </w:rPr>
-              <w:drawing>
-                <wp:inline distT="0" distB="0" distL="0" distR="0" wp14:anchorId="1ABE708F" wp14:editId="336AEAA0">
-                  <wp:extent cx="1343025" cy="1343025"/>
-                  <wp:effectExtent l="0" t="0" r="0" b="0"/>
-                  <wp:docPr id="1670617276" name="drawing"/>
-                  <wp:cNvGraphicFramePr>
-                    <a:graphicFrameLocks xmlns:a="http://schemas.openxmlformats.org/drawingml/2006/main" noChangeAspect="1"/>
-                  </wp:cNvGraphicFramePr>
-                  <a:graphic xmlns:a="http://schemas.openxmlformats.org/drawingml/2006/main">
-                    <a:graphicData uri="http://schemas.openxmlformats.org/drawingml/2006/picture">
-                      <pic:pic xmlns:pic="http://schemas.openxmlformats.org/drawingml/2006/picture">
-                        <pic:nvPicPr>
-                          <pic:cNvPr id="204865777" name="Picture 204865777"/>
-                          <pic:cNvPicPr/>
-                        </pic:nvPicPr>
-                        <pic:blipFill>
-                          <a:blip r:embed="rId10">
-                            <a:extLst>
-                              <a:ext uri="{28A0092B-C50C-407E-A947-70E740481C1C}">
-                                <a14:useLocalDpi xmlns:a14="http://schemas.microsoft.com/office/drawing/2010/main"/>
-                              </a:ext>
-                            </a:extLst>
-                          </a:blip>
-                          <a:stretch>
-                            <a:fillRect/>
-                          </a:stretch>
-                        </pic:blipFill>
-                        <pic:spPr>
-                          <a:xfrm>
-                            <a:off x="0" y="0"/>
-                            <a:ext cx="1343025" cy="1343025"/>
-                          </a:xfrm>
-                          <a:prstGeom prst="rect">
-                            <a:avLst/>
-                          </a:prstGeom>
-                        </pic:spPr>
-                      </pic:pic>
-                    </a:graphicData>
-                  </a:graphic>
-                </wp:inline>
-              </w:drawing>
-            </w:r>
-          </w:p>
-        </w:tc>
-      </w:tr>
-    </w:tbl>
-    <w:p>
-      <w:pPr>
-        <w:spacing w:after="60" w:line="259" w:lineRule="auto"/>
-      </w:pPr>
-    </w:p>
-    <w:p>
-      <w:pPr>
-        <w:spacing w:after="60" w:line="259" w:lineRule="auto"/>
-      </w:pPr>
-      <w:r>
-        <w:rPr>
-          <w:b/>
-          <w:bCs/>
+        <w:rPr>
+          <w:rFonts w:ascii="Calibri" w:hAnsi="Calibri" w:eastAsia="Calibri" w:cs="Calibri"/>
+          <w:noProof w:val="0"/>
+          <w:color w:val="000000" w:themeColor="text1" w:themeTint="FF" w:themeShade="FF"/>
+          <w:sz w:val="25"/>
+          <w:szCs w:val="25"/>
+          <w:lang w:val="en-AU"/>
+        </w:rPr>
+        <w:t>Includes required fields, validation rules, edge cases, and user flow.</w:t>
+      </w:r>
+      <w:r>
+        <w:rPr/>
+        <w:t xml:space="preserve"> </w:t>
+      </w:r>
+    </w:p>
+    <w:p>
+      <w:pPr>
+        <w:pStyle w:val="Normal"/>
+        <w:suppressLineNumbers w:val="0"/>
+        <w:spacing w:before="0" w:beforeAutospacing="off" w:after="60" w:afterAutospacing="off" w:line="259" w:lineRule="auto"/>
+        <w:ind w:left="0" w:right="0"/>
+        <w:jc w:val="left"/>
+      </w:pPr>
+    </w:p>
+    <w:p>
+      <w:pPr>
+        <w:pStyle w:val="Normal"/>
+        <w:suppressLineNumbers w:val="0"/>
+        <w:bidi w:val="0"/>
+        <w:spacing w:before="0" w:beforeAutospacing="off" w:after="0" w:afterAutospacing="off" w:line="259" w:lineRule="auto"/>
+        <w:ind/>
+        <w:jc w:val="left"/>
+      </w:pPr>
+      <w:r>
+        <w:rPr>
+          <w:b w:val="1"/>
+          <w:bCs w:val="1"/>
         </w:rPr>
         <w:t xml:space="preserve">Deliverable: </w:t>
       </w:r>
-      <w:r>
-        <w:t xml:space="preserve">Mock sprint requirements group 77 Loop workspace document </w:t>
-      </w:r>
-      <w:r>
-        <w:t>committed to team repo under /doc branch</w:t>
-      </w:r>
-      <w:r>
-        <w:t>.</w:t>
-      </w:r>
-    </w:p>
-    <w:p>
-      <w:pPr>
-        <w:spacing w:after="140"/>
-      </w:pPr>
-      <w:r>
-        <w:rPr>
-          <w:b/>
-          <w:bCs/>
-        </w:rPr>
-        <w:t xml:space="preserve">Note for next role: </w:t>
-      </w:r>
-      <w:r>
-        <w:t xml:space="preserve">UX designer </w:t>
-      </w:r>
-      <w:proofErr w:type="gramStart"/>
-      <w:r>
-        <w:t>use</w:t>
-      </w:r>
-      <w:proofErr w:type="gramEnd"/>
-      <w:r>
-        <w:t xml:space="preserve"> these requirements to design the login page and team page mockups. Requirements are marked "styling only" for the login page do not change validation or authentication logic.</w:t>
-      </w:r>
-    </w:p>
-    <w:p>
-      <w:pPr>
-        <w:spacing w:after="260"/>
-        <w:rPr>
-          <w:b/>
-          <w:bCs/>
-          <w:color w:val="000000" w:themeColor="text1"/>
-        </w:rPr>
-      </w:pPr>
-      <w:r>
-        <w:rPr>
-          <w:b/>
-          <w:bCs/>
-          <w:color w:val="000000" w:themeColor="text1"/>
-        </w:rPr>
-        <w:t xml:space="preserve">Git URL: </w:t>
-      </w:r>
-      <w:hyperlink r:id="rId12" w:history="1">
+      <w:hyperlink r:id="R95dd413ddb164ea7">
         <w:r>
           <w:rPr>
             <w:rStyle w:val="Hyperlink"/>
-            <w:b/>
-            <w:bCs/>
+            <w:rFonts w:ascii="Calibri" w:hAnsi="Calibri" w:eastAsia="Calibri" w:cs="Calibri"/>
+            <w:noProof w:val="0"/>
+            <w:color w:val="000000" w:themeColor="text1" w:themeTint="FF" w:themeShade="FF"/>
+            <w:sz w:val="25"/>
+            <w:szCs w:val="25"/>
+            <w:lang w:val="en-AU"/>
           </w:rPr>
           <w:t>https://github.com/connor9838/task2-garage-boilerplate-basic/blob/docs/G77%20Team%20A%20Mock%20PRD.pdf</w:t>
         </w:r>
       </w:hyperlink>
+      <w:r>
+        <w:rPr>
+          <w:rFonts w:ascii="Calibri" w:hAnsi="Calibri" w:eastAsia="Calibri" w:cs="Calibri"/>
+          <w:noProof w:val="0"/>
+          <w:color w:val="000000" w:themeColor="text1" w:themeTint="FF" w:themeShade="FF"/>
+          <w:sz w:val="25"/>
+          <w:szCs w:val="25"/>
+          <w:lang w:val="en-AU"/>
+        </w:rPr>
+        <w:t xml:space="preserve"> In GitHub Repository under /docs branch</w:t>
+      </w:r>
+    </w:p>
+    <w:p>
+      <w:pPr>
+        <w:pStyle w:val="Normal"/>
+        <w:suppressLineNumbers w:val="0"/>
+        <w:bidi w:val="0"/>
+        <w:spacing w:before="0" w:beforeAutospacing="off" w:after="0" w:afterAutospacing="off"/>
+        <w:jc w:val="left"/>
+        <w:rPr>
+          <w:rFonts w:ascii="Calibri" w:hAnsi="Calibri" w:eastAsia="Calibri" w:cs="Calibri"/>
+          <w:noProof w:val="0"/>
+          <w:color w:val="000000" w:themeColor="text1" w:themeTint="FF" w:themeShade="FF"/>
+          <w:sz w:val="25"/>
+          <w:szCs w:val="25"/>
+          <w:lang w:val="en-AU"/>
+        </w:rPr>
+      </w:pPr>
+    </w:p>
+    <w:p>
+      <w:pPr>
+        <w:spacing w:after="140"/>
+      </w:pPr>
+      <w:r>
+        <w:rPr>
+          <w:b w:val="1"/>
+          <w:bCs w:val="1"/>
+        </w:rPr>
+        <w:t xml:space="preserve">Note for next role: </w:t>
+      </w:r>
+      <w:r>
+        <w:rPr>
+          <w:b w:val="0"/>
+          <w:bCs w:val="0"/>
+        </w:rPr>
+        <w:t xml:space="preserve">UX designer </w:t>
+      </w:r>
+      <w:r>
+        <w:rPr>
+          <w:b w:val="0"/>
+          <w:bCs w:val="0"/>
+        </w:rPr>
+        <w:t>use</w:t>
+      </w:r>
+      <w:r>
+        <w:rPr>
+          <w:b w:val="0"/>
+          <w:bCs w:val="0"/>
+        </w:rPr>
+        <w:t xml:space="preserve"> these requirements to design the login page and team page </w:t>
+      </w:r>
+      <w:r>
+        <w:rPr>
+          <w:b w:val="0"/>
+          <w:bCs w:val="0"/>
+        </w:rPr>
+        <w:t>mockups</w:t>
+      </w:r>
+      <w:r>
+        <w:rPr>
+          <w:b w:val="0"/>
+          <w:bCs w:val="0"/>
+        </w:rPr>
+        <w:t>. Requirements are marked "styling only" for the login page do not change validation or authentication logic.</w:t>
+      </w:r>
+    </w:p>
+    <w:p>
+      <w:pPr>
+        <w:spacing w:before="0" w:beforeAutospacing="off" w:after="0" w:afterAutospacing="off"/>
+      </w:pPr>
+      <w:r>
+        <w:rPr>
+          <w:b w:val="1"/>
+          <w:bCs w:val="1"/>
+        </w:rPr>
+        <w:t>Assumptions:</w:t>
+      </w:r>
+      <w:r>
+        <w:rPr/>
+        <w:t xml:space="preserve"> </w:t>
+      </w:r>
+      <w:r>
+        <w:rPr>
+          <w:rFonts w:ascii="Calibri" w:hAnsi="Calibri" w:eastAsia="Calibri" w:cs="Calibri"/>
+          <w:noProof w:val="0"/>
+          <w:color w:val="000000" w:themeColor="text1" w:themeTint="FF" w:themeShade="FF"/>
+          <w:sz w:val="25"/>
+          <w:szCs w:val="25"/>
+          <w:lang w:val="en-AU"/>
+        </w:rPr>
+        <w:t>Team photos are optional placeholders will be used if missing.</w:t>
+      </w:r>
+      <w:r>
+        <w:br/>
+      </w:r>
+      <w:r>
+        <w:rPr>
+          <w:rFonts w:ascii="Calibri" w:hAnsi="Calibri" w:eastAsia="Calibri" w:cs="Calibri"/>
+          <w:noProof w:val="0"/>
+          <w:color w:val="000000" w:themeColor="text1" w:themeTint="FF" w:themeShade="FF"/>
+          <w:sz w:val="25"/>
+          <w:szCs w:val="25"/>
+          <w:lang w:val="en-AU"/>
+        </w:rPr>
+        <w:t>Blurbs are max 200 characters.</w:t>
+      </w:r>
     </w:p>
     <w:p>
       <w:pPr>
         <w:spacing w:after="260"/>
-        <w:rPr>
-          <w:color w:val="000000" w:themeColor="text1"/>
-        </w:rPr>
       </w:pPr>
     </w:p>
     <w:p>
@@ -1215,19 +470,22 @@
         <w:spacing w:before="320" w:after="140"/>
       </w:pPr>
       <w:r>
-        <w:t>[Login Restyling Bootstrap] Task 2 — Design Login Style &amp; Team Page Layout</w:t>
+        <w:t xml:space="preserve">[Login Restyling Bootstrap] </w:t>
+      </w:r>
+      <w:r>
+        <w:t>Task 2 — Design Login Style &amp; Team Page Layout</w:t>
       </w:r>
     </w:p>
     <w:tbl>
       <w:tblPr>
         <w:tblW w:w="9000" w:type="dxa"/>
         <w:tblBorders>
-          <w:top w:val="single" w:sz="4" w:space="0" w:color="auto"/>
-          <w:left w:val="single" w:sz="4" w:space="0" w:color="auto"/>
-          <w:bottom w:val="single" w:sz="4" w:space="0" w:color="auto"/>
-          <w:right w:val="single" w:sz="4" w:space="0" w:color="auto"/>
-          <w:insideH w:val="single" w:sz="4" w:space="0" w:color="auto"/>
-          <w:insideV w:val="single" w:sz="4" w:space="0" w:color="auto"/>
+          <w:top w:val="single" w:color="auto" w:sz="4" w:space="0"/>
+          <w:left w:val="single" w:color="auto" w:sz="4" w:space="0"/>
+          <w:bottom w:val="single" w:color="auto" w:sz="4" w:space="0"/>
+          <w:right w:val="single" w:color="auto" w:sz="4" w:space="0"/>
+          <w:insideH w:val="single" w:color="auto" w:sz="4" w:space="0"/>
+          <w:insideV w:val="single" w:color="auto" w:sz="4" w:space="0"/>
         </w:tblBorders>
         <w:tblCellMar>
           <w:left w:w="10" w:type="dxa"/>
@@ -1242,6 +500,12 @@
         <w:gridCol w:w="2000"/>
       </w:tblGrid>
       <w:tr>
+        <w:tblPrEx>
+          <w:tblCellMar>
+            <w:top w:w="0" w:type="dxa"/>
+            <w:bottom w:w="0" w:type="dxa"/>
+          </w:tblCellMar>
+        </w:tblPrEx>
         <w:tc>
           <w:tcPr>
             <w:tcW w:w="1800" w:type="dxa"/>
@@ -1261,7 +525,6 @@
                 <w:bCs/>
                 <w:color w:val="1E2761"/>
               </w:rPr>
-              <w:lastRenderedPageBreak/>
               <w:t>Role</w:t>
             </w:r>
           </w:p>
@@ -1430,7 +693,7 @@
                     </pic:cNvPicPr>
                   </pic:nvPicPr>
                   <pic:blipFill>
-                    <a:blip r:embed="rId13">
+                    <a:blip r:embed="rId7">
                       <a:extLst>
                         <a:ext uri="{28A0092B-C50C-407E-A947-70E740481C1C}">
                           <a14:useLocalDpi xmlns:a14="http://schemas.microsoft.com/office/drawing/2010/main" val="0"/>
@@ -1473,19 +736,22 @@
         <w:spacing w:before="320" w:after="140"/>
       </w:pPr>
       <w:r>
-        <w:t>[Login Restyling Bootstrap] Task 3 — Validate Design Against Requirements</w:t>
+        <w:t xml:space="preserve">[Login Restyling Bootstrap] </w:t>
+      </w:r>
+      <w:r>
+        <w:t>Task 3 — Validate Design Against Requirements</w:t>
       </w:r>
     </w:p>
     <w:tbl>
       <w:tblPr>
         <w:tblW w:w="9000" w:type="dxa"/>
         <w:tblBorders>
-          <w:top w:val="single" w:sz="4" w:space="0" w:color="auto"/>
-          <w:left w:val="single" w:sz="4" w:space="0" w:color="auto"/>
-          <w:bottom w:val="single" w:sz="4" w:space="0" w:color="auto"/>
-          <w:right w:val="single" w:sz="4" w:space="0" w:color="auto"/>
-          <w:insideH w:val="single" w:sz="4" w:space="0" w:color="auto"/>
-          <w:insideV w:val="single" w:sz="4" w:space="0" w:color="auto"/>
+          <w:top w:val="single" w:color="auto" w:sz="4" w:space="0"/>
+          <w:left w:val="single" w:color="auto" w:sz="4" w:space="0"/>
+          <w:bottom w:val="single" w:color="auto" w:sz="4" w:space="0"/>
+          <w:right w:val="single" w:color="auto" w:sz="4" w:space="0"/>
+          <w:insideH w:val="single" w:color="auto" w:sz="4" w:space="0"/>
+          <w:insideV w:val="single" w:color="auto" w:sz="4" w:space="0"/>
         </w:tblBorders>
         <w:tblCellMar>
           <w:left w:w="10" w:type="dxa"/>
@@ -1500,6 +766,12 @@
         <w:gridCol w:w="2000"/>
       </w:tblGrid>
       <w:tr>
+        <w:tblPrEx>
+          <w:tblCellMar>
+            <w:top w:w="0" w:type="dxa"/>
+            <w:bottom w:w="0" w:type="dxa"/>
+          </w:tblCellMar>
+        </w:tblPrEx>
         <w:tc>
           <w:tcPr>
             <w:tcW w:w="1800" w:type="dxa"/>
@@ -1672,7 +944,7 @@
       </w:r>
       <w:r>
         <w:rPr>
-          <w:rFonts w:ascii="Consolas" w:eastAsia="Consolas" w:hAnsi="Consolas" w:cs="Consolas"/>
+          <w:rFonts w:ascii="Consolas" w:hAnsi="Consolas" w:eastAsia="Consolas" w:cs="Consolas"/>
           <w:color w:val="8FD3D6"/>
         </w:rPr>
         <w:t>https://github.com/team-byte-size/team-page/blob/main/docs/design-validation.md</w:t>
@@ -1689,20 +961,22 @@
         <w:spacing w:before="320" w:after="140"/>
       </w:pPr>
       <w:r>
-        <w:lastRenderedPageBreak/>
-        <w:t>[Login Restyling Bootstrap] Task 4 — Style Login Page</w:t>
+        <w:t xml:space="preserve">[Login Restyling Bootstrap] </w:t>
+      </w:r>
+      <w:r>
+        <w:t>Task 4 — Style Login Page</w:t>
       </w:r>
     </w:p>
     <w:tbl>
       <w:tblPr>
         <w:tblW w:w="9000" w:type="dxa"/>
         <w:tblBorders>
-          <w:top w:val="single" w:sz="4" w:space="0" w:color="auto"/>
-          <w:left w:val="single" w:sz="4" w:space="0" w:color="auto"/>
-          <w:bottom w:val="single" w:sz="4" w:space="0" w:color="auto"/>
-          <w:right w:val="single" w:sz="4" w:space="0" w:color="auto"/>
-          <w:insideH w:val="single" w:sz="4" w:space="0" w:color="auto"/>
-          <w:insideV w:val="single" w:sz="4" w:space="0" w:color="auto"/>
+          <w:top w:val="single" w:color="auto" w:sz="4" w:space="0"/>
+          <w:left w:val="single" w:color="auto" w:sz="4" w:space="0"/>
+          <w:bottom w:val="single" w:color="auto" w:sz="4" w:space="0"/>
+          <w:right w:val="single" w:color="auto" w:sz="4" w:space="0"/>
+          <w:insideH w:val="single" w:color="auto" w:sz="4" w:space="0"/>
+          <w:insideV w:val="single" w:color="auto" w:sz="4" w:space="0"/>
         </w:tblBorders>
         <w:tblCellMar>
           <w:left w:w="10" w:type="dxa"/>
@@ -1717,6 +991,12 @@
         <w:gridCol w:w="2000"/>
       </w:tblGrid>
       <w:tr>
+        <w:tblPrEx>
+          <w:tblCellMar>
+            <w:top w:w="0" w:type="dxa"/>
+            <w:bottom w:w="0" w:type="dxa"/>
+          </w:tblCellMar>
+        </w:tblPrEx>
         <w:tc>
           <w:tcPr>
             <w:tcW w:w="1800" w:type="dxa"/>
@@ -1879,7 +1159,7 @@
         <w:spacing w:after="120"/>
         <w:ind w:left="100" w:right="100"/>
         <w:rPr>
-          <w:rFonts w:ascii="Consolas" w:eastAsia="Consolas" w:hAnsi="Consolas" w:cs="Consolas"/>
+          <w:rFonts w:ascii="Consolas" w:hAnsi="Consolas" w:eastAsia="Consolas" w:cs="Consolas"/>
           <w:color w:val="8FD3D6"/>
         </w:rPr>
       </w:pPr>
@@ -1891,11 +1171,11 @@
         </w:rPr>
         <w:t xml:space="preserve">Git URL (commit):  </w:t>
       </w:r>
-      <w:hyperlink r:id="rId14" w:history="1">
+      <w:hyperlink w:history="1" r:id="rId8">
         <w:r>
           <w:rPr>
             <w:rStyle w:val="Hyperlink"/>
-            <w:rFonts w:ascii="Consolas" w:eastAsia="Consolas" w:hAnsi="Consolas" w:cs="Consolas"/>
+            <w:rFonts w:ascii="Consolas" w:hAnsi="Consolas" w:eastAsia="Consolas" w:cs="Consolas"/>
           </w:rPr>
           <w:t>https://github.com/team-byte-size/team-page/commit/4a1c9e2</w:t>
         </w:r>
@@ -1911,7 +1191,7 @@
     <w:p>
       <w:pPr>
         <w:rPr>
-          <w:rFonts w:ascii="Times New Roman" w:eastAsia="Times New Roman" w:hAnsi="Times New Roman" w:cs="Times New Roman"/>
+          <w:rFonts w:ascii="Times New Roman" w:hAnsi="Times New Roman" w:eastAsia="Times New Roman" w:cs="Times New Roman"/>
           <w:sz w:val="24"/>
           <w:szCs w:val="24"/>
         </w:rPr>
@@ -1936,7 +1216,7 @@
       </w:pPr>
       <w:r>
         <w:rPr>
-          <w:rFonts w:ascii="Times New Roman" w:eastAsia="Times New Roman" w:hAnsi="Times New Roman" w:cs="Times New Roman"/>
+          <w:rFonts w:ascii="Times New Roman" w:hAnsi="Times New Roman" w:eastAsia="Times New Roman" w:cs="Times New Roman"/>
           <w:noProof/>
           <w:sz w:val="24"/>
           <w:szCs w:val="24"/>
@@ -1959,7 +1239,7 @@
                     </pic:cNvPicPr>
                   </pic:nvPicPr>
                   <pic:blipFill>
-                    <a:blip r:embed="rId15">
+                    <a:blip r:embed="rId9">
                       <a:extLst>
                         <a:ext uri="{28A0092B-C50C-407E-A947-70E740481C1C}">
                           <a14:useLocalDpi xmlns:a14="http://schemas.microsoft.com/office/drawing/2010/main" val="0"/>
@@ -2002,19 +1282,22 @@
         <w:spacing w:before="320" w:after="140"/>
       </w:pPr>
       <w:r>
-        <w:t>[Login Restyling Bootstrap] Task 5 — Build Team Page &amp; Auth Redirect</w:t>
+        <w:t xml:space="preserve">[Login Restyling Bootstrap] </w:t>
+      </w:r>
+      <w:r>
+        <w:t>Task 5 — Build Team Page &amp; Auth Redirect</w:t>
       </w:r>
     </w:p>
     <w:tbl>
       <w:tblPr>
         <w:tblW w:w="9000" w:type="dxa"/>
         <w:tblBorders>
-          <w:top w:val="single" w:sz="4" w:space="0" w:color="auto"/>
-          <w:left w:val="single" w:sz="4" w:space="0" w:color="auto"/>
-          <w:bottom w:val="single" w:sz="4" w:space="0" w:color="auto"/>
-          <w:right w:val="single" w:sz="4" w:space="0" w:color="auto"/>
-          <w:insideH w:val="single" w:sz="4" w:space="0" w:color="auto"/>
-          <w:insideV w:val="single" w:sz="4" w:space="0" w:color="auto"/>
+          <w:top w:val="single" w:color="auto" w:sz="4" w:space="0"/>
+          <w:left w:val="single" w:color="auto" w:sz="4" w:space="0"/>
+          <w:bottom w:val="single" w:color="auto" w:sz="4" w:space="0"/>
+          <w:right w:val="single" w:color="auto" w:sz="4" w:space="0"/>
+          <w:insideH w:val="single" w:color="auto" w:sz="4" w:space="0"/>
+          <w:insideV w:val="single" w:color="auto" w:sz="4" w:space="0"/>
         </w:tblBorders>
         <w:tblCellMar>
           <w:left w:w="10" w:type="dxa"/>
@@ -2029,6 +1312,12 @@
         <w:gridCol w:w="2000"/>
       </w:tblGrid>
       <w:tr>
+        <w:tblPrEx>
+          <w:tblCellMar>
+            <w:top w:w="0" w:type="dxa"/>
+            <w:bottom w:w="0" w:type="dxa"/>
+          </w:tblCellMar>
+        </w:tblPrEx>
         <w:tc>
           <w:tcPr>
             <w:tcW w:w="1800" w:type="dxa"/>
@@ -2193,7 +1482,7 @@
       </w:r>
       <w:r>
         <w:rPr>
-          <w:rFonts w:ascii="Consolas" w:eastAsia="Consolas" w:hAnsi="Consolas" w:cs="Consolas"/>
+          <w:rFonts w:ascii="Consolas" w:hAnsi="Consolas" w:eastAsia="Consolas" w:cs="Consolas"/>
           <w:color w:val="8FD3D6"/>
         </w:rPr>
         <w:t>https://github.com/team-byte-size/team-page/commit/7f3b8d1</w:t>
@@ -2207,7 +1496,6 @@
         <w:rPr>
           <w:noProof/>
         </w:rPr>
-        <w:lastRenderedPageBreak/>
         <w:drawing>
           <wp:inline distT="0" distB="0" distL="0" distR="0" wp14:anchorId="1D426C83" wp14:editId="65256AE1">
             <wp:extent cx="3503930" cy="2589530"/>
@@ -2226,7 +1514,7 @@
                     </pic:cNvPicPr>
                   </pic:nvPicPr>
                   <pic:blipFill>
-                    <a:blip r:embed="rId16">
+                    <a:blip r:embed="rId10">
                       <a:extLst>
                         <a:ext uri="{28A0092B-C50C-407E-A947-70E740481C1C}">
                           <a14:useLocalDpi xmlns:a14="http://schemas.microsoft.com/office/drawing/2010/main" val="0"/>
@@ -2264,19 +1552,22 @@
         <w:spacing w:before="320" w:after="140"/>
       </w:pPr>
       <w:r>
-        <w:t>[Login Restyling Bootstrap] Task 6 — Test Login → Redirect → Team Page Flow</w:t>
+        <w:t xml:space="preserve">[Login Restyling Bootstrap] </w:t>
+      </w:r>
+      <w:r>
+        <w:t>Task 6 — Test Login → Redirect → Team Page Flow</w:t>
       </w:r>
     </w:p>
     <w:tbl>
       <w:tblPr>
         <w:tblW w:w="9000" w:type="dxa"/>
         <w:tblBorders>
-          <w:top w:val="single" w:sz="4" w:space="0" w:color="auto"/>
-          <w:left w:val="single" w:sz="4" w:space="0" w:color="auto"/>
-          <w:bottom w:val="single" w:sz="4" w:space="0" w:color="auto"/>
-          <w:right w:val="single" w:sz="4" w:space="0" w:color="auto"/>
-          <w:insideH w:val="single" w:sz="4" w:space="0" w:color="auto"/>
-          <w:insideV w:val="single" w:sz="4" w:space="0" w:color="auto"/>
+          <w:top w:val="single" w:color="auto" w:sz="4" w:space="0"/>
+          <w:left w:val="single" w:color="auto" w:sz="4" w:space="0"/>
+          <w:bottom w:val="single" w:color="auto" w:sz="4" w:space="0"/>
+          <w:right w:val="single" w:color="auto" w:sz="4" w:space="0"/>
+          <w:insideH w:val="single" w:color="auto" w:sz="4" w:space="0"/>
+          <w:insideV w:val="single" w:color="auto" w:sz="4" w:space="0"/>
         </w:tblBorders>
         <w:tblCellMar>
           <w:left w:w="10" w:type="dxa"/>
@@ -2291,6 +1582,12 @@
         <w:gridCol w:w="2000"/>
       </w:tblGrid>
       <w:tr>
+        <w:tblPrEx>
+          <w:tblCellMar>
+            <w:top w:w="0" w:type="dxa"/>
+            <w:bottom w:w="0" w:type="dxa"/>
+          </w:tblCellMar>
+        </w:tblPrEx>
         <w:tc>
           <w:tcPr>
             <w:tcW w:w="1800" w:type="dxa"/>
@@ -2455,7 +1752,7 @@
       </w:r>
       <w:r>
         <w:rPr>
-          <w:rFonts w:ascii="Consolas" w:eastAsia="Consolas" w:hAnsi="Consolas" w:cs="Consolas"/>
+          <w:rFonts w:ascii="Consolas" w:hAnsi="Consolas" w:eastAsia="Consolas" w:cs="Consolas"/>
           <w:color w:val="8FD3D6"/>
         </w:rPr>
         <w:t>https://github.com/team-byte-size/team-page/blob/main/tests/flow.spec.js</w:t>
@@ -2477,7 +1774,7 @@
       </w:r>
       <w:r>
         <w:rPr>
-          <w:rFonts w:ascii="Consolas" w:eastAsia="Consolas" w:hAnsi="Consolas" w:cs="Consolas"/>
+          <w:rFonts w:ascii="Consolas" w:hAnsi="Consolas" w:eastAsia="Consolas" w:cs="Consolas"/>
           <w:color w:val="8FD3D6"/>
         </w:rPr>
         <w:t>https://github.com/team-byte-size/team-page/blob/main/docs/test-report-flow.md</w:t>
@@ -2494,19 +1791,22 @@
         <w:spacing w:before="320" w:after="140"/>
       </w:pPr>
       <w:r>
-        <w:t>[Login Restyling Bootstrap] Task 7 — Test Edge Cases &amp; Log Bugs</w:t>
+        <w:t xml:space="preserve">[Login Restyling Bootstrap] </w:t>
+      </w:r>
+      <w:r>
+        <w:t>Task 7 — Test Edge Cases &amp; Log Bugs</w:t>
       </w:r>
     </w:p>
     <w:tbl>
       <w:tblPr>
         <w:tblW w:w="9000" w:type="dxa"/>
         <w:tblBorders>
-          <w:top w:val="single" w:sz="4" w:space="0" w:color="auto"/>
-          <w:left w:val="single" w:sz="4" w:space="0" w:color="auto"/>
-          <w:bottom w:val="single" w:sz="4" w:space="0" w:color="auto"/>
-          <w:right w:val="single" w:sz="4" w:space="0" w:color="auto"/>
-          <w:insideH w:val="single" w:sz="4" w:space="0" w:color="auto"/>
-          <w:insideV w:val="single" w:sz="4" w:space="0" w:color="auto"/>
+          <w:top w:val="single" w:color="auto" w:sz="4" w:space="0"/>
+          <w:left w:val="single" w:color="auto" w:sz="4" w:space="0"/>
+          <w:bottom w:val="single" w:color="auto" w:sz="4" w:space="0"/>
+          <w:right w:val="single" w:color="auto" w:sz="4" w:space="0"/>
+          <w:insideH w:val="single" w:color="auto" w:sz="4" w:space="0"/>
+          <w:insideV w:val="single" w:color="auto" w:sz="4" w:space="0"/>
         </w:tblBorders>
         <w:tblCellMar>
           <w:left w:w="10" w:type="dxa"/>
@@ -2521,6 +1821,12 @@
         <w:gridCol w:w="2000"/>
       </w:tblGrid>
       <w:tr>
+        <w:tblPrEx>
+          <w:tblCellMar>
+            <w:top w:w="0" w:type="dxa"/>
+            <w:bottom w:w="0" w:type="dxa"/>
+          </w:tblCellMar>
+        </w:tblPrEx>
         <w:tc>
           <w:tcPr>
             <w:tcW w:w="1800" w:type="dxa"/>
@@ -2681,12 +1987,11 @@
           <w:bCs/>
           <w:color w:val="FFFFFF"/>
         </w:rPr>
-        <w:lastRenderedPageBreak/>
         <w:t xml:space="preserve">Git URL (test script):  </w:t>
       </w:r>
       <w:r>
         <w:rPr>
-          <w:rFonts w:ascii="Consolas" w:eastAsia="Consolas" w:hAnsi="Consolas" w:cs="Consolas"/>
+          <w:rFonts w:ascii="Consolas" w:hAnsi="Consolas" w:eastAsia="Consolas" w:cs="Consolas"/>
           <w:color w:val="8FD3D6"/>
         </w:rPr>
         <w:t>https://github.com/team-byte-size/team-page/blob/main/tests/edge.spec.js</w:t>
@@ -2696,12 +2001,12 @@
       <w:tblPr>
         <w:tblW w:w="9000" w:type="dxa"/>
         <w:tblBorders>
-          <w:top w:val="single" w:sz="4" w:space="0" w:color="auto"/>
-          <w:left w:val="single" w:sz="4" w:space="0" w:color="auto"/>
-          <w:bottom w:val="single" w:sz="4" w:space="0" w:color="auto"/>
-          <w:right w:val="single" w:sz="4" w:space="0" w:color="auto"/>
-          <w:insideH w:val="single" w:sz="4" w:space="0" w:color="auto"/>
-          <w:insideV w:val="single" w:sz="4" w:space="0" w:color="auto"/>
+          <w:top w:val="single" w:color="auto" w:sz="4" w:space="0"/>
+          <w:left w:val="single" w:color="auto" w:sz="4" w:space="0"/>
+          <w:bottom w:val="single" w:color="auto" w:sz="4" w:space="0"/>
+          <w:right w:val="single" w:color="auto" w:sz="4" w:space="0"/>
+          <w:insideH w:val="single" w:color="auto" w:sz="4" w:space="0"/>
+          <w:insideV w:val="single" w:color="auto" w:sz="4" w:space="0"/>
         </w:tblBorders>
         <w:tblCellMar>
           <w:left w:w="10" w:type="dxa"/>
@@ -2713,14 +2018,20 @@
         <w:gridCol w:w="9000"/>
       </w:tblGrid>
       <w:tr>
+        <w:tblPrEx>
+          <w:tblCellMar>
+            <w:top w:w="0" w:type="dxa"/>
+            <w:bottom w:w="0" w:type="dxa"/>
+          </w:tblCellMar>
+        </w:tblPrEx>
         <w:tc>
           <w:tcPr>
             <w:tcW w:w="9000" w:type="dxa"/>
             <w:tcBorders>
-              <w:top w:val="dashed" w:sz="4" w:space="0" w:color="AAAAAA"/>
-              <w:left w:val="dashed" w:sz="4" w:space="0" w:color="AAAAAA"/>
-              <w:bottom w:val="dashed" w:sz="4" w:space="0" w:color="AAAAAA"/>
-              <w:right w:val="dashed" w:sz="4" w:space="0" w:color="AAAAAA"/>
+              <w:top w:val="dashed" w:color="AAAAAA" w:sz="4" w:space="0"/>
+              <w:left w:val="dashed" w:color="AAAAAA" w:sz="4" w:space="0"/>
+              <w:bottom w:val="dashed" w:color="AAAAAA" w:sz="4" w:space="0"/>
+              <w:right w:val="dashed" w:color="AAAAAA" w:sz="4" w:space="0"/>
             </w:tcBorders>
             <w:shd w:val="clear" w:color="auto" w:fill="F0F0F0"/>
             <w:tcMar>
@@ -2767,19 +2078,22 @@
         <w:spacing w:before="320" w:after="140"/>
       </w:pPr>
       <w:r>
-        <w:t>[Login Restyling Bootstrap] Task 8 — Final Review &amp; Sign-Off</w:t>
+        <w:t xml:space="preserve">[Login Restyling Bootstrap] </w:t>
+      </w:r>
+      <w:r>
+        <w:t>Task 8 — Final Review &amp; Sign-Off</w:t>
       </w:r>
     </w:p>
     <w:tbl>
       <w:tblPr>
         <w:tblW w:w="9000" w:type="dxa"/>
         <w:tblBorders>
-          <w:top w:val="single" w:sz="4" w:space="0" w:color="auto"/>
-          <w:left w:val="single" w:sz="4" w:space="0" w:color="auto"/>
-          <w:bottom w:val="single" w:sz="4" w:space="0" w:color="auto"/>
-          <w:right w:val="single" w:sz="4" w:space="0" w:color="auto"/>
-          <w:insideH w:val="single" w:sz="4" w:space="0" w:color="auto"/>
-          <w:insideV w:val="single" w:sz="4" w:space="0" w:color="auto"/>
+          <w:top w:val="single" w:color="auto" w:sz="4" w:space="0"/>
+          <w:left w:val="single" w:color="auto" w:sz="4" w:space="0"/>
+          <w:bottom w:val="single" w:color="auto" w:sz="4" w:space="0"/>
+          <w:right w:val="single" w:color="auto" w:sz="4" w:space="0"/>
+          <w:insideH w:val="single" w:color="auto" w:sz="4" w:space="0"/>
+          <w:insideV w:val="single" w:color="auto" w:sz="4" w:space="0"/>
         </w:tblBorders>
         <w:tblCellMar>
           <w:left w:w="10" w:type="dxa"/>
@@ -2794,6 +2108,12 @@
         <w:gridCol w:w="2000"/>
       </w:tblGrid>
       <w:tr>
+        <w:tblPrEx>
+          <w:tblCellMar>
+            <w:top w:w="0" w:type="dxa"/>
+            <w:bottom w:w="0" w:type="dxa"/>
+          </w:tblCellMar>
+        </w:tblPrEx>
         <w:tc>
           <w:tcPr>
             <w:tcW w:w="1800" w:type="dxa"/>
@@ -2958,7 +2278,7 @@
       </w:r>
       <w:r>
         <w:rPr>
-          <w:rFonts w:ascii="Consolas" w:eastAsia="Consolas" w:hAnsi="Consolas" w:cs="Consolas"/>
+          <w:rFonts w:ascii="Consolas" w:hAnsi="Consolas" w:eastAsia="Consolas" w:cs="Consolas"/>
           <w:color w:val="8FD3D6"/>
         </w:rPr>
         <w:t>https://github.com/team-byte-size/team-page/blob/main/docs/signoff.md</w:t>
@@ -2970,8 +2290,8 @@
       </w:pPr>
     </w:p>
     <w:sectPr>
-      <w:headerReference w:type="default" r:id="rId17"/>
-      <w:pgSz w:w="12240" w:h="15840"/>
+      <w:headerReference w:type="default" r:id="rId11"/>
+      <w:pgSz w:w="12240" w:h="15840" w:orient="portrait"/>
       <w:pgMar w:top="1440" w:right="1440" w:bottom="1440" w:left="1440" w:header="708" w:footer="708" w:gutter="0"/>
       <w:cols w:space="720"/>
       <w:docGrid w:linePitch="360"/>
@@ -2981,7 +2301,7 @@
 </file>
 
 <file path=word/endnotes.xml><?xml version="1.0" encoding="utf-8"?>
-<w:endnotes xmlns:wpc="http://schemas.microsoft.com/office/word/2010/wordprocessingCanvas" xmlns:cx="http://schemas.microsoft.com/office/drawing/2014/chartex" xmlns:cx1="http://schemas.microsoft.com/office/drawing/2015/9/8/chartex" xmlns:cx2="http://schemas.microsoft.com/office/drawing/2015/10/21/chartex" xmlns:cx3="http://schemas.microsoft.com/office/drawing/2016/5/9/chartex" xmlns:cx4="http://schemas.microsoft.com/office/drawing/2016/5/10/chartex" xmlns:cx5="http://schemas.microsoft.com/office/drawing/2016/5/11/chartex" xmlns:cx6="http://schemas.microsoft.com/office/drawing/2016/5/12/chartex" xmlns:cx7="http://schemas.microsoft.com/office/drawing/2016/5/13/chartex" xmlns:cx8="http://schemas.microsoft.com/office/drawing/2016/5/14/chartex" xmlns:mc="http://schemas.openxmlformats.org/markup-compatibility/2006" xmlns:aink="http://schemas.microsoft.com/office/drawing/2016/ink" xmlns:am3d="http://schemas.microsoft.com/office/drawing/2017/model3d" xmlns:o="urn:schemas-microsoft-com:office:office" xmlns:oel="http://schemas.microsoft.com/office/2019/extlst" xmlns:r="http://schemas.openxmlformats.org/officeDocument/2006/relationships" xmlns:m="http://schemas.openxmlformats.org/officeDocument/2006/math" xmlns:v="urn:schemas-microsoft-com:vml" xmlns:wp14="http://schemas.microsoft.com/office/word/2010/wordprocessingDrawing" xmlns:wp="http://schemas.openxmlformats.org/drawingml/2006/wordprocessingDrawing" xmlns:w10="urn:schemas-microsoft-com:office:word" xmlns:w="http://schemas.openxmlformats.org/wordprocessingml/2006/main" xmlns:w14="http://schemas.microsoft.com/office/word/2010/wordml" xmlns:w15="http://schemas.microsoft.com/office/word/2012/wordml" xmlns:w16cei="http://schemas.microsoft.com/office/word/2026/wordml/cei" xmlns:w16cex="http://schemas.microsoft.com/office/word/2018/wordml/cex" xmlns:w16cid="http://schemas.microsoft.com/office/word/2016/wordml/cid" xmlns:w16="http://schemas.microsoft.com/office/word/2018/wordml" xmlns:w16du="http://schemas.microsoft.com/office/word/2023/wordml/word16du" xmlns:w16sdtdh="http://schemas.microsoft.com/office/word/2020/wordml/sdtdatahash" xmlns:w16sdtfl="http://schemas.microsoft.com/office/word/2024/wordml/sdtformatlock" xmlns:w16se="http://schemas.microsoft.com/office/word/2015/wordml/symex" xmlns:wpg="http://schemas.microsoft.com/office/word/2010/wordprocessingGroup" xmlns:wpi="http://schemas.microsoft.com/office/word/2010/wordprocessingInk" xmlns:wne="http://schemas.microsoft.com/office/word/2006/wordml" xmlns:wps="http://schemas.microsoft.com/office/word/2010/wordprocessingShape" mc:Ignorable="w14 w15 w16se w16cid w16 w16cex w16sdtdh w16sdtfl w16du wp14">
+<w:endnotes xmlns:wpc="http://schemas.microsoft.com/office/word/2010/wordprocessingCanvas" xmlns:cx="http://schemas.microsoft.com/office/drawing/2014/chartex" xmlns:cx1="http://schemas.microsoft.com/office/drawing/2015/9/8/chartex" xmlns:cx2="http://schemas.microsoft.com/office/drawing/2015/10/21/chartex" xmlns:cx3="http://schemas.microsoft.com/office/drawing/2016/5/9/chartex" xmlns:cx4="http://schemas.microsoft.com/office/drawing/2016/5/10/chartex" xmlns:cx5="http://schemas.microsoft.com/office/drawing/2016/5/11/chartex" xmlns:cx6="http://schemas.microsoft.com/office/drawing/2016/5/12/chartex" xmlns:cx7="http://schemas.microsoft.com/office/drawing/2016/5/13/chartex" xmlns:cx8="http://schemas.microsoft.com/office/drawing/2016/5/14/chartex" xmlns:mc="http://schemas.openxmlformats.org/markup-compatibility/2006" xmlns:m="http://schemas.openxmlformats.org/officeDocument/2006/math" xmlns:aink="http://schemas.microsoft.com/office/drawing/2016/ink" xmlns:am3d="http://schemas.microsoft.com/office/drawing/2017/model3d" xmlns:oel="http://schemas.microsoft.com/office/2019/extlst" xmlns:r="http://schemas.openxmlformats.org/officeDocument/2006/relationships" xmlns:wp14="http://schemas.microsoft.com/office/word/2010/wordprocessingDrawing" xmlns:wp="http://schemas.openxmlformats.org/drawingml/2006/wordprocessingDrawing" xmlns:wpg="http://schemas.microsoft.com/office/word/2010/wordprocessingGroup" xmlns:wpi="http://schemas.microsoft.com/office/word/2010/wordprocessingInk" xmlns:wps="http://schemas.microsoft.com/office/word/2010/wordprocessingShape" xmlns:o="urn:schemas-microsoft-com:office:office" xmlns:v="urn:schemas-microsoft-com:vml" xmlns:w10="urn:schemas-microsoft-com:office:word" xmlns:w="http://schemas.openxmlformats.org/wordprocessingml/2006/main" xmlns:w14="http://schemas.microsoft.com/office/word/2010/wordml" xmlns:w15="http://schemas.microsoft.com/office/word/2012/wordml" xmlns:w16cei="http://schemas.microsoft.com/office/word/2026/wordml/cei" xmlns:w16cex="http://schemas.microsoft.com/office/word/2018/wordml/cex" xmlns:w16cid="http://schemas.microsoft.com/office/word/2016/wordml/cid" xmlns:w16="http://schemas.microsoft.com/office/word/2018/wordml" xmlns:w16sdtdh="http://schemas.microsoft.com/office/word/2020/wordml/sdtdatahash" xmlns:w16sdtfl="http://schemas.microsoft.com/office/word/2024/wordml/sdtformatlock" xmlns:w16se="http://schemas.microsoft.com/office/word/2015/wordml/symex" xmlns:w16du="http://schemas.microsoft.com/office/word/2023/wordml/word16du" xmlns:wne="http://schemas.microsoft.com/office/word/2006/wordml" mc:Ignorable="w14 w15 w16se w16cid w16 w16cex w16sdtdh w16sdtfl w16du wp14">
   <w:endnote w:type="separator" w:id="-1">
     <w:p>
       <w:r>
@@ -3000,7 +2320,7 @@
 </file>
 
 <file path=word/footnotes.xml><?xml version="1.0" encoding="utf-8"?>
-<w:footnotes xmlns:wpc="http://schemas.microsoft.com/office/word/2010/wordprocessingCanvas" xmlns:cx="http://schemas.microsoft.com/office/drawing/2014/chartex" xmlns:cx1="http://schemas.microsoft.com/office/drawing/2015/9/8/chartex" xmlns:cx2="http://schemas.microsoft.com/office/drawing/2015/10/21/chartex" xmlns:cx3="http://schemas.microsoft.com/office/drawing/2016/5/9/chartex" xmlns:cx4="http://schemas.microsoft.com/office/drawing/2016/5/10/chartex" xmlns:cx5="http://schemas.microsoft.com/office/drawing/2016/5/11/chartex" xmlns:cx6="http://schemas.microsoft.com/office/drawing/2016/5/12/chartex" xmlns:cx7="http://schemas.microsoft.com/office/drawing/2016/5/13/chartex" xmlns:cx8="http://schemas.microsoft.com/office/drawing/2016/5/14/chartex" xmlns:mc="http://schemas.openxmlformats.org/markup-compatibility/2006" xmlns:aink="http://schemas.microsoft.com/office/drawing/2016/ink" xmlns:am3d="http://schemas.microsoft.com/office/drawing/2017/model3d" xmlns:o="urn:schemas-microsoft-com:office:office" xmlns:oel="http://schemas.microsoft.com/office/2019/extlst" xmlns:r="http://schemas.openxmlformats.org/officeDocument/2006/relationships" xmlns:m="http://schemas.openxmlformats.org/officeDocument/2006/math" xmlns:v="urn:schemas-microsoft-com:vml" xmlns:wp14="http://schemas.microsoft.com/office/word/2010/wordprocessingDrawing" xmlns:wp="http://schemas.openxmlformats.org/drawingml/2006/wordprocessingDrawing" xmlns:w10="urn:schemas-microsoft-com:office:word" xmlns:w="http://schemas.openxmlformats.org/wordprocessingml/2006/main" xmlns:w14="http://schemas.microsoft.com/office/word/2010/wordml" xmlns:w15="http://schemas.microsoft.com/office/word/2012/wordml" xmlns:w16cei="http://schemas.microsoft.com/office/word/2026/wordml/cei" xmlns:w16cex="http://schemas.microsoft.com/office/word/2018/wordml/cex" xmlns:w16cid="http://schemas.microsoft.com/office/word/2016/wordml/cid" xmlns:w16="http://schemas.microsoft.com/office/word/2018/wordml" xmlns:w16du="http://schemas.microsoft.com/office/word/2023/wordml/word16du" xmlns:w16sdtdh="http://schemas.microsoft.com/office/word/2020/wordml/sdtdatahash" xmlns:w16sdtfl="http://schemas.microsoft.com/office/word/2024/wordml/sdtformatlock" xmlns:w16se="http://schemas.microsoft.com/office/word/2015/wordml/symex" xmlns:wpg="http://schemas.microsoft.com/office/word/2010/wordprocessingGroup" xmlns:wpi="http://schemas.microsoft.com/office/word/2010/wordprocessingInk" xmlns:wne="http://schemas.microsoft.com/office/word/2006/wordml" xmlns:wps="http://schemas.microsoft.com/office/word/2010/wordprocessingShape" mc:Ignorable="w14 w15 w16se w16cid w16 w16cex w16sdtdh w16sdtfl w16du wp14">
+<w:footnotes xmlns:wpc="http://schemas.microsoft.com/office/word/2010/wordprocessingCanvas" xmlns:cx="http://schemas.microsoft.com/office/drawing/2014/chartex" xmlns:cx1="http://schemas.microsoft.com/office/drawing/2015/9/8/chartex" xmlns:cx2="http://schemas.microsoft.com/office/drawing/2015/10/21/chartex" xmlns:cx3="http://schemas.microsoft.com/office/drawing/2016/5/9/chartex" xmlns:cx4="http://schemas.microsoft.com/office/drawing/2016/5/10/chartex" xmlns:cx5="http://schemas.microsoft.com/office/drawing/2016/5/11/chartex" xmlns:cx6="http://schemas.microsoft.com/office/drawing/2016/5/12/chartex" xmlns:cx7="http://schemas.microsoft.com/office/drawing/2016/5/13/chartex" xmlns:cx8="http://schemas.microsoft.com/office/drawing/2016/5/14/chartex" xmlns:mc="http://schemas.openxmlformats.org/markup-compatibility/2006" xmlns:m="http://schemas.openxmlformats.org/officeDocument/2006/math" xmlns:aink="http://schemas.microsoft.com/office/drawing/2016/ink" xmlns:am3d="http://schemas.microsoft.com/office/drawing/2017/model3d" xmlns:oel="http://schemas.microsoft.com/office/2019/extlst" xmlns:r="http://schemas.openxmlformats.org/officeDocument/2006/relationships" xmlns:wp14="http://schemas.microsoft.com/office/word/2010/wordprocessingDrawing" xmlns:wp="http://schemas.openxmlformats.org/drawingml/2006/wordprocessingDrawing" xmlns:wpg="http://schemas.microsoft.com/office/word/2010/wordprocessingGroup" xmlns:wpi="http://schemas.microsoft.com/office/word/2010/wordprocessingInk" xmlns:wps="http://schemas.microsoft.com/office/word/2010/wordprocessingShape" xmlns:o="urn:schemas-microsoft-com:office:office" xmlns:v="urn:schemas-microsoft-com:vml" xmlns:w10="urn:schemas-microsoft-com:office:word" xmlns:w="http://schemas.openxmlformats.org/wordprocessingml/2006/main" xmlns:w14="http://schemas.microsoft.com/office/word/2010/wordml" xmlns:w15="http://schemas.microsoft.com/office/word/2012/wordml" xmlns:w16cei="http://schemas.microsoft.com/office/word/2026/wordml/cei" xmlns:w16cex="http://schemas.microsoft.com/office/word/2018/wordml/cex" xmlns:w16cid="http://schemas.microsoft.com/office/word/2016/wordml/cid" xmlns:w16="http://schemas.microsoft.com/office/word/2018/wordml" xmlns:w16sdtdh="http://schemas.microsoft.com/office/word/2020/wordml/sdtdatahash" xmlns:w16sdtfl="http://schemas.microsoft.com/office/word/2024/wordml/sdtformatlock" xmlns:w16se="http://schemas.microsoft.com/office/word/2015/wordml/symex" xmlns:w16du="http://schemas.microsoft.com/office/word/2023/wordml/word16du" xmlns:wne="http://schemas.microsoft.com/office/word/2006/wordml" mc:Ignorable="w14 w15 w16se w16cid w16 w16cex w16sdtdh w16sdtfl w16du wp14">
   <w:footnote w:type="separator" w:id="-1">
     <w:p>
       <w:r>
@@ -3019,7 +2339,7 @@
 </file>
 
 <file path=word/header1.xml><?xml version="1.0" encoding="utf-8"?>
-<w:hdr xmlns:wpc="http://schemas.microsoft.com/office/word/2010/wordprocessingCanvas" xmlns:cx="http://schemas.microsoft.com/office/drawing/2014/chartex" xmlns:cx1="http://schemas.microsoft.com/office/drawing/2015/9/8/chartex" xmlns:cx2="http://schemas.microsoft.com/office/drawing/2015/10/21/chartex" xmlns:cx3="http://schemas.microsoft.com/office/drawing/2016/5/9/chartex" xmlns:cx4="http://schemas.microsoft.com/office/drawing/2016/5/10/chartex" xmlns:cx5="http://schemas.microsoft.com/office/drawing/2016/5/11/chartex" xmlns:cx6="http://schemas.microsoft.com/office/drawing/2016/5/12/chartex" xmlns:cx7="http://schemas.microsoft.com/office/drawing/2016/5/13/chartex" xmlns:cx8="http://schemas.microsoft.com/office/drawing/2016/5/14/chartex" xmlns:mc="http://schemas.openxmlformats.org/markup-compatibility/2006" xmlns:aink="http://schemas.microsoft.com/office/drawing/2016/ink" xmlns:am3d="http://schemas.microsoft.com/office/drawing/2017/model3d" xmlns:o="urn:schemas-microsoft-com:office:office" xmlns:oel="http://schemas.microsoft.com/office/2019/extlst" xmlns:r="http://schemas.openxmlformats.org/officeDocument/2006/relationships" xmlns:m="http://schemas.openxmlformats.org/officeDocument/2006/math" xmlns:v="urn:schemas-microsoft-com:vml" xmlns:wp14="http://schemas.microsoft.com/office/word/2010/wordprocessingDrawing" xmlns:wp="http://schemas.openxmlformats.org/drawingml/2006/wordprocessingDrawing" xmlns:w10="urn:schemas-microsoft-com:office:word" xmlns:w="http://schemas.openxmlformats.org/wordprocessingml/2006/main" xmlns:w14="http://schemas.microsoft.com/office/word/2010/wordml" xmlns:w15="http://schemas.microsoft.com/office/word/2012/wordml" xmlns:w16cei="http://schemas.microsoft.com/office/word/2026/wordml/cei" xmlns:w16cex="http://schemas.microsoft.com/office/word/2018/wordml/cex" xmlns:w16cid="http://schemas.microsoft.com/office/word/2016/wordml/cid" xmlns:w16="http://schemas.microsoft.com/office/word/2018/wordml" xmlns:w16du="http://schemas.microsoft.com/office/word/2023/wordml/word16du" xmlns:w16sdtdh="http://schemas.microsoft.com/office/word/2020/wordml/sdtdatahash" xmlns:w16sdtfl="http://schemas.microsoft.com/office/word/2024/wordml/sdtformatlock" xmlns:w16se="http://schemas.microsoft.com/office/word/2015/wordml/symex" xmlns:wpg="http://schemas.microsoft.com/office/word/2010/wordprocessingGroup" xmlns:wpi="http://schemas.microsoft.com/office/word/2010/wordprocessingInk" xmlns:wne="http://schemas.microsoft.com/office/word/2006/wordml" xmlns:wps="http://schemas.microsoft.com/office/word/2010/wordprocessingShape" mc:Ignorable="w14 w15 w16se w16cid w16 w16cex w16sdtdh w16sdtfl w16du wp14">
+<w:hdr xmlns:wpc="http://schemas.microsoft.com/office/word/2010/wordprocessingCanvas" xmlns:cx="http://schemas.microsoft.com/office/drawing/2014/chartex" xmlns:cx1="http://schemas.microsoft.com/office/drawing/2015/9/8/chartex" xmlns:cx2="http://schemas.microsoft.com/office/drawing/2015/10/21/chartex" xmlns:cx3="http://schemas.microsoft.com/office/drawing/2016/5/9/chartex" xmlns:cx4="http://schemas.microsoft.com/office/drawing/2016/5/10/chartex" xmlns:cx5="http://schemas.microsoft.com/office/drawing/2016/5/11/chartex" xmlns:cx6="http://schemas.microsoft.com/office/drawing/2016/5/12/chartex" xmlns:cx7="http://schemas.microsoft.com/office/drawing/2016/5/13/chartex" xmlns:cx8="http://schemas.microsoft.com/office/drawing/2016/5/14/chartex" xmlns:mc="http://schemas.openxmlformats.org/markup-compatibility/2006" xmlns:m="http://schemas.openxmlformats.org/officeDocument/2006/math" xmlns:aink="http://schemas.microsoft.com/office/drawing/2016/ink" xmlns:am3d="http://schemas.microsoft.com/office/drawing/2017/model3d" xmlns:oel="http://schemas.microsoft.com/office/2019/extlst" xmlns:r="http://schemas.openxmlformats.org/officeDocument/2006/relationships" xmlns:wp14="http://schemas.microsoft.com/office/word/2010/wordprocessingDrawing" xmlns:wp="http://schemas.openxmlformats.org/drawingml/2006/wordprocessingDrawing" xmlns:wpg="http://schemas.microsoft.com/office/word/2010/wordprocessingGroup" xmlns:wpi="http://schemas.microsoft.com/office/word/2010/wordprocessingInk" xmlns:wps="http://schemas.microsoft.com/office/word/2010/wordprocessingShape" xmlns:o="urn:schemas-microsoft-com:office:office" xmlns:v="urn:schemas-microsoft-com:vml" xmlns:w10="urn:schemas-microsoft-com:office:word" xmlns:w="http://schemas.openxmlformats.org/wordprocessingml/2006/main" xmlns:w14="http://schemas.microsoft.com/office/word/2010/wordml" xmlns:w15="http://schemas.microsoft.com/office/word/2012/wordml" xmlns:w16cei="http://schemas.microsoft.com/office/word/2026/wordml/cei" xmlns:w16cex="http://schemas.microsoft.com/office/word/2018/wordml/cex" xmlns:w16cid="http://schemas.microsoft.com/office/word/2016/wordml/cid" xmlns:w16="http://schemas.microsoft.com/office/word/2018/wordml" xmlns:w16sdtdh="http://schemas.microsoft.com/office/word/2020/wordml/sdtdatahash" xmlns:w16sdtfl="http://schemas.microsoft.com/office/word/2024/wordml/sdtformatlock" xmlns:w16se="http://schemas.microsoft.com/office/word/2015/wordml/symex" xmlns:w16du="http://schemas.microsoft.com/office/word/2023/wordml/word16du" xmlns:wne="http://schemas.microsoft.com/office/word/2006/wordml" xmlns:a="http://schemas.openxmlformats.org/drawingml/2006/main" xmlns:pic="http://schemas.openxmlformats.org/drawingml/2006/picture" xmlns:a14="http://schemas.microsoft.com/office/drawing/2010/main" mc:Ignorable="w14 w15 w16se w16cid w16 w16cex w16sdtdh w16sdtfl w16du wp14">
   <w:p>
     <w:pPr>
       <w:pStyle w:val="Header"/>
@@ -3083,7 +2403,7 @@
 </file>
 
 <file path=word/numbering.xml><?xml version="1.0" encoding="utf-8"?>
-<w:numbering xmlns:wpc="http://schemas.microsoft.com/office/word/2010/wordprocessingCanvas" xmlns:cx="http://schemas.microsoft.com/office/drawing/2014/chartex" xmlns:cx1="http://schemas.microsoft.com/office/drawing/2015/9/8/chartex" xmlns:cx2="http://schemas.microsoft.com/office/drawing/2015/10/21/chartex" xmlns:cx3="http://schemas.microsoft.com/office/drawing/2016/5/9/chartex" xmlns:cx4="http://schemas.microsoft.com/office/drawing/2016/5/10/chartex" xmlns:cx5="http://schemas.microsoft.com/office/drawing/2016/5/11/chartex" xmlns:cx6="http://schemas.microsoft.com/office/drawing/2016/5/12/chartex" xmlns:cx7="http://schemas.microsoft.com/office/drawing/2016/5/13/chartex" xmlns:cx8="http://schemas.microsoft.com/office/drawing/2016/5/14/chartex" xmlns:mc="http://schemas.openxmlformats.org/markup-compatibility/2006" xmlns:aink="http://schemas.microsoft.com/office/drawing/2016/ink" xmlns:am3d="http://schemas.microsoft.com/office/drawing/2017/model3d" xmlns:o="urn:schemas-microsoft-com:office:office" xmlns:oel="http://schemas.microsoft.com/office/2019/extlst" xmlns:r="http://schemas.openxmlformats.org/officeDocument/2006/relationships" xmlns:m="http://schemas.openxmlformats.org/officeDocument/2006/math" xmlns:v="urn:schemas-microsoft-com:vml" xmlns:wp14="http://schemas.microsoft.com/office/word/2010/wordprocessingDrawing" xmlns:wp="http://schemas.openxmlformats.org/drawingml/2006/wordprocessingDrawing" xmlns:w10="urn:schemas-microsoft-com:office:word" xmlns:w="http://schemas.openxmlformats.org/wordprocessingml/2006/main" xmlns:w14="http://schemas.microsoft.com/office/word/2010/wordml" xmlns:w15="http://schemas.microsoft.com/office/word/2012/wordml" xmlns:w16cei="http://schemas.microsoft.com/office/word/2026/wordml/cei" xmlns:w16cex="http://schemas.microsoft.com/office/word/2018/wordml/cex" xmlns:w16cid="http://schemas.microsoft.com/office/word/2016/wordml/cid" xmlns:w16="http://schemas.microsoft.com/office/word/2018/wordml" xmlns:w16du="http://schemas.microsoft.com/office/word/2023/wordml/word16du" xmlns:w16sdtdh="http://schemas.microsoft.com/office/word/2020/wordml/sdtdatahash" xmlns:w16sdtfl="http://schemas.microsoft.com/office/word/2024/wordml/sdtformatlock" xmlns:w16se="http://schemas.microsoft.com/office/word/2015/wordml/symex" xmlns:wpg="http://schemas.microsoft.com/office/word/2010/wordprocessingGroup" xmlns:wpi="http://schemas.microsoft.com/office/word/2010/wordprocessingInk" xmlns:wne="http://schemas.microsoft.com/office/word/2006/wordml" xmlns:wps="http://schemas.microsoft.com/office/word/2010/wordprocessingShape" mc:Ignorable="w14 w15 w16se w16cid w16 w16cex w16sdtdh w16sdtfl w16du wp14">
+<w:numbering xmlns:wpc="http://schemas.microsoft.com/office/word/2010/wordprocessingCanvas" xmlns:cx="http://schemas.microsoft.com/office/drawing/2014/chartex" xmlns:cx1="http://schemas.microsoft.com/office/drawing/2015/9/8/chartex" xmlns:cx2="http://schemas.microsoft.com/office/drawing/2015/10/21/chartex" xmlns:cx3="http://schemas.microsoft.com/office/drawing/2016/5/9/chartex" xmlns:cx4="http://schemas.microsoft.com/office/drawing/2016/5/10/chartex" xmlns:cx5="http://schemas.microsoft.com/office/drawing/2016/5/11/chartex" xmlns:cx6="http://schemas.microsoft.com/office/drawing/2016/5/12/chartex" xmlns:cx7="http://schemas.microsoft.com/office/drawing/2016/5/13/chartex" xmlns:cx8="http://schemas.microsoft.com/office/drawing/2016/5/14/chartex" xmlns:mc="http://schemas.openxmlformats.org/markup-compatibility/2006" xmlns:m="http://schemas.openxmlformats.org/officeDocument/2006/math" xmlns:aink="http://schemas.microsoft.com/office/drawing/2016/ink" xmlns:am3d="http://schemas.microsoft.com/office/drawing/2017/model3d" xmlns:oel="http://schemas.microsoft.com/office/2019/extlst" xmlns:r="http://schemas.openxmlformats.org/officeDocument/2006/relationships" xmlns:wp14="http://schemas.microsoft.com/office/word/2010/wordprocessingDrawing" xmlns:wp="http://schemas.openxmlformats.org/drawingml/2006/wordprocessingDrawing" xmlns:wpg="http://schemas.microsoft.com/office/word/2010/wordprocessingGroup" xmlns:wpi="http://schemas.microsoft.com/office/word/2010/wordprocessingInk" xmlns:wps="http://schemas.microsoft.com/office/word/2010/wordprocessingShape" xmlns:o="urn:schemas-microsoft-com:office:office" xmlns:v="urn:schemas-microsoft-com:vml" xmlns:w10="urn:schemas-microsoft-com:office:word" xmlns:w="http://schemas.openxmlformats.org/wordprocessingml/2006/main" xmlns:w14="http://schemas.microsoft.com/office/word/2010/wordml" xmlns:w15="http://schemas.microsoft.com/office/word/2012/wordml" xmlns:w16cei="http://schemas.microsoft.com/office/word/2026/wordml/cei" xmlns:w16cex="http://schemas.microsoft.com/office/word/2018/wordml/cex" xmlns:w16cid="http://schemas.microsoft.com/office/word/2016/wordml/cid" xmlns:w16="http://schemas.microsoft.com/office/word/2018/wordml" xmlns:w16sdtdh="http://schemas.microsoft.com/office/word/2020/wordml/sdtdatahash" xmlns:w16sdtfl="http://schemas.microsoft.com/office/word/2024/wordml/sdtformatlock" xmlns:w16se="http://schemas.microsoft.com/office/word/2015/wordml/symex" xmlns:w16du="http://schemas.microsoft.com/office/word/2023/wordml/word16du" xmlns:wne="http://schemas.microsoft.com/office/word/2006/wordml" mc:Ignorable="w14 w15 w16se w16cid w16 w16cex w16sdtdh w16sdtfl w16du wp14">
   <w:abstractNum w:abstractNumId="0" w15:restartNumberingAfterBreak="0">
     <w:nsid w:val="050B24B6"/>
     <w:multiLevelType w:val="hybridMultilevel"/>
@@ -3180,11 +2500,11 @@
 </file>
 
 <file path=word/styles.xml><?xml version="1.0" encoding="utf-8"?>
-<w:styles xmlns:mc="http://schemas.openxmlformats.org/markup-compatibility/2006" xmlns:r="http://schemas.openxmlformats.org/officeDocument/2006/relationships" xmlns:w="http://schemas.openxmlformats.org/wordprocessingml/2006/main" xmlns:w14="http://schemas.microsoft.com/office/word/2010/wordml" xmlns:w15="http://schemas.microsoft.com/office/word/2012/wordml" xmlns:w16cex="http://schemas.microsoft.com/office/word/2018/wordml/cex" xmlns:w16cid="http://schemas.microsoft.com/office/word/2016/wordml/cid" xmlns:w16="http://schemas.microsoft.com/office/word/2018/wordml" xmlns:w16du="http://schemas.microsoft.com/office/word/2023/wordml/word16du" xmlns:w16sdtdh="http://schemas.microsoft.com/office/word/2020/wordml/sdtdatahash" xmlns:w16sdtfl="http://schemas.microsoft.com/office/word/2024/wordml/sdtformatlock" xmlns:w16se="http://schemas.microsoft.com/office/word/2015/wordml/symex" mc:Ignorable="w14 w15 w16se w16cid w16 w16cex w16sdtdh w16sdtfl w16du">
+<w:styles xmlns:wp14="http://schemas.microsoft.com/office/word/2010/wordprocessingDrawing" xmlns:mc="http://schemas.openxmlformats.org/markup-compatibility/2006" xmlns:r="http://schemas.openxmlformats.org/officeDocument/2006/relationships" xmlns:w="http://schemas.openxmlformats.org/wordprocessingml/2006/main" xmlns:w14="http://schemas.microsoft.com/office/word/2010/wordml" xmlns:w15="http://schemas.microsoft.com/office/word/2012/wordml" xmlns:w16cex="http://schemas.microsoft.com/office/word/2018/wordml/cex" xmlns:w16cid="http://schemas.microsoft.com/office/word/2016/wordml/cid" xmlns:w16="http://schemas.microsoft.com/office/word/2018/wordml" xmlns:w16sdtdh="http://schemas.microsoft.com/office/word/2020/wordml/sdtdatahash" xmlns:w16sdtfl="http://schemas.microsoft.com/office/word/2024/wordml/sdtformatlock" xmlns:w16se="http://schemas.microsoft.com/office/word/2015/wordml/symex" xmlns:w16du="http://schemas.microsoft.com/office/word/2023/wordml/word16du" mc:Ignorable="w14 w15 w16se w16cid w16 w16cex w16sdtdh w16sdtfl w16du wp14">
   <w:docDefaults>
     <w:rPrDefault>
       <w:rPr>
-        <w:rFonts w:ascii="Calibri" w:eastAsia="Calibri" w:hAnsi="Calibri" w:cs="Calibri"/>
+        <w:rFonts w:ascii="Calibri" w:hAnsi="Calibri" w:eastAsia="Calibri" w:cs="Calibri"/>
         <w:sz w:val="22"/>
         <w:szCs w:val="22"/>
         <w:lang w:val="en-AU" w:eastAsia="en-GB" w:bidi="ar-SA"/>
@@ -3195,14 +2515,14 @@
   <w:latentStyles w:defLockedState="0" w:defUIPriority="99" w:defSemiHidden="0" w:defUnhideWhenUsed="0" w:defQFormat="0" w:count="376">
     <w:lsdException w:name="Normal" w:uiPriority="0" w:qFormat="1"/>
     <w:lsdException w:name="heading 1" w:uiPriority="9" w:qFormat="1"/>
-    <w:lsdException w:name="heading 2" w:semiHidden="1" w:uiPriority="9" w:unhideWhenUsed="1" w:qFormat="1"/>
-    <w:lsdException w:name="heading 3" w:semiHidden="1" w:uiPriority="9" w:unhideWhenUsed="1" w:qFormat="1"/>
-    <w:lsdException w:name="heading 4" w:semiHidden="1" w:uiPriority="9" w:unhideWhenUsed="1" w:qFormat="1"/>
-    <w:lsdException w:name="heading 5" w:semiHidden="1" w:uiPriority="9" w:unhideWhenUsed="1" w:qFormat="1"/>
-    <w:lsdException w:name="heading 6" w:semiHidden="1" w:uiPriority="9" w:unhideWhenUsed="1" w:qFormat="1"/>
-    <w:lsdException w:name="heading 7" w:semiHidden="1" w:uiPriority="9" w:unhideWhenUsed="1" w:qFormat="1"/>
-    <w:lsdException w:name="heading 8" w:semiHidden="1" w:uiPriority="9" w:unhideWhenUsed="1" w:qFormat="1"/>
-    <w:lsdException w:name="heading 9" w:semiHidden="1" w:uiPriority="9" w:unhideWhenUsed="1" w:qFormat="1"/>
+    <w:lsdException w:name="heading 2" w:uiPriority="9" w:semiHidden="1" w:unhideWhenUsed="1" w:qFormat="1"/>
+    <w:lsdException w:name="heading 3" w:uiPriority="9" w:semiHidden="1" w:unhideWhenUsed="1" w:qFormat="1"/>
+    <w:lsdException w:name="heading 4" w:uiPriority="9" w:semiHidden="1" w:unhideWhenUsed="1" w:qFormat="1"/>
+    <w:lsdException w:name="heading 5" w:uiPriority="9" w:semiHidden="1" w:unhideWhenUsed="1" w:qFormat="1"/>
+    <w:lsdException w:name="heading 6" w:uiPriority="9" w:semiHidden="1" w:unhideWhenUsed="1" w:qFormat="1"/>
+    <w:lsdException w:name="heading 7" w:uiPriority="9" w:semiHidden="1" w:unhideWhenUsed="1" w:qFormat="1"/>
+    <w:lsdException w:name="heading 8" w:uiPriority="9" w:semiHidden="1" w:unhideWhenUsed="1" w:qFormat="1"/>
+    <w:lsdException w:name="heading 9" w:uiPriority="9" w:semiHidden="1" w:unhideWhenUsed="1" w:qFormat="1"/>
     <w:lsdException w:name="index 1" w:semiHidden="1" w:unhideWhenUsed="1"/>
     <w:lsdException w:name="index 2" w:semiHidden="1" w:unhideWhenUsed="1"/>
     <w:lsdException w:name="index 3" w:semiHidden="1" w:unhideWhenUsed="1"/>
@@ -3212,22 +2532,22 @@
     <w:lsdException w:name="index 7" w:semiHidden="1" w:unhideWhenUsed="1"/>
     <w:lsdException w:name="index 8" w:semiHidden="1" w:unhideWhenUsed="1"/>
     <w:lsdException w:name="index 9" w:semiHidden="1" w:unhideWhenUsed="1"/>
-    <w:lsdException w:name="toc 1" w:semiHidden="1" w:uiPriority="39" w:unhideWhenUsed="1"/>
-    <w:lsdException w:name="toc 2" w:semiHidden="1" w:uiPriority="39" w:unhideWhenUsed="1"/>
-    <w:lsdException w:name="toc 3" w:semiHidden="1" w:uiPriority="39" w:unhideWhenUsed="1"/>
-    <w:lsdException w:name="toc 4" w:semiHidden="1" w:uiPriority="39" w:unhideWhenUsed="1"/>
-    <w:lsdException w:name="toc 5" w:semiHidden="1" w:uiPriority="39" w:unhideWhenUsed="1"/>
-    <w:lsdException w:name="toc 6" w:semiHidden="1" w:uiPriority="39" w:unhideWhenUsed="1"/>
-    <w:lsdException w:name="toc 7" w:semiHidden="1" w:uiPriority="39" w:unhideWhenUsed="1"/>
-    <w:lsdException w:name="toc 8" w:semiHidden="1" w:uiPriority="39" w:unhideWhenUsed="1"/>
-    <w:lsdException w:name="toc 9" w:semiHidden="1" w:uiPriority="39" w:unhideWhenUsed="1"/>
+    <w:lsdException w:name="toc 1" w:uiPriority="39" w:semiHidden="1" w:unhideWhenUsed="1"/>
+    <w:lsdException w:name="toc 2" w:uiPriority="39" w:semiHidden="1" w:unhideWhenUsed="1"/>
+    <w:lsdException w:name="toc 3" w:uiPriority="39" w:semiHidden="1" w:unhideWhenUsed="1"/>
+    <w:lsdException w:name="toc 4" w:uiPriority="39" w:semiHidden="1" w:unhideWhenUsed="1"/>
+    <w:lsdException w:name="toc 5" w:uiPriority="39" w:semiHidden="1" w:unhideWhenUsed="1"/>
+    <w:lsdException w:name="toc 6" w:uiPriority="39" w:semiHidden="1" w:unhideWhenUsed="1"/>
+    <w:lsdException w:name="toc 7" w:uiPriority="39" w:semiHidden="1" w:unhideWhenUsed="1"/>
+    <w:lsdException w:name="toc 8" w:uiPriority="39" w:semiHidden="1" w:unhideWhenUsed="1"/>
+    <w:lsdException w:name="toc 9" w:uiPriority="39" w:semiHidden="1" w:unhideWhenUsed="1"/>
     <w:lsdException w:name="Normal Indent" w:semiHidden="1" w:unhideWhenUsed="1"/>
     <w:lsdException w:name="footnote text" w:semiHidden="1" w:unhideWhenUsed="1"/>
     <w:lsdException w:name="annotation text" w:semiHidden="1" w:unhideWhenUsed="1"/>
     <w:lsdException w:name="header" w:semiHidden="1" w:unhideWhenUsed="1"/>
     <w:lsdException w:name="footer" w:semiHidden="1" w:unhideWhenUsed="1"/>
     <w:lsdException w:name="index heading" w:semiHidden="1" w:unhideWhenUsed="1"/>
-    <w:lsdException w:name="caption" w:semiHidden="1" w:uiPriority="35" w:unhideWhenUsed="1" w:qFormat="1"/>
+    <w:lsdException w:name="caption" w:uiPriority="35" w:semiHidden="1" w:unhideWhenUsed="1" w:qFormat="1"/>
     <w:lsdException w:name="table of figures" w:semiHidden="1" w:unhideWhenUsed="1"/>
     <w:lsdException w:name="envelope address" w:semiHidden="1" w:unhideWhenUsed="1"/>
     <w:lsdException w:name="envelope return" w:semiHidden="1" w:unhideWhenUsed="1"/>
@@ -3258,7 +2578,7 @@
     <w:lsdException w:name="Title" w:uiPriority="10" w:qFormat="1"/>
     <w:lsdException w:name="Closing" w:semiHidden="1" w:unhideWhenUsed="1"/>
     <w:lsdException w:name="Signature" w:semiHidden="1" w:unhideWhenUsed="1"/>
-    <w:lsdException w:name="Default Paragraph Font" w:semiHidden="1" w:uiPriority="1" w:unhideWhenUsed="1"/>
+    <w:lsdException w:name="Default Paragraph Font" w:uiPriority="1" w:semiHidden="1" w:unhideWhenUsed="1"/>
     <w:lsdException w:name="Body Text" w:semiHidden="1" w:unhideWhenUsed="1"/>
     <w:lsdException w:name="Body Text Indent" w:semiHidden="1" w:unhideWhenUsed="1"/>
     <w:lsdException w:name="List Continue" w:semiHidden="1" w:unhideWhenUsed="1"/>
@@ -3458,8 +2778,8 @@
     <w:lsdException w:name="Subtle Reference" w:uiPriority="31" w:qFormat="1"/>
     <w:lsdException w:name="Intense Reference" w:uiPriority="32" w:qFormat="1"/>
     <w:lsdException w:name="Book Title" w:uiPriority="33" w:qFormat="1"/>
-    <w:lsdException w:name="Bibliography" w:semiHidden="1" w:uiPriority="37" w:unhideWhenUsed="1"/>
-    <w:lsdException w:name="TOC Heading" w:semiHidden="1" w:uiPriority="39" w:unhideWhenUsed="1" w:qFormat="1"/>
+    <w:lsdException w:name="Bibliography" w:uiPriority="37" w:semiHidden="1" w:unhideWhenUsed="1"/>
+    <w:lsdException w:name="TOC Heading" w:uiPriority="39" w:semiHidden="1" w:unhideWhenUsed="1" w:qFormat="1"/>
     <w:lsdException w:name="Plain Table 1" w:uiPriority="41"/>
     <w:lsdException w:name="Plain Table 2" w:uiPriority="42"/>
     <w:lsdException w:name="Plain Table 3" w:uiPriority="43"/>
@@ -3570,7 +2890,7 @@
     <w:lsdException w:name="Unresolved Mention" w:semiHidden="1" w:unhideWhenUsed="1"/>
     <w:lsdException w:name="Smart Link" w:semiHidden="1" w:unhideWhenUsed="1"/>
   </w:latentStyles>
-  <w:style w:type="paragraph" w:default="1" w:styleId="Normal">
+  <w:style w:type="paragraph" w:styleId="Normal" w:default="1">
     <w:name w:val="Normal"/>
     <w:qFormat/>
   </w:style>
@@ -3582,7 +2902,7 @@
       <w:outlineLvl w:val="0"/>
     </w:pPr>
     <w:rPr>
-      <w:rFonts w:ascii="Cambria" w:eastAsia="Cambria" w:hAnsi="Cambria" w:cs="Cambria"/>
+      <w:rFonts w:ascii="Cambria" w:hAnsi="Cambria" w:eastAsia="Cambria" w:cs="Cambria"/>
       <w:b/>
       <w:bCs/>
       <w:color w:val="1E2761"/>
@@ -3661,13 +2981,13 @@
       <w:color w:val="1F4D78"/>
     </w:rPr>
   </w:style>
-  <w:style w:type="character" w:default="1" w:styleId="DefaultParagraphFont">
+  <w:style w:type="character" w:styleId="DefaultParagraphFont" w:default="1">
     <w:name w:val="Default Paragraph Font"/>
     <w:uiPriority w:val="1"/>
     <w:semiHidden/>
     <w:unhideWhenUsed/>
   </w:style>
-  <w:style w:type="table" w:default="1" w:styleId="TableNormal">
+  <w:style w:type="table" w:styleId="TableNormal" w:default="1">
     <w:name w:val="Normal Table"/>
     <w:uiPriority w:val="99"/>
     <w:semiHidden/>
@@ -3682,7 +3002,7 @@
       </w:tblCellMar>
     </w:tblPr>
   </w:style>
-  <w:style w:type="numbering" w:default="1" w:styleId="NoList">
+  <w:style w:type="numbering" w:styleId="NoList" w:default="1">
     <w:name w:val="No List"/>
     <w:uiPriority w:val="99"/>
     <w:semiHidden/>
@@ -3693,7 +3013,7 @@
     <w:uiPriority w:val="10"/>
     <w:qFormat/>
     <w:rPr>
-      <w:rFonts w:ascii="Cambria" w:eastAsia="Cambria" w:hAnsi="Cambria" w:cs="Cambria"/>
+      <w:rFonts w:ascii="Cambria" w:hAnsi="Cambria" w:eastAsia="Cambria" w:cs="Cambria"/>
       <w:b/>
       <w:bCs/>
       <w:color w:val="1E2761"/>
@@ -3701,7 +3021,7 @@
       <w:szCs w:val="40"/>
     </w:rPr>
   </w:style>
-  <w:style w:type="paragraph" w:customStyle="1" w:styleId="Strong1">
+  <w:style w:type="paragraph" w:styleId="Strong1" w:customStyle="1">
     <w:name w:val="Strong1"/>
     <w:qFormat/>
     <w:rPr>
@@ -3742,7 +3062,7 @@
       <w:szCs w:val="20"/>
     </w:rPr>
   </w:style>
-  <w:style w:type="character" w:customStyle="1" w:styleId="FootnoteTextChar">
+  <w:style w:type="character" w:styleId="FootnoteTextChar" w:customStyle="1">
     <w:name w:val="Footnote Text Char"/>
     <w:link w:val="FootnoteText"/>
     <w:uiPriority w:val="99"/>
@@ -3773,7 +3093,7 @@
       <w:szCs w:val="20"/>
     </w:rPr>
   </w:style>
-  <w:style w:type="character" w:customStyle="1" w:styleId="EndnoteTextChar">
+  <w:style w:type="character" w:styleId="EndnoteTextChar" w:customStyle="1">
     <w:name w:val="Endnote Text Char"/>
     <w:link w:val="EndnoteText"/>
     <w:uiPriority w:val="99"/>
@@ -3807,7 +3127,7 @@
       <w:spacing w:before="100" w:beforeAutospacing="1" w:after="100" w:afterAutospacing="1"/>
     </w:pPr>
     <w:rPr>
-      <w:rFonts w:ascii="Times New Roman" w:eastAsia="Times New Roman" w:hAnsi="Times New Roman" w:cs="Times New Roman"/>
+      <w:rFonts w:ascii="Times New Roman" w:hAnsi="Times New Roman" w:eastAsia="Times New Roman" w:cs="Times New Roman"/>
       <w:sz w:val="24"/>
       <w:szCs w:val="24"/>
     </w:rPr>
@@ -3826,7 +3146,7 @@
       </w:tabs>
     </w:pPr>
   </w:style>
-  <w:style w:type="character" w:customStyle="1" w:styleId="HeaderChar">
+  <w:style w:type="character" w:styleId="HeaderChar" w:customStyle="1">
     <w:name w:val="Header Char"/>
     <w:basedOn w:val="DefaultParagraphFont"/>
     <w:link w:val="Header"/>
@@ -3847,34 +3167,44 @@
       </w:tabs>
     </w:pPr>
   </w:style>
-  <w:style w:type="character" w:customStyle="1" w:styleId="FooterChar">
+  <w:style w:type="character" w:styleId="FooterChar" w:customStyle="1">
     <w:name w:val="Footer Char"/>
     <w:basedOn w:val="DefaultParagraphFont"/>
     <w:link w:val="Footer"/>
     <w:uiPriority w:val="99"/>
     <w:rsid w:val="00F95A76"/>
   </w:style>
-  <w:style w:type="table" w:styleId="TableGrid">
-    <w:name w:val="Table Grid"/>
-    <w:basedOn w:val="TableNormal"/>
-    <w:uiPriority w:val="59"/>
-    <w:rsid w:val="00FB4123"/>
-    <w:tblPr>
+  <w:style xmlns:w="http://schemas.openxmlformats.org/wordprocessingml/2006/main" w:type="table" w:styleId="TableGrid">
+    <w:name xmlns:w="http://schemas.openxmlformats.org/wordprocessingml/2006/main" w:val="Table Grid"/>
+    <w:basedOn xmlns:w="http://schemas.openxmlformats.org/wordprocessingml/2006/main" w:val="TableNormal"/>
+    <w:uiPriority xmlns:w="http://schemas.openxmlformats.org/wordprocessingml/2006/main" w:val="59"/>
+    <w:rsid xmlns:w="http://schemas.openxmlformats.org/wordprocessingml/2006/main" w:val="00FB4123"/>
+    <w:pPr xmlns:w="http://schemas.openxmlformats.org/wordprocessingml/2006/main">
+      <w:spacing w:after="0" w:line="240" w:lineRule="auto"/>
+    </w:pPr>
+    <w:tblPr xmlns:w="http://schemas.openxmlformats.org/wordprocessingml/2006/main">
+      <w:tblInd w:w="0" w:type="dxa"/>
       <w:tblBorders>
-        <w:top w:val="single" w:sz="4" w:space="0" w:color="000000" w:themeColor="text1"/>
-        <w:left w:val="single" w:sz="4" w:space="0" w:color="000000" w:themeColor="text1"/>
-        <w:bottom w:val="single" w:sz="4" w:space="0" w:color="000000" w:themeColor="text1"/>
-        <w:right w:val="single" w:sz="4" w:space="0" w:color="000000" w:themeColor="text1"/>
-        <w:insideH w:val="single" w:sz="4" w:space="0" w:color="000000" w:themeColor="text1"/>
-        <w:insideV w:val="single" w:sz="4" w:space="0" w:color="000000" w:themeColor="text1"/>
+        <w:top w:val="single" w:color="000000" w:themeColor="text1" w:sz="4" w:space="0"/>
+        <w:left w:val="single" w:color="000000" w:themeColor="text1" w:sz="4" w:space="0"/>
+        <w:bottom w:val="single" w:color="000000" w:themeColor="text1" w:sz="4" w:space="0"/>
+        <w:right w:val="single" w:color="000000" w:themeColor="text1" w:sz="4" w:space="0"/>
+        <w:insideH w:val="single" w:color="000000" w:themeColor="text1" w:sz="4" w:space="0"/>
+        <w:insideV w:val="single" w:color="000000" w:themeColor="text1" w:sz="4" w:space="0"/>
       </w:tblBorders>
+      <w:tblCellMar>
+        <w:top w:w="0" w:type="dxa"/>
+        <w:left w:w="108" w:type="dxa"/>
+        <w:bottom w:w="0" w:type="dxa"/>
+        <w:right w:w="108" w:type="dxa"/>
+      </w:tblCellMar>
     </w:tblPr>
   </w:style>
 </w:styles>
 </file>
 
 <file path=word/theme/theme1.xml><?xml version="1.0" encoding="utf-8"?>
-<a:theme xmlns:a="http://schemas.openxmlformats.org/drawingml/2006/main" name="Office Theme">
+<a:theme xmlns:a="http://schemas.openxmlformats.org/drawingml/2006/main" xmlns:thm15="http://schemas.microsoft.com/office/thememl/2012/main" name="Office Theme">
   <a:themeElements>
     <a:clrScheme name="Office">
       <a:dk1>
@@ -4189,15 +3519,6 @@
 </file>
 
 <file path=customXml/item1.xml><?xml version="1.0" encoding="utf-8"?>
-<?mso-contentType ?>
-<FormTemplates xmlns="http://schemas.microsoft.com/sharepoint/v3/contenttype/forms">
-  <Display>DocumentLibraryForm</Display>
-  <Edit>DocumentLibraryForm</Edit>
-  <New>DocumentLibraryForm</New>
-</FormTemplates>
-</file>
-
-<file path=customXml/item2.xml><?xml version="1.0" encoding="utf-8"?>
 <ct:contentTypeSchema xmlns:ct="http://schemas.microsoft.com/office/2006/metadata/contentType" xmlns:ma="http://schemas.microsoft.com/office/2006/metadata/properties/metaAttributes" ct:_="" ma:_="" ma:contentTypeName="Document" ma:contentTypeID="0x01010096DE152E2C6A8C42B049878071E35BFA" ma:contentTypeVersion="9" ma:contentTypeDescription="Create a new document." ma:contentTypeScope="" ma:versionID="595b8f023b5cacfb86084034b1c0c701">
   <xsd:schema xmlns:xsd="http://www.w3.org/2001/XMLSchema" xmlns:xs="http://www.w3.org/2001/XMLSchema" xmlns:p="http://schemas.microsoft.com/office/2006/metadata/properties" xmlns:ns2="26c2b24a-a057-4aca-9b64-9bcaa58ad00d" targetNamespace="http://schemas.microsoft.com/office/2006/metadata/properties" ma:root="true" ma:fieldsID="e1ae442cdb69f0fb03c4561f9e8ca2e1" ns2:_="">
     <xsd:import namespace="26c2b24a-a057-4aca-9b64-9bcaa58ad00d"/>
@@ -4369,6 +3690,15 @@
 </ct:contentTypeSchema>
 </file>
 
+<file path=customXml/item2.xml><?xml version="1.0" encoding="utf-8"?>
+<?mso-contentType ?>
+<FormTemplates xmlns="http://schemas.microsoft.com/sharepoint/v3/contenttype/forms">
+  <Display>DocumentLibraryForm</Display>
+  <Edit>DocumentLibraryForm</Edit>
+  <New>DocumentLibraryForm</New>
+</FormTemplates>
+</file>
+
 <file path=customXml/item3.xml><?xml version="1.0" encoding="utf-8"?>
 <p:properties xmlns:p="http://schemas.microsoft.com/office/2006/metadata/properties" xmlns:xsi="http://www.w3.org/2001/XMLSchema-instance" xmlns:pc="http://schemas.microsoft.com/office/infopath/2007/PartnerControls">
   <documentManagement>
@@ -4380,39 +3710,15 @@
 </file>
 
 <file path=customXml/itemProps1.xml><?xml version="1.0" encoding="utf-8"?>
-<ds:datastoreItem xmlns:ds="http://schemas.openxmlformats.org/officeDocument/2006/customXml" ds:itemID="{CC260152-CF42-4DBE-8A6A-9EF25B1A2E2C}">
-  <ds:schemaRefs>
-    <ds:schemaRef ds:uri="http://schemas.microsoft.com/sharepoint/v3/contenttype/forms"/>
-  </ds:schemaRefs>
-</ds:datastoreItem>
+<ds:datastoreItem xmlns:ds="http://schemas.openxmlformats.org/officeDocument/2006/customXml" ds:itemID="{C4D2F875-ABDF-4D51-A09D-E87814E66E0E}"/>
 </file>
 
 <file path=customXml/itemProps2.xml><?xml version="1.0" encoding="utf-8"?>
-<ds:datastoreItem xmlns:ds="http://schemas.openxmlformats.org/officeDocument/2006/customXml" ds:itemID="{C4D2F875-ABDF-4D51-A09D-E87814E66E0E}">
-  <ds:schemaRefs>
-    <ds:schemaRef ds:uri="http://schemas.microsoft.com/office/2006/metadata/contentType"/>
-    <ds:schemaRef ds:uri="http://schemas.microsoft.com/office/2006/metadata/properties/metaAttributes"/>
-    <ds:schemaRef ds:uri="http://www.w3.org/2001/XMLSchema"/>
-    <ds:schemaRef ds:uri="http://schemas.microsoft.com/office/2006/metadata/properties"/>
-    <ds:schemaRef ds:uri="26c2b24a-a057-4aca-9b64-9bcaa58ad00d"/>
-    <ds:schemaRef ds:uri="http://schemas.microsoft.com/office/2006/documentManagement/types"/>
-    <ds:schemaRef ds:uri="http://schemas.microsoft.com/office/infopath/2007/PartnerControls"/>
-    <ds:schemaRef ds:uri="http://schemas.openxmlformats.org/package/2006/metadata/core-properties"/>
-    <ds:schemaRef ds:uri="http://purl.org/dc/elements/1.1/"/>
-    <ds:schemaRef ds:uri="http://purl.org/dc/terms/"/>
-    <ds:schemaRef ds:uri="http://schemas.microsoft.com/internal/obd"/>
-  </ds:schemaRefs>
-</ds:datastoreItem>
+<ds:datastoreItem xmlns:ds="http://schemas.openxmlformats.org/officeDocument/2006/customXml" ds:itemID="{CC260152-CF42-4DBE-8A6A-9EF25B1A2E2C}"/>
 </file>
 
 <file path=customXml/itemProps3.xml><?xml version="1.0" encoding="utf-8"?>
-<ds:datastoreItem xmlns:ds="http://schemas.openxmlformats.org/officeDocument/2006/customXml" ds:itemID="{FA5B846C-893C-4D38-A72D-4C8C278906C0}">
-  <ds:schemaRefs>
-    <ds:schemaRef ds:uri="http://schemas.microsoft.com/office/2006/metadata/properties"/>
-    <ds:schemaRef ds:uri="http://schemas.microsoft.com/office/infopath/2007/PartnerControls"/>
-    <ds:schemaRef ds:uri="26c2b24a-a057-4aca-9b64-9bcaa58ad00d"/>
-  </ds:schemaRefs>
-</ds:datastoreItem>
+<ds:datastoreItem xmlns:ds="http://schemas.openxmlformats.org/officeDocument/2006/customXml" ds:itemID="{FA5B846C-893C-4D38-A72D-4C8C278906C0}"/>
 </file>
 
 <file path=docMetadata/LabelInfo.xml><?xml version="1.0" encoding="utf-8"?>

</xml_diff>